<commit_message>
docs: un singur raport demo (Breaza, real) cu evaluator generalizat + cifre rotunjite
- evaluator -> placeholder generic [Nume evaluator autorizat ANEVAR]
- regenerat cu cifrele rotunjite (2 zecimale / procente)
- sters raportul demo fictiv -> ramane un singur document

Co-Authored-By: Claude Opus 4.8 (1M context) <noreply@anthropic.com>
</commit_message>
<xml_diff>
--- a/docs/exemplu-raport-breaza.docx
+++ b/docs/exemplu-raport-breaza.docx
@@ -50,7 +50,7 @@
     </w:p>
     <w:p>
       <w:r>
-        <w:t>Evaluator: ing. Gabriela Fratila, membru ANEVAR, legitimatia 14288</w:t>
+        <w:t>Evaluator: [Nume evaluator autorizat ANEVAR], membru ANEVAR, legitimatia [nr. legitimatie]</w:t>
       </w:r>
     </w:p>
     <w:p>
@@ -96,7 +96,7 @@
     </w:p>
     <w:p>
       <w:r>
-        <w:t>Cu deosebita consideratie, ing. Gabriela Fratila, membru ANEVAR, legitimatia 14288.</w:t>
+        <w:t>Cu deosebita consideratie, [Nume evaluator autorizat ANEVAR], membru ANEVAR, legitimatia [nr. legitimatie].</w:t>
       </w:r>
     </w:p>
     <w:p>
@@ -251,16 +251,16 @@
     </w:p>
     <w:p>
       <w:r>
-        <w:t>În redactarea prezentului raport s-au avut în vedere ipotezele generale și speciale uzuale aplicabile unei misiuni de evaluare pentru garantarea creditului ipotecar, întocmită în scopul determinării valorii de piață în conformitate cu SEV 104, pentru utilizare exclusivă de către Banca Comerciala Exemplu S.A.. Raportul se bazează pe informațiile și documentele puse la dispoziție de client, pe inspecția efectuată și pe analiza comparabilelor disponibile, fără efectuarea de investigații tehnice distructive sau sub acoperire.</w:t>
+        <w:t>În elaborarea prezentului raport, s-a presupus că dreptul de proprietate asupra imobilului evaluat este valabil, opozabil terților și liber de sarcini, cu excepția eventualelor mențiuni expres consemnate în documentele puse la dispoziție pentru misiunea de evaluare. De asemenea, s-a considerat că informațiile furnizate privind amplasamentul, suprafața terenului de 700 mp, categoria de intravilan, aria utilă de 180 mp și aria construită desfășurată de 220 mp sunt corecte și complete în raport cu scopul evaluării, fără a se efectua investigații independente asupra actelor de proprietate, situației juridice sau eventualelor sarcini nedeclarate.</w:t>
         <w:br/>
         <w:br/>
-        <w:t>Se presupune că dreptul de proprietate asupra imobilului identificat prin 2xxxx (demo) și CF xxxxx Breaza (demo) este valabil, opozabil și liber de sarcini, cu excepția situațiilor menționate expres în raport, și că nu există litigii, interdicții, servituți ori alte sarcini nesemnnalate care ar putea afecta semnificativ valoarea. De asemenea, se presupune că imobilul este edificat în condiții corespunzătoare de stabilitate și siguranță, având o structură de rezistență adecvată, iar elementele ascunse ale construcției, fundațiilor, instalațiilor și terenului nu prezintă deficiențe care nu ar fi fost vizibile la inspecția normală. Nu au fost efectuate expertize structurale, studii geotehnice, verificări ale materialelor sau alte investigații de specialitate, astfel încât orice concluzii privind aceste aspecte au caracter de ipoteză de lucru.</w:t>
+        <w:t>S-a mai presupus că imobilul este realizat în condiții constructive corespunzătoare, având o structură de rezistență adecvată și o stare de funcționare compatibilă cu utilizarea sa curentă, fără a fi efectuate expertize tehnice, studii de specialitate ori verificări invazive. Evaluarea nu a inclus investigații ascunse, destructiv-exploratorii sau geotehnice, astfel încât eventualele condiții ale terenului, ale fundațiilor, ale elementelor structurale ori ale instalațiilor care nu sunt vizibile sau accesibile în mod obișnuit au fost considerate în limitele informațiilor disponibile și ale ipotezelor uzuale de lucru.</w:t>
         <w:br/>
         <w:br/>
-        <w:t>Se presupune, de asemenea, că datele utilizate în evaluare privind terenul intravilan de 700 mp, aria utilă de 180 mp și aria construită desfășurată de 220 mp sunt corecte și complete, iar anul de referință 2026 reflectă starea de fapt avută în vedere la estimare. Valoarea finală reconciliată de 135267,0000 EUR rezultată prin abordarea prin piață, precum și componentele analizate prin metoda costului și alocarea valorii între teren și construcții, sunt valabile numai în condițiile și limitele prezentate în raport.</w:t>
+        <w:t>Raportul a fost întocmit exclusiv în scopul declarat al garantării creditului ipotecar, pentru Banca Comerciala Exemplu S.A., și nu poate fi utilizat pentru alte scopuri, inclusiv, dar fără a se limita la, tranzacționare, partaj, raportare contabilă, litigii ori alte decizii care presupun o altă bază de evaluare sau alte ipoteze. Valoarea estimată, exprimată în EUR, reprezintă valoarea de piață calculată pentru condițiile și data evaluării avute în vedere în raport, iar utilizarea concluziei valorice este limitată strict la contextul și la destinația pentru care a fost întocmit documentul.</w:t>
         <w:br/>
         <w:br/>
-        <w:t>Prezentul raport a fost întocmit exclusiv pentru scopul declarat mai sus și nu poate fi utilizat, integral sau parțial, în alt context, pentru alt beneficiar sau pentru altă destinație, fără acordul evaluatorului. Orice utilizare în afara acestui cadru, precum și orice modificare a ipotezelor, a stării juridice ori tehnice a imobilului, poate conduce la concluzii diferite asupra valorii.</w:t>
+        <w:t>De asemenea, concluziile raportului sunt valabile în măsura în care nu intervin modificări ale situației juridice, tehnice sau economice ale imobilului și ale pieței relevante după data evaluării. Orice abatere de la aceste ipoteze, precum și orice informație suplimentară apărută ulterior, poate conduce la modificarea rezultatului evaluării și impune o analiză distinctă.</w:t>
       </w:r>
     </w:p>
     <w:p>
@@ -273,16 +273,13 @@
     </w:p>
     <w:p>
       <w:r>
-        <w:t>Piața imobiliară locală relevantă pentru proprietatea evaluată se caracterizează prin formarea prețurilor în funcție de interacțiunea dintre cerere și ofertă, iar selectarea comparabilelor utilizate indică existența unor tranzacții suficient de apropiate ca tip și caracteristici pentru a susține estimarea valorii de piață.</w:t>
+        <w:t>Piața imobiliară locală relevantă pentru proprietatea evaluată este caracterizată, la nivelul segmentului rezidențial/intravilan, de o cerere care se manifestă selectiv, cu orientare către proprietăți comparabile ca suprafață de teren și arie utilă, și de o ofertă limitată la proprietăți similare identificate în zona de interes, ceea ce impune selectarea atentă a comparabilelor utilizate în analiză. În cadrul prezentei evaluări, analiza de piață a fost fundamentată pe comparabilele disponibile și pe contextul local rezultat din acestea, în concordanță cu abordarea prin piață utilizată pentru estimarea valorii de piață.</w:t>
         <w:br/>
         <w:br/>
-        <w:t>În contextul analizat, cererea este reflectată de interesul pentru proprietăți rezidențiale cu teren intravilan și suprafețe utile similare, iar oferta este ilustrată de comparabilele disponibile pentru teren și pentru proprietăți comparabile, utilizate în abordarea prin piață. Utilizarea a 3 comparabile și selectarea comparabilului cu index 0 pentru prețul total, respectiv a comparabilului cu index 2 pentru teren, sugerează o piață funcțională, cu suficiente repere de tranzacționare pentru fundamentarea evaluării.</w:t>
+        <w:t>Din punct de vedere al lichidității, piața poate fi apreciată ca având o lichiditate moderată, întrucât existența unui număr restrâns de comparabile relevante indică o circulație relativ selectivă a proprietăților similare, iar formarea prețului este dependentă de caracteristicile specifice ale fiecărei proprietăți și de gradul de apropiere față de activele comparabile. În acest context, nivelul de tranzacționare și viteza de absorbție a proprietăților în piață sunt influențate de raportul cerere-ofertă și de accesibilitatea alternativelor comparabile disponibile.</w:t>
         <w:br/>
         <w:br/>
-        <w:t>Lichiditatea pieței poate fi apreciată ca fiind *moderată*, întrucât existența comparabilelor a permis aplicarea metodei comparațiilor directe, însă diferențele dintre rezultatul abordării prin piață și rezultatul abordării prin cost indică o piață în care prețurile negociate pot varia în funcție de caracteristicile specifice ale proprietății și de contextul local. Pentru proprietatea evaluată, alocarea valorii către teren și construcții și valoarea finală reconciliată de 135267.0000 EUR confirmă că piața relevantă este suficient de activă pentru a furniza repere credibile, dar rămâne sensibilă la particularitățile fiecărui activ.</w:t>
-        <w:br/>
-        <w:br/>
-        <w:t>Tendința observată, pe baza comparabilelor folosite, este una de selectare atentă a proprietăților similare, cu accent pe suprafață, amplasament și tipul terenului, ceea ce indică o piață locală segmentată și dependentă de caracteristicile individuale ale bunului. În aceste condiții, valoarea de piață estimată reflectă nivelul curent de interes al pieței pentru astfel de proprietăți și este adecvată scopului de garantare a creditului ipotecar pentru beneficiarul/finanțatorul Client demonstrativ.</w:t>
+        <w:t>Tendințele observate prin comparabilele utilizate indică o piață în care prețurile se stabilesc preponderent prin comparație cu tranzacții/oferte similare, iar diferențele de amplasament, suprafață și caracteristici constructive produc variații ale nivelului de piață. Pentru terenul aferent, evaluarea prin comparație a condus la un nivel de 39.52 EUR/mp, respectiv 27,664.00 EUR pentru 700 mp, iar pentru construcție a rezultat o valoare alocată de 107,603.00 EUR, ceea ce confirmă relevanța comparabilelor selectate în reflectarea comportamentului curent al pieței locale. În ansamblu, piața relevantă pentru proprietatea evaluată susține o abordare bazată pe comparații directe, cu o valoare de piață finală reconciliată de 135,267.00 EUR.</w:t>
       </w:r>
     </w:p>
     <w:p>
@@ -305,13 +302,13 @@
     </w:p>
     <w:p>
       <w:r>
-        <w:t>Imobilul analizat este identificat în documentația cadastrală și în cartea funciară prin marcajele 2xxxx (demo) și CF xxxxx Breaza (demo), fiind evaluat în scopul garantării unui credit ipotecar acordat de Banca Comerciala Exemplu S.A.. Situația juridică avută în vedere în cadrul prezentului raport se referă la imobilul astfel individualizat, în condițiile înscrierii sale în evidențele de cadastru și publicitate imobiliară.</w:t>
+        <w:t>Imobilul evaluat este identificat în evidențele cadastrale și de carte funciară prin datele menționate în documentația de proprietate aferentă 2xxxx (demo) și CF xxxxx Breaza (demo), acestea reprezentând identificatorii juridici ai bunului imobil în sensul reglementărilor cadastrale și de publicitate imobiliară. Evaluarea a fost realizată pentru garantarea creditului ipotecar, în favoarea Băncii Comerciale Exemplu S.A., având ca standard de valoare valoarea de piață în sensul SEV 104.</w:t>
         <w:br/>
         <w:br/>
-        <w:t>Din punct de vedere fizic, proprietatea este amplasată pe un teren intravilan cu suprafața de 700 mp. Pe acest amplasament este edificată o construcție cu arie utilă de 180 mp și arie construită desfășurată de 220 mp, în raport cu anul de referință 2026. Regimul de înălțime nu a fost precizat în datele puse la dispoziție.</w:t>
+        <w:t>Din punct de vedere fizic, proprietatea este amplasată pe un teren intravilan cu suprafața de 700 mp. Terenul deservește o construcție cu arie utilă de 180 mp și arie construită desfășurată de 220 mp, având ca an de referință 2026. Regimul de înălțime al construcției nu a fost indicat în datele furnizate și, în consecință, este consemnat numai în măsura în care rezultă din documentația tehnică aferentă 2xxxx (demo) și CF xxxxx Breaza (demo).</w:t>
         <w:br/>
         <w:br/>
-        <w:t>În cadrul evaluării, valoarea terenului a fost estimată prin comparație la 39.5200 EUR/mp, rezultând o valoare de 27,664.0000 EUR pentru teren, iar valoarea alocată construcției este de 107,603.0000 EUR. Valoarea de piață reconciliată a proprietății este de 135,267.0000 EUR, corespunzător abordării prin piață.</w:t>
+        <w:t>În cadrul evaluării, valoarea terenului rezultată prin comparație este de 39,52 EUR/mp, ceea ce conduce la o valoare de 27.664,00 EUR pentru teren, iar valoarea alocată construcțiilor este de 107.603,00 EUR. Valoarea finală reconciliată a proprietății este de 135.267,00 EUR, stabilită prin abordarea prin piață.</w:t>
       </w:r>
     </w:p>
     <w:p>
@@ -324,13 +321,16 @@
     </w:p>
     <w:p>
       <w:r>
-        <w:t>Analiza celei mai bune utilizări (CMBU) s-a realizat având în vedere criteriile consacrate de standardele de evaluare: utilizarea trebuie să fie permisă legal, posibilă fizic, fezabilă financiar și maxim productivă. În cazul proprietății evaluate, situată pe un teren intravilan de 700 mp, cu arie utilă de 180 mp și arie construită desfășurată de 220 mp, utilizarea existentă de tip rezidențial îndeplinește aceste condiții, fiind o utilizare uzuală, compatibilă cu caracteristicile amplasamentului și cu configurația constructivă a imobilului.</w:t>
+        <w:t>Analiza celei mai bune utilizări a proprietății a fost realizată prin raportare la criteriile de permisibilitate legală, posibilitate fizică, fezabilitate financiară și maximă productivitate, conform conceptului de CMBU aplicabil în evaluare. În contextul evaluării pentru garantarea creditului ipotecar, utilizarea analizată trebuie să fie aceea care, din perspectiva unui participant de pe piață, maximizează valoarea proprietății în condițiile de piață și de amplasament existente.</w:t>
         <w:br/>
         <w:br/>
-        <w:t>Din punct de vedere legal, utilizarea rezidențială este compatibilă cu destinația uzuală a unui teren intravilan și nu rezultă, din datele avute la dispoziție, elemente care să indice restricții ce ar impune o altă destinație. Din punct de vedere fizic, suprafața terenului și dimensiunile construcției permit exploatarea în continuare în regim rezidențial, fără a fi identificate, pe baza datelor disponibile, limitări fizice care să susțină o schimbare de destinație. Din punct de vedere financiar, valoarea estimată prin abordarea prin piață este de 135267.0000 EUR, iar valoarea rezultată prin abordarea prin cost este de 178735.0666666666666666666667 EUR, ceea ce confirmă că proprietatea are suport economic pentru menținerea utilizării curente, în condițiile pieței analizate.</w:t>
+        <w:t>Din punct de vedere fizic, proprietatea este constituită dintr-un teren intravilan în suprafață de 700 mp, pe care este amplasată o construcție cu arie utilă de 180 mp și arie construită desfășurată de 220 mp. Aceste caracteristici indică posibilitatea utilizării în continuare a amplasamentului pentru destinația sa actuală, fără a rezulta elemente care să impună, în baza datelor disponibile, o schimbare de utilizare. În lipsa unor informații care să evidențieze restricții legale sau constrângeri fizice care ar favoriza o alternativă superioară, utilizarea rezidențială existentă rămâne compatibilă cu testele de analiză CMBU.</w:t>
         <w:br/>
         <w:br/>
-        <w:t>Din perspectiva maximei productivități, utilizarea rezidențială existentă este susținută de faptul că valoarea de piață finală reconciliată a fost obținută pe baza tranzacțiilor comparabile selectate, iar alocarea valorii indică 27664.0000 EUR pentru teren și 107603.0000 EUR pentru construcții. În aceste condiții, și ținând seama de scopul evaluării — garantarea creditului ipotecar — cea mai bună utilizare a proprietății este menținerea utilizării rezidențiale existente, aceasta fiind utilizarea care satisface cumulativ criteriile CMBU și reflectă cel mai bine comportamentul unui participant tipic de pe piață.</w:t>
+        <w:t>Din punct de vedere financiar, valoarea prin abordarea prin cost este de 178735.07 EUR, iar valoarea finală reconciliată, stabilită prin abordarea prin piață, este de 135267.00 EUR. Diferența dintre valoarea prin cost și valoarea de piață reflectă comportamentul pieței pentru proprietatea analizată, însă nu oferă, prin ea însăși, un suport suficient pentru concluzia că o altă utilizare ar genera o valoare superioară celei curente; dimpotrivă, în absența unor date privind dezvoltări alternative, utilizarea existentă rezidențială este considerată fezabilă financiar și maxim productivă în raport cu informațiile disponibile.</w:t>
+        <w:br/>
+        <w:br/>
+        <w:t>În consecință, pe baza datelor analizate, cea mai bună utilizare a proprietății este utilizarea rezidențială existentă, aceasta fiind utilizarea care îndeplinește în mod rezonabil criteriile de legalitate, posibilitate fizică, fezabilitate financiară și productivitate maximă, în condițiile pieței reflectate de valoarea de 135267.00 EUR.</w:t>
       </w:r>
     </w:p>
     <w:p>
@@ -417,7 +417,7 @@
           </w:tcPr>
           <w:p>
             <w:r>
-              <w:t>135267.0000</w:t>
+              <w:t>135267.00</w:t>
             </w:r>
           </w:p>
         </w:tc>
@@ -427,7 +427,7 @@
           </w:tcPr>
           <w:p>
             <w:r>
-              <w:t>0.1512814645308924485125858124</w:t>
+              <w:t>15.13%</w:t>
             </w:r>
           </w:p>
         </w:tc>
@@ -459,7 +459,7 @@
           </w:tcPr>
           <w:p>
             <w:r>
-              <w:t>155245.5000</w:t>
+              <w:t>155245.50</w:t>
             </w:r>
           </w:p>
         </w:tc>
@@ -469,7 +469,7 @@
           </w:tcPr>
           <w:p>
             <w:r>
-              <w:t>0.2528198232808298117556665386</w:t>
+              <w:t>25.28%</w:t>
             </w:r>
           </w:p>
         </w:tc>
@@ -499,7 +499,7 @@
           </w:tcPr>
           <w:p>
             <w:r>
-              <w:t>119343.2000</w:t>
+              <w:t>119343.20</w:t>
             </w:r>
           </w:p>
         </w:tc>
@@ -509,7 +509,7 @@
           </w:tcPr>
           <w:p>
             <w:r>
-              <w:t>0.3572385509227614490772385509</w:t>
+              <w:t>35.72%</w:t>
             </w:r>
           </w:p>
         </w:tc>
@@ -604,7 +604,7 @@
           </w:tcPr>
           <w:p>
             <w:r>
-              <w:t>45.6000</w:t>
+              <w:t>45.60</w:t>
             </w:r>
           </w:p>
         </w:tc>
@@ -614,7 +614,7 @@
           </w:tcPr>
           <w:p>
             <w:r>
-              <w:t>0.06</w:t>
+              <w:t>6.00%</w:t>
             </w:r>
           </w:p>
         </w:tc>
@@ -644,7 +644,7 @@
           </w:tcPr>
           <w:p>
             <w:r>
-              <w:t>47.0250</w:t>
+              <w:t>47.02</w:t>
             </w:r>
           </w:p>
         </w:tc>
@@ -654,7 +654,7 @@
           </w:tcPr>
           <w:p>
             <w:r>
-              <w:t>0.10</w:t>
+              <w:t>10.00%</w:t>
             </w:r>
           </w:p>
         </w:tc>
@@ -684,7 +684,7 @@
           </w:tcPr>
           <w:p>
             <w:r>
-              <w:t>39.5200</w:t>
+              <w:t>39.52</w:t>
             </w:r>
           </w:p>
         </w:tc>
@@ -694,7 +694,7 @@
           </w:tcPr>
           <w:p>
             <w:r>
-              <w:t>0.04</w:t>
+              <w:t>4.00%</w:t>
             </w:r>
           </w:p>
         </w:tc>
@@ -712,7 +712,7 @@
     </w:tbl>
     <w:p>
       <w:r>
-        <w:t>Valoarea terenului = 39.5200 EUR/mp x 700 mp = 27.664 EUR.</w:t>
+        <w:t>Valoarea terenului = 39.52 EUR/mp x 700 mp = 27.664 EUR.</w:t>
       </w:r>
     </w:p>
     <w:p>
@@ -812,7 +812,7 @@
           </w:tcPr>
           <w:p>
             <w:r>
-              <w:t>220</w:t>
+              <w:t>220.00</w:t>
             </w:r>
           </w:p>
         </w:tc>
@@ -822,7 +822,7 @@
           </w:tcPr>
           <w:p>
             <w:r>
-              <w:t>470</w:t>
+              <w:t>470.00</w:t>
             </w:r>
           </w:p>
         </w:tc>
@@ -832,7 +832,7 @@
           </w:tcPr>
           <w:p>
             <w:r>
-              <w:t>103400</w:t>
+              <w:t>103.400</w:t>
             </w:r>
           </w:p>
         </w:tc>
@@ -864,7 +864,7 @@
           </w:tcPr>
           <w:p>
             <w:r>
-              <w:t>220</w:t>
+              <w:t>220.00</w:t>
             </w:r>
           </w:p>
         </w:tc>
@@ -874,7 +874,7 @@
           </w:tcPr>
           <w:p>
             <w:r>
-              <w:t>360</w:t>
+              <w:t>360.00</w:t>
             </w:r>
           </w:p>
         </w:tc>
@@ -884,7 +884,7 @@
           </w:tcPr>
           <w:p>
             <w:r>
-              <w:t>79200</w:t>
+              <w:t>79.200</w:t>
             </w:r>
           </w:p>
         </w:tc>
@@ -892,18 +892,18 @@
     </w:tbl>
     <w:p>
       <w:r>
-        <w:t>CIB = 182.600; Vcp = 16.00 ani; depreciere fizica = 0.1726666666666666666666666667; CIN = 151.071; valoare prin cost (CIN + teren) = 178.735 EUR.</w:t>
+        <w:t>CIB = 182.600; Vcp = 16.00 ani; depreciere fizica = 17.27%; CIN = 151.071; valoare prin cost (CIN + teren) = 178.735 EUR.</w:t>
       </w:r>
     </w:p>
     <w:p>
       <w:r>
-        <w:t>Ajustările din grila de comparație au fost aplicate diferențiat, în funcție de natura elementului analizat, respectând logica de piață și principiul substituției. Ajustările de tranzacție au rolul de a aduce prețurile observate la un nivel comparabil, prin corectarea diferențelor care țin de condițiile vânzării sau ale ofertei, astfel încât indicatorul utilizat să reflecte cât mai fidel nivelul de piață relevant pentru proprietatea evaluată. Ajustările de proprietate urmăresc alinierea comparabilelor la caracteristicile efective ale subiectului, precum amplasarea, dimensiunea, configurația și dotările, deoarece proprietățile comparabile nu sunt identice, iar diferențele dintre ele trebuie reflectate explicit în procesul de comparație.</w:t>
+        <w:t>Justificarea ajustărilor aplicate în grila de comparații a urmărit aducerea comparabilelor la nivelul proprietății subiect, prin separarea clară a diferențelor aferente etapei de tranzacție de cele aferente caracteristicilor proprietății. În prima etapă au fost analizate diferențele de piață dintre ofertă și tranzacție, respectiv nivelul de negociere și condițiile de comercializare, deoarece acestea influențează prețul observat și trebuie uniformizate pentru a reflecta valoarea de piață. În etapa a doua au fost efectuate ajustările pentru elementele intrinseci ale proprietății, precum terenul, suprafața utilă, suprafața construită și raportul teren–construcții, astfel încât comparabilele să poată fi puse în aceeași bază de analiză cu proprietatea evaluată.</w:t>
         <w:br/>
         <w:br/>
-        <w:t>În cazul metodei prin piață, comparabilele au fost ajustate succesiv până la obținerea unui nivel de comparabilitate suficient pentru reconciliere, iar comparabilul selectat a fost cel cu ajustarea brută minimă, întrucât acesta prezintă cele mai puține și mai reduse diferențe față de proprietatea subiect. Din punct de vedere metodologic, comparabilul cu cele mai mici ajustări este, în mod obișnuit, preferat deoarece necesită cele mai puține corecții și oferă cea mai bună aproximare a tranzacției relevante pentru subiect. În prezenta analiză, alegerea comparabilului de la index 0 este susținută de faptul că acesta a condus la indicația finală utilizată în reconcilierea valorii de piață, în timp ce celelalte comparabile au necesitat corecții mai mari pentru a deveni comparabile.</w:t>
+        <w:t>Logica ajustărilor a urmărit principiul conform căruia se aplică ajustări atunci când comparabilul este superior sau inferior proprietății subiect, pentru a elimina influența diferențelor care nu reflectă direct valoarea acesteia. În cazul de față, abordarea prin piață a fost construită pe baza a 3 comparabile, iar selecția comparabilului index 0 ca reper principal s-a făcut deoarece acesta a generat ajustarea brută minimă, ceea ce indică cea mai bună similitudine globală față de proprietatea evaluată. Un comparabil cu ajustare brută minimă necesită cele mai puține corecții pentru a fi adus la nivelul subiectului, deci prezintă de regulă cea mai mare proximitate în termeni de caracteristici relevante și, implicit, cea mai bună adecvare pentru estimarea valorii de piață.</w:t>
         <w:br/>
         <w:br/>
-        <w:t>În etapa de alocare a valorii, evaluarea terenului și a construcției s-a realizat prin separarea componentelor pentru care există suport de piață distinct. Valoarea terenului a fost estimată prin comparație la 39.5200 EUR/mp, rezultând 27,664.0000 EUR pentru 700 mp, iar diferența până la valoarea de piață a proprietății a fost atribuită construcțiilor, în sumă de 107,603.0000 EUR. Această structură este compatibilă cu practica de alocare a valorii de piață pe componente atunci când componentele au piețe proprii și contribuții distincte la valoarea totală. În consecință, ajustările aplicate au urmărit atât reflectarea corectă a diferențelor dintre comparabile și subiect, cât și obținerea unei indicații de valoare coerente pentru scopul de garantare a creditului ipotecar.</w:t>
+        <w:t>În analiza separată a terenului, valoarea unitară de 39,52 EUR/mp, aplicată suprafeței de 700 mp, conduce la o valoare de 27.664,00 EUR, iar această componentă a fost obținută prin compararea cu comparabilul selectat index 2 din cele 3 comparabile de teren. Diferențierea între valoarea terenului și valoarea construcțiilor a permis alocarea coerentă a valorii finale, în condițiile în care metoda prin piață rămâne metoda principală de reconciliere, iar abordarea prin cost are rol de control al plauzibilității rezultatului. În acest context, valoarea finală reconciliată de 135.267,00 EUR reflectă rezultatul cel mai probabil al pieței pentru proprietatea evaluată, în condițiile utilizării datelor disponibile și ale ajustărilor aplicate conform diferențelor identificate între comparabile și subiect.</w:t>
       </w:r>
     </w:p>
     <w:p>
@@ -916,16 +916,13 @@
     </w:p>
     <w:p>
       <w:r>
-        <w:t>Abordarea prin piață a fost considerată relevantă și determinantă pentru estimarea valorii de piață în scopul garantării creditului ipotecar, întrucât reflectă comportamentul pieței pentru proprietăți comparabile și conduce direct la indicatorul de valoare solicitat conform SEV 104. În cadrul acestei abordări a rezultat o valoare de 135267.0000 EUR, pe baza comparabilului selectat cu index 0, dintr-un set de 3 comparabile, ceea ce confirmă adecvarea metodei de piață pentru proprietatea evaluată.</w:t>
+        <w:t>În urma aplicării abordărilor de evaluare considerate relevante pentru scopul prezentei lucrări, respectiv garantarea creditului ipotecar, au fost obținute indicații distincte ale valorii pentru proprietatea imobiliară evaluată, exprimate în moneda EUR și raportate la data evaluării. Abordarea prin piață a condus la o valoare de 135267.00 EUR, pe baza a 3 comparabile, fiind selectat comparabilul cu indicele 0 pentru stabilirea prețului total. Abordarea prin cost a condus la o valoare de 178735.07 EUR, rezultată din însumarea valorii terenului și a valorii construcțiilor depreciate, având la bază CIB = 182600.00 EUR, Vcp = 16.00 ani, depreciere fizică = 17.27% și CIN = 151071.07 EUR.</w:t>
         <w:br/>
         <w:br/>
-        <w:t>Abordarea prin cost a furnizat o indicație complementară de valoare de 178735.0666666666666666666667 EUR, determinată pe baza costului brut de înlocuire de 182600, a unei vechimi economice de 16.00 ani și a deprecierii fizice de 0.1726666666666666666666666667, rezultând un cost net de 151071.0666666666666666666667 și o valoare a construcției de 178735.0666666666666666666667 EUR. Această metodă este utilă pentru verificare și control, însă în cazul de față are caracter secundar față de abordarea prin piață, deoarece valoarea de piață trebuie fundamentată în primul rând pe date de tranzacționare comparabile, iar nu pe costuri istorice sau estimate.</w:t>
+        <w:t>Diferența dintre cele două indicații ale valorii reflectă faptul că abordarea prin cost capitalizează costul de înlocuire depreciat al activului, în timp ce abordarea prin piață surprinde mai direct comportamentul participanților de pe piață pentru proprietăți comparabile și condițiile curente de tranzacționare. În cadrul analizei separate a terenului, valoarea acestuia a fost estimată prin comparație la 39.52 EUR/mp, rezultând 27664.00 EUR pentru suprafața de 700 mp, pe baza comparabilului selectat cu indicele 2 din 3 comparabile de teren. Pentru construcție, valoarea alocată a fost de 107603.00 EUR.</w:t>
         <w:br/>
         <w:br/>
-        <w:t>În consecință, prin reconcilierea rezultatelor s-a acordat ponderea principală abordării prin piață, iar abordarea prin cost a fost utilizată ca element de susținere și verificare a plauzibilității rezultatului final. Valoarea terenului, determinată prin comparație la 39.5200 EUR/mp pentru 700 mp, este de 27664.0000 EUR, iar valoarea construcțiilor alocată este de 107603.0000 EUR, ceea ce conduce la o structură de valoare coerentă pentru proprietatea evaluată.</w:t>
-        <w:br/>
-        <w:br/>
-        <w:t>Valoarea finală reconciliată a proprietății imobiliare evaluate este de 135267.0000 EUR. Aceasta reprezintă opinia evaluatorului privind valoarea de piață la data evaluării, pentru proprietatea identificată și în condițiile specificate, în beneficiul Banca Comerciala Exemplu S.A.</w:t>
+        <w:t>În etapa de reconciliere, s-a acordat pondere preponderentă abordării prin piață, întrucât aceasta oferă indicația cea mai relevantă pentru tipul de valoare urmărit, respectiv valoarea de piață (SEV 104), în contextul unui bun imobil pentru care există informații suficiente de comparabile. Abordarea prin cost a fost utilizată ca metodă de control și verificare a plauzibilității rezultatului obținut prin piață, fără a prevala în concluzia finală. Pe baza analizei comparative și a ponderării aplicate, valoarea finală reconciliată a proprietății este de 135267.00 EUR.</w:t>
       </w:r>
     </w:p>
     <w:p>
@@ -1055,13 +1052,16 @@
     </w:p>
     <w:p>
       <w:r>
-        <w:t>Riscul asociat garanției este apreciat ca fiind moderat, în condițiile în care proprietatea evaluată este destinată garantării unui credit ipotecar, iar valoarea de piață estimată de 135267 EUR reflectă nivelul probabil de realizare în condiții normale de piață. Conform GEV 520, evaluarea pentru garantarea împrumutului are ca obiect stabilirea valorii de piață, iar analiza trebuie să includă considerente privind activitatea pieței relevante și capacitatea creditorului de a-și recupera expunerea prin valorificarea garanției în caz de neplată.</w:t>
+        <w:t>Analiza riscului asociat garanției, realizată în conformitate cu GEV 520, are în vedere capacitatea proprietății de a susține în mod adecvat recuperarea creanței de către Banca Comerciala Exemplu S.A., prin raportare la valoarea de piață estimată și la comportamentul preconizabil al pieței relevante. În prezentul caz, valoarea de piață stabilită prin abordarea prin piață este de 135267.00 EUR, pe baza a 3 comparabile, ceea ce indică existența unui reper de piață relevant pentru tipul de proprietate evaluat și susține utilizarea imobilului ca garanție pentru scopul declarat.</w:t>
         <w:br/>
         <w:br/>
-        <w:t>Din perspectiva lichidității și a activității pieței locale, proprietatea beneficiază de o bază de comparație directă, analiza prin piață fiind fundamentată pe 3 comparabile, cu un comparabil selectat pentru valoarea finală și un comparabil de teren utilizat la determinarea valorii terenului. Această structură indică existența unor repere de piață utilizabile, însă și faptul că estimarea depinde de caracteristicile specifice ale proprietății și de condițiile curente ale pieței. În consecință, vandabilitatea este apreciată ca fiind bună în condiții obișnuite de piață, dar dependentă de menținerea cererii pentru proprietăți similare din zona analizată.</w:t>
+        <w:t>Din perspectiva lichidității și a activității pieței locale, existența comparabilelor utilizate în procesul de evaluare sugerează o piață funcțională pentru proprietăți similare, însă nivelul de lichiditate rămâne dependent de timpul de expunere necesar pentru identificarea unui cumpărător la un preț apropiat de valoarea de piață. Pentru o proprietate cu teren intravilan de 700 mp și arie utilă de 180 mp / arie construită desfășurată de 220 mp, vandabilitatea este susținută de caracteristicile uzuale ale activului, dar nu poate fi disociată de sensibilitatea inerentă a prețului la condițiile curente ale pieței imobiliare și la eventuala schimbare a cererii pentru acest tip de proprietate.</w:t>
         <w:br/>
         <w:br/>
-        <w:t>Gradul de adecvare al proprietății ca garanție este susținut de faptul că bunul este evaluat pentru garanția creditului ipotecar, având o structură clară de valoare a terenului și a construcției, respectiv 27664 EUR pentru teren și 107603 EUR pentru construcții, ceea ce facilitează înțelegerea componentelor de valoare și a potențialului de recuperare. Totuși, valoarea de garanție trebuie privită în contextul sensibilității la condițiile pieței, întrucât orice variație a cererii, a nivelului prețurilor sau a timpului de expunere poate influența valoarea realizabilă la vânzare forțată sau accelerată. Din acest motiv, expunerea estimată a creditorului este considerată controlabilă, dar dependentă de evoluția pieței imobiliare locale și de menținerea parametrilor care au stat la baza valorii de piață reconciliate.</w:t>
+        <w:t>Gradul de adecvare al proprietății ca garanție este apreciat ca fiind corespunzător scopului de garantare a creditului ipotecar, având în vedere că evaluarea a fost efectuată pentru determinarea valorii de piață, iar valoarea rezultată din piață este inferioară valorii obținute prin abordarea prin cost, respectiv 178735.07 EUR, ceea ce oferă un reper suplimentar de prudență în analiza riscului. În plus, alocarea valorii indică 107603.00 EUR pentru construcții și 27664.00 EUR pentru teren, ceea ce confirmă o structură valorică relativ echilibrată a proprietății și permite o apreciere separată a componentelor relevante pentru executarea garanției.</w:t>
+        <w:br/>
+        <w:br/>
+        <w:t>În ceea ce privește expunerea estimată și sensibilitatea valorii la condițiile pieței, valoarea finală reconciliată de 135267.00 EUR trebuie interpretată ca o valoare de piață la data evaluării, susceptibilă de variații în funcție de evoluția cererii, a ofertei și a timpului de expunere necesar vânzării. În consecință, riscul asociat garanției este influențat în principal de dinamica pieței locale și de menținerea caracterului vandabil al proprietății pe durata creditului, însă, pe baza datelor disponibile, proprietatea prezintă un profil acceptabil de garantare pentru scopul declarat.</w:t>
       </w:r>
     </w:p>
     <w:p>
@@ -1194,12 +1194,12 @@
         <w:rPr>
           <w:b/>
         </w:rPr>
-        <w:t>ing. Gabriela Fratila</w:t>
+        <w:t>[Nume evaluator autorizat ANEVAR]</w:t>
       </w:r>
     </w:p>
     <w:p>
       <w:r>
-        <w:t>Evaluator autorizat ANEVAR, legitimatia 14288</w:t>
+        <w:t>Evaluator autorizat ANEVAR, legitimatia [nr. legitimatie]</w:t>
       </w:r>
     </w:p>
     <w:p>

</xml_diff>

<commit_message>
feat: mod adnotari (note de provenienta) in raport pentru review
genereaza_raport(adnotari=True) insereaza sub fiecare sectiune o nota colorata care explica
proveninenta: [CALCULAT]/[EXTRAS]/[INTRODUS]/[AI]/[SABLON]/[EXEMPLU]/[PLACEHOLDER], + o legenda.
Evaluatorul vede imediat ce e automatizat real, ce e AI si ce e demonstrativ.

- generator: ADNOTARI dict + _nota() + param adnotari pe toate sectiunile
- endpoint /api/evaluare/{id}/raport.docx?demo=1 -> raport cu note
- raport Breaza regenerat cu note; test adnotari on/off

Co-Authored-By: Claude Opus 4.8 (1M context) <noreply@anthropic.com>
</commit_message>
<xml_diff>
--- a/docs/exemplu-raport-breaza.docx
+++ b/docs/exemplu-raport-breaza.docx
@@ -8,6 +8,26 @@
       </w:pPr>
       <w:r>
         <w:t>RAPORT DE EVALUARE</w:t>
+      </w:r>
+    </w:p>
+    <w:p>
+      <w:r>
+        <w:rPr>
+          <w:i/>
+          <w:color w:val="B06A00"/>
+          <w:sz w:val="17"/>
+        </w:rPr>
+        <w:t>▮ NOTA DEMO — LEGENDA NOTELOR DEMO (text colorat, NU apare in raportul real): [CALCULAT]=produs de motorul de calcul; [EXTRAS]=preluat automat din anunt; [INTRODUS]=completat de evaluator; [AI]=text generat de inteligenta artificiala; [SABLON]=text fix standard; [EXEMPLU]/[PLACEHOLDER]=valori demonstrative de inlocuit.</w:t>
+      </w:r>
+    </w:p>
+    <w:p>
+      <w:r>
+        <w:rPr>
+          <w:i/>
+          <w:color w:val="B06A00"/>
+          <w:sz w:val="17"/>
+        </w:rPr>
+        <w:t>▮ NOTA DEMO — [INTRODUS] Identificarea (client, cadastral, CF, evaluator) e introdusa de evaluator — aici valori generice/placeholder. [CALCULAT] VALOAREA estimata e calculata real de motor.</w:t>
       </w:r>
     </w:p>
     <w:p>
@@ -81,6 +101,16 @@
     </w:p>
     <w:p>
       <w:r>
+        <w:rPr>
+          <w:i/>
+          <w:color w:val="B06A00"/>
+          <w:sz w:val="17"/>
+        </w:rPr>
+        <w:t>▮ NOTA DEMO — [SABLON+CALCULAT] Text-sablon fix, completat automat cu valoarea calculata. Functional.</w:t>
+      </w:r>
+    </w:p>
+    <w:p>
+      <w:r>
         <w:t>Catre: Client demonstrativ / Banca Comerciala Exemplu S.A.</w:t>
       </w:r>
     </w:p>
@@ -105,6 +135,16 @@
       </w:pPr>
       <w:r>
         <w:t>DECLARATIE DE CONFORMITATE SI CERTIFICARE</w:t>
+      </w:r>
+    </w:p>
+    <w:p>
+      <w:r>
+        <w:rPr>
+          <w:i/>
+          <w:color w:val="B06A00"/>
+          <w:sz w:val="17"/>
+        </w:rPr>
+        <w:t>▮ NOTA DEMO — [SABLON] Declaratii standard ANEVAR — text fix. Functional.</w:t>
       </w:r>
     </w:p>
     <w:p>
@@ -165,6 +205,16 @@
     </w:p>
     <w:p>
       <w:r>
+        <w:rPr>
+          <w:i/>
+          <w:color w:val="B06A00"/>
+          <w:sz w:val="17"/>
+        </w:rPr>
+        <w:t>▮ NOTA DEMO — [INTRODUS] Compilati automat din campurile lucrarii (client, beneficiar, scop, moneda, curs, date). Functional.</w:t>
+      </w:r>
+    </w:p>
+    <w:p>
+      <w:r>
         <w:t>Clientul evaluarii: Client demonstrativ (Persoana fizica).</w:t>
       </w:r>
     </w:p>
@@ -213,6 +263,16 @@
     </w:p>
     <w:p>
       <w:r>
+        <w:rPr>
+          <w:i/>
+          <w:color w:val="B06A00"/>
+          <w:sz w:val="17"/>
+        </w:rPr>
+        <w:t>▮ NOTA DEMO — [CALCULAT] Sinteza generata automat din rezultatele calculate. Functional.</w:t>
+      </w:r>
+    </w:p>
+    <w:p>
+      <w:r>
         <w:t>Client: Client demonstrativ (Persoana fizica).</w:t>
       </w:r>
     </w:p>
@@ -251,16 +311,23 @@
     </w:p>
     <w:p>
       <w:r>
-        <w:t>În elaborarea prezentului raport, s-a presupus că dreptul de proprietate asupra imobilului evaluat este valabil, opozabil terților și liber de sarcini, cu excepția eventualelor mențiuni expres consemnate în documentele puse la dispoziție pentru misiunea de evaluare. De asemenea, s-a considerat că informațiile furnizate privind amplasamentul, suprafața terenului de 700 mp, categoria de intravilan, aria utilă de 180 mp și aria construită desfășurată de 220 mp sunt corecte și complete în raport cu scopul evaluării, fără a se efectua investigații independente asupra actelor de proprietate, situației juridice sau eventualelor sarcini nedeclarate.</w:t>
+        <w:rPr>
+          <w:i/>
+          <w:color w:val="B06A00"/>
+          <w:sz w:val="17"/>
+        </w:rPr>
+        <w:t>▮ NOTA DEMO — [AI] Text narativ generat de inteligenta artificiala; de revizuit de evaluator.</w:t>
+      </w:r>
+    </w:p>
+    <w:p>
+      <w:r>
+        <w:t>În elaborarea prezentului raport s-au avut în vedere ipotezele generale și condițiile limitative standard aplicabile unei misiuni de evaluare pentru garantarea creditului ipotecar, în conformitate cu SEV în vigoare. Se presupune că dreptul de proprietate asupra bunului evaluat este valabil, opozabil și liber de sarcini, cu excepția situațiilor care ar fi fost menționate expres în documentația pusă la dispoziție; de asemenea, se presupune că informațiile furnizate de client sunt complete, corecte și suficiente pentru fundamentarea concluziei de evaluare.</w:t>
         <w:br/>
         <w:br/>
-        <w:t>S-a mai presupus că imobilul este realizat în condiții constructive corespunzătoare, având o structură de rezistență adecvată și o stare de funcționare compatibilă cu utilizarea sa curentă, fără a fi efectuate expertize tehnice, studii de specialitate ori verificări invazive. Evaluarea nu a inclus investigații ascunse, destructiv-exploratorii sau geotehnice, astfel încât eventualele condiții ale terenului, ale fundațiilor, ale elementelor structurale ori ale instalațiilor care nu sunt vizibile sau accesibile în mod obișnuit au fost considerate în limitele informațiilor disponibile și ale ipotezelor uzuale de lucru.</w:t>
+        <w:t>Evaluarea s-a realizat pe baza analizei documentelor și a observațiilor disponibile la data evaluării, fără efectuarea de investigații ascunse, destructiv-invazive sau geotehnice, și fără deschiderea elementelor de construcție care nu sunt vizibile în mod obișnuit. În consecință, se presupune că structura de rezistență, instalațiile și celelalte elemente constructive ale imobilului sunt corespunzătoare utilizării curente, nefiind identificate în cadrul acestei misiuni defecte ascunse, vicii de structură, contaminări, poluări ori alte condiții speciale care ar putea influența semnificativ valoarea.</w:t>
         <w:br/>
         <w:br/>
-        <w:t>Raportul a fost întocmit exclusiv în scopul declarat al garantării creditului ipotecar, pentru Banca Comerciala Exemplu S.A., și nu poate fi utilizat pentru alte scopuri, inclusiv, dar fără a se limita la, tranzacționare, partaj, raportare contabilă, litigii ori alte decizii care presupun o altă bază de evaluare sau alte ipoteze. Valoarea estimată, exprimată în EUR, reprezintă valoarea de piață calculată pentru condițiile și data evaluării avute în vedere în raport, iar utilizarea concluziei valorice este limitată strict la contextul și la destinația pentru care a fost întocmit documentul.</w:t>
-        <w:br/>
-        <w:br/>
-        <w:t>De asemenea, concluziile raportului sunt valabile în măsura în care nu intervin modificări ale situației juridice, tehnice sau economice ale imobilului și ale pieței relevante după data evaluării. Orice abatere de la aceste ipoteze, precum și orice informație suplimentară apărută ulterior, poate conduce la modificarea rezultatului evaluării și impune o analiză distinctă.</w:t>
+        <w:t>Raportul de evaluare este întocmit exclusiv pentru scopul declarat, respectiv garantarea creditului ipotecar, și pentru beneficiarul/finanțatorul Client demonstrativ – Banca Comerciala Exemplu S.A.; orice altă utilizare, difuzare sau reproducere parțială ori integrală fără acordul evaluatorului și fără analiza contextului de utilizare este exclusă. Concluzia de valoare exprimată în EUR, precum și alocările rezultate din abordările utilizate, sunt valabile numai în condițiile și ipotezele enunțate în prezentul raport, pentru imobilul identificat la Breaza de Sus, jud. Prahova, având 2xxxx (demo) și CF xxxxx Breaza (demo), și nu pot fi desprinse de cadrul de evaluare în care au fost stabilite.</w:t>
       </w:r>
     </w:p>
     <w:p>
@@ -273,13 +340,26 @@
     </w:p>
     <w:p>
       <w:r>
-        <w:t>Piața imobiliară locală relevantă pentru proprietatea evaluată este caracterizată, la nivelul segmentului rezidențial/intravilan, de o cerere care se manifestă selectiv, cu orientare către proprietăți comparabile ca suprafață de teren și arie utilă, și de o ofertă limitată la proprietăți similare identificate în zona de interes, ceea ce impune selectarea atentă a comparabilelor utilizate în analiză. În cadrul prezentei evaluări, analiza de piață a fost fundamentată pe comparabilele disponibile și pe contextul local rezultat din acestea, în concordanță cu abordarea prin piață utilizată pentru estimarea valorii de piață.</w:t>
+        <w:rPr>
+          <w:i/>
+          <w:color w:val="B06A00"/>
+          <w:sz w:val="17"/>
+        </w:rPr>
+        <w:t>▮ NOTA DEMO — [AI] Analiza de piata descriptiva (AI) — NU pe o baza de date de tranzactii reale.</w:t>
+      </w:r>
+    </w:p>
+    <w:p>
+      <w:r>
+        <w:t>Piața imobiliară locală relevantă pentru proprietatea evaluată a fost analizată prin raportare la zona de amplasament și la comparabilele utilizate în abordarea prin piață, respectiv la comparațiile de teren folosite în fundamentarea valorii. În contextul scopului evaluării, respectiv garantarea creditului ipotecar, a fost avută în vedere o piață specifică în care formarea prețurilor rezultă din interacțiunea dintre cerere și ofertă, iar estimarea valorii de piață se bazează pe proprietăți similare vândute recent sau oferite la vânzare.</w:t>
         <w:br/>
         <w:br/>
-        <w:t>Din punct de vedere al lichidității, piața poate fi apreciată ca având o lichiditate moderată, întrucât existența unui număr restrâns de comparabile relevante indică o circulație relativ selectivă a proprietăților similare, iar formarea prețului este dependentă de caracteristicile specifice ale fiecărei proprietăți și de gradul de apropiere față de activele comparabile. În acest context, nivelul de tranzacționare și viteza de absorbție a proprietăților în piață sunt influențate de raportul cerere-ofertă și de accesibilitatea alternativelor comparabile disponibile.</w:t>
+        <w:t>În zona analizată, cererea pentru proprietăți cu caracteristici similare pare susținută de utilizarea rezidențială și de interesul pentru suprafețe de teren intravilan și locuințe individuale cu arie utilă și arie construită comparabile cu subiectul evaluării. Oferta disponibilă este limitată la comparabilele identificate și selectate în analiză, iar numărul redus de comparabile relevante indică o piață de dimensiune restrânsă, specifică segmentelor locale în care diferențele de amplasament, teren și suprafață construită influențează semnificativ nivelul prețurilor.</w:t>
         <w:br/>
         <w:br/>
-        <w:t>Tendințele observate prin comparabilele utilizate indică o piață în care prețurile se stabilesc preponderent prin comparație cu tranzacții/oferte similare, iar diferențele de amplasament, suprafață și caracteristici constructive produc variații ale nivelului de piață. Pentru terenul aferent, evaluarea prin comparație a condus la un nivel de 39.52 EUR/mp, respectiv 27,664.00 EUR pentru 700 mp, iar pentru construcție a rezultat o valoare alocată de 107,603.00 EUR, ceea ce confirmă relevanța comparabilelor selectate în reflectarea comportamentului curent al pieței locale. În ansamblu, piața relevantă pentru proprietatea evaluată susține o abordare bazată pe comparații directe, cu o valoare de piață finală reconciliată de 135,267.00 EUR.</w:t>
+        <w:t>Lichiditatea pieței este apreciată ca fiind moderată, în sensul că tranzacționarea unor active cu caracteristici apropiate este posibilă, dar necesită selecția atentă a comparabilelor și ajustarea diferențelor de poziționare, dimensiune și caracteristici constructive. Valoarea obținută prin abordarea prin piață, de 135267.00 EUR, susținută de un comparabil selectat din 3 comparabile analizate, confirmă existența unor repere de piață utilizabile pentru estimare, însă și dependența rezultatelor de calitatea și gradul de relevanță al datelor de piață disponibile.</w:t>
+        <w:br/>
+        <w:br/>
+        <w:t>Pentru teren, analiza comparativă a condus la un nivel de 39.52 EUR/mp, ceea ce reflectă existența unui segment de piață activ pentru terenuri intravilane similare, dar și necesitatea corelării cu particularitățile parcelei analizate, având suprafața de 700 mp. În ansamblu, tendința relevantă pentru evaluare este aceea a unei piețe locale funcționale, cu volum limitat de informații comparabile și cu prețuri influențate de caracteristicile individuale ale proprietăților, fapt evidențiat și de diferența dintre valoarea rezultată prin piață și rezultatul abordării prin cost.</w:t>
       </w:r>
     </w:p>
     <w:p>
@@ -288,6 +368,16 @@
       </w:pPr>
       <w:r>
         <w:t>4. DESCRIEREA JURIDICA SI FIZICA A PROPRIETATII</w:t>
+      </w:r>
+    </w:p>
+    <w:p>
+      <w:r>
+        <w:rPr>
+          <w:i/>
+          <w:color w:val="B06A00"/>
+          <w:sz w:val="17"/>
+        </w:rPr>
+        <w:t>▮ NOTA DEMO — [EXTRAS/INTRODUS] Date fizice extrase din anunt / introduse de evaluator (reale). Nr. cadastral si CF aici sunt PLACEHOLDER.</w:t>
       </w:r>
     </w:p>
     <w:p>
@@ -302,13 +392,13 @@
     </w:p>
     <w:p>
       <w:r>
-        <w:t>Imobilul evaluat este identificat în evidențele cadastrale și de carte funciară prin datele menționate în documentația de proprietate aferentă 2xxxx (demo) și CF xxxxx Breaza (demo), acestea reprezentând identificatorii juridici ai bunului imobil în sensul reglementărilor cadastrale și de publicitate imobiliară. Evaluarea a fost realizată pentru garantarea creditului ipotecar, în favoarea Băncii Comerciale Exemplu S.A., având ca standard de valoare valoarea de piață în sensul SEV 104.</w:t>
+        <w:t>Imobilul evaluat este identificat din punct de vedere juridic prin elementele cadastrale și de carte funciară puse la dispoziție în documentația de evaluare, respectiv 2xxxx (demo) și CF xxxxx Breaza (demo), acestea reprezentând reperele de individualizare ale proprietății în evidențele de cadastru și publicitate imobiliară.</w:t>
         <w:br/>
         <w:br/>
-        <w:t>Din punct de vedere fizic, proprietatea este amplasată pe un teren intravilan cu suprafața de 700 mp. Terenul deservește o construcție cu arie utilă de 180 mp și arie construită desfășurată de 220 mp, având ca an de referință 2026. Regimul de înălțime al construcției nu a fost indicat în datele furnizate și, în consecință, este consemnat numai în măsura în care rezultă din documentația tehnică aferentă 2xxxx (demo) și CF xxxxx Breaza (demo).</w:t>
+        <w:t>Din punct de vedere fizic, proprietatea este compusă din teren în suprafață de 700 mp, încadrat la categoria de folosință intravilan, și dintr-o construcție cu arie utilă de 180 mp și arie construită desfășurată de 220 mp, aferentă anului de referință 2026. Ansamblul analizat prezintă caracteristicile unei proprietăți rezidențiale/imobiliare individualizate prin amplasament și prin parametrii dimensionali menționați, fără a se modifica datele numerice furnizate.</w:t>
         <w:br/>
         <w:br/>
-        <w:t>În cadrul evaluării, valoarea terenului rezultată prin comparație este de 39,52 EUR/mp, ceea ce conduce la o valoare de 27.664,00 EUR pentru teren, iar valoarea alocată construcțiilor este de 107.603,00 EUR. Valoarea finală reconciliată a proprietății este de 135.267,00 EUR, stabilită prin abordarea prin piață.</w:t>
+        <w:t>Evaluarea a fost realizată pentru garantarea creditului ipotecar, în vederea stabilirii valorii de piață conform SEV 104, pentru beneficiarul/finanțatorul Banca Comerciala Exemplu S.A.. În cadrul abordării prin piață, valoarea terenului a fost estimată la 27.664,00 EUR, iar valoarea alocată construcției la 107.603,00 EUR, rezultând o valoare finală reconciliată de 135.267,00 EUR.</w:t>
       </w:r>
     </w:p>
     <w:p>
@@ -321,16 +411,23 @@
     </w:p>
     <w:p>
       <w:r>
-        <w:t>Analiza celei mai bune utilizări a proprietății a fost realizată prin raportare la criteriile de permisibilitate legală, posibilitate fizică, fezabilitate financiară și maximă productivitate, conform conceptului de CMBU aplicabil în evaluare. În contextul evaluării pentru garantarea creditului ipotecar, utilizarea analizată trebuie să fie aceea care, din perspectiva unui participant de pe piață, maximizează valoarea proprietății în condițiile de piață și de amplasament existente.</w:t>
+        <w:rPr>
+          <w:i/>
+          <w:color w:val="B06A00"/>
+          <w:sz w:val="17"/>
+        </w:rPr>
+        <w:t>▮ NOTA DEMO — [AI] Analiza celei mai bune utilizari generata de AI.</w:t>
+      </w:r>
+    </w:p>
+    <w:p>
+      <w:r>
+        <w:t>Analiza celei mai bune utilizări a proprietății subiect se realizează prin raportare la utilizarea care este permisă legal, posibilă fizic, fezabilă financiar și maximum productivă, în sensul definiției din standardele de evaluare aplicabile. În cazul de față, având în vedere caracteristicile bunului evaluat — teren intravilan cu suprafața de 700 mp, construcție existentă cu arie utilă de 180 mp și arie construită desfășurată de 220 mp — utilizarea rezidențială existentă reprezintă opțiunea cea mai probabilă și relevantă pentru piață.</w:t>
         <w:br/>
         <w:br/>
-        <w:t>Din punct de vedere fizic, proprietatea este constituită dintr-un teren intravilan în suprafață de 700 mp, pe care este amplasată o construcție cu arie utilă de 180 mp și arie construită desfășurată de 220 mp. Aceste caracteristici indică posibilitatea utilizării în continuare a amplasamentului pentru destinația sa actuală, fără a rezulta elemente care să impună, în baza datelor disponibile, o schimbare de utilizare. În lipsa unor informații care să evidențieze restricții legale sau constrângeri fizice care ar favoriza o alternativă superioară, utilizarea rezidențială existentă rămâne compatibilă cu testele de analiză CMBU.</w:t>
+        <w:t>Din punct de vedere fizic, proprietatea permite continuarea utilizării actuale, fără a rezulta din datele disponibile o limitare care să impună schimbarea destinației sau o reconfigurare care să conducă la o utilizare superioară. Din punct de vedere legal, utilizarea rezidențială este considerată admisibilă în cadrul analizei, în absența unor informații contrare privind restricții urbanistice sau de reglementare. În consecință, utilizarea actuală îndeplinește criteriile de permisibilitate legală și posibilitate fizică.</w:t>
         <w:br/>
         <w:br/>
-        <w:t>Din punct de vedere financiar, valoarea prin abordarea prin cost este de 178735.07 EUR, iar valoarea finală reconciliată, stabilită prin abordarea prin piață, este de 135267.00 EUR. Diferența dintre valoarea prin cost și valoarea de piață reflectă comportamentul pieței pentru proprietatea analizată, însă nu oferă, prin ea însăși, un suport suficient pentru concluzia că o altă utilizare ar genera o valoare superioară celei curente; dimpotrivă, în absența unor date privind dezvoltări alternative, utilizarea existentă rezidențială este considerată fezabilă financiar și maxim productivă în raport cu informațiile disponibile.</w:t>
-        <w:br/>
-        <w:br/>
-        <w:t>În consecință, pe baza datelor analizate, cea mai bună utilizare a proprietății este utilizarea rezidențială existentă, aceasta fiind utilizarea care îndeplinește în mod rezonabil criteriile de legalitate, posibilitate fizică, fezabilitate financiară și productivitate maximă, în condițiile pieței reflectate de valoarea de 135267.00 EUR.</w:t>
+        <w:t>Sub aspectul fezabilității financiare și al maximului productiv, rezultatele abordărilor de evaluare susțin menținerea utilizării rezidențiale existente. Valoarea finală reconciliată este de 135267.00 EUR, obținută prin abordarea prin piață, iar abordarea prin cost indică o valoare de 178735.07 EUR, cu valoarea terenului estimată prin comparație la 27664.00 EUR și valoarea alocată construcțiilor la 107603.00 EUR. În contextul scopului evaluării — garantarea creditului ipotecar pentru Client demonstrativ, în favoarea Client demonstrativ/[FINANTATOR] — utilizarea rezidențială existentă se confirmă ca fiind fezabilă financiar și, în raport cu datele disponibile, cea mai productivă utilizare a proprietății.</w:t>
       </w:r>
     </w:p>
     <w:p>
@@ -339,6 +436,16 @@
       </w:pPr>
       <w:r>
         <w:t>6. APLICAREA METODELOR DE CALCUL</w:t>
+      </w:r>
+    </w:p>
+    <w:p>
+      <w:r>
+        <w:rPr>
+          <w:i/>
+          <w:color w:val="B06A00"/>
+          <w:sz w:val="17"/>
+        </w:rPr>
+        <w:t>▮ NOTA DEMO — [CALCULAT] Grilele (teren + casa) si costul CIN sunt calculate real de motor. [EXTRAS] Preturile/suprafetele comparabilelor sunt reale (din anunturi). [EXEMPLU] Ajustarile din grila sunt demonstrative — de stabilit de evaluator la inspectie.</w:t>
       </w:r>
     </w:p>
     <w:p>
@@ -897,13 +1004,13 @@
     </w:p>
     <w:p>
       <w:r>
-        <w:t>Justificarea ajustărilor aplicate în grila de comparații a urmărit aducerea comparabilelor la nivelul proprietății subiect, prin separarea clară a diferențelor aferente etapei de tranzacție de cele aferente caracteristicilor proprietății. În prima etapă au fost analizate diferențele de piață dintre ofertă și tranzacție, respectiv nivelul de negociere și condițiile de comercializare, deoarece acestea influențează prețul observat și trebuie uniformizate pentru a reflecta valoarea de piață. În etapa a doua au fost efectuate ajustările pentru elementele intrinseci ale proprietății, precum terenul, suprafața utilă, suprafața construită și raportul teren–construcții, astfel încât comparabilele să poată fi puse în aceeași bază de analiză cu proprietatea evaluată.</w:t>
+        <w:t>Ajustările din grila de comparație au fost aplicate pentru a aduce prețurile comparabilelor la nivelul proprietății subiect, conform principiului substituției și cerinței de comparare a unor active similare, cu corecții pentru diferențele de caracteristici relevante dintre acestea și proprietatea evaluată. În etapa de tranzacție s-au operat ajustările care țin de condițiile efective ale pieței și de particularitățile vânzării fiecărui comparabil, astfel încât prețul utilizat să reflecte o tranzacție cât mai apropiată de condițiile de piață curente. În etapa de proprietate s-au aplicat ajustările pentru diferențele fizice și funcționale ale imobilului, respectiv pentru elementele care derivă din amplasare, suprafețe și caracteristicile constructive, astfel încât comparația să fie făcută între bunuri cu utilitate echivalentă.</w:t>
         <w:br/>
         <w:br/>
-        <w:t>Logica ajustărilor a urmărit principiul conform căruia se aplică ajustări atunci când comparabilul este superior sau inferior proprietății subiect, pentru a elimina influența diferențelor care nu reflectă direct valoarea acesteia. În cazul de față, abordarea prin piață a fost construită pe baza a 3 comparabile, iar selecția comparabilului index 0 ca reper principal s-a făcut deoarece acesta a generat ajustarea brută minimă, ceea ce indică cea mai bună similitudine globală față de proprietatea evaluată. Un comparabil cu ajustare brută minimă necesită cele mai puține corecții pentru a fi adus la nivelul subiectului, deci prezintă de regulă cea mai mare proximitate în termeni de caracteristici relevante și, implicit, cea mai bună adecvare pentru estimarea valorii de piață.</w:t>
+        <w:t>Comparabilul selectat are ajustarea brută minimă deoarece prezintă cel mai redus nivel cumulat de diferențe față de proprietatea subiect, ceea ce implică necesitatea celor mai puține corecții pentru alinierea la caracteristicile acesteia. În consecință, comparabilul respectiv este cel mai apropiat de subiect din punctul de vedere al atributelor relevante pentru piață, iar prețul său necesită cea mai mică intervenție de ajustare pentru a deveni reprezentativ pentru evaluare.</w:t>
         <w:br/>
         <w:br/>
-        <w:t>În analiza separată a terenului, valoarea unitară de 39,52 EUR/mp, aplicată suprafeței de 700 mp, conduce la o valoare de 27.664,00 EUR, iar această componentă a fost obținută prin compararea cu comparabilul selectat index 2 din cele 3 comparabile de teren. Diferențierea între valoarea terenului și valoarea construcțiilor a permis alocarea coerentă a valorii finale, în condițiile în care metoda prin piață rămâne metoda principală de reconciliere, iar abordarea prin cost are rol de control al plauzibilității rezultatului. În acest context, valoarea finală reconciliată de 135.267,00 EUR reflectă rezultatul cel mai probabil al pieței pentru proprietatea evaluată, în condițiile utilizării datelor disponibile și ale ajustărilor aplicate conform diferențelor identificate între comparabile și subiect.</w:t>
+        <w:t>Aceeași logică de selecție și ajustare este susținută și de rezultatul final al analizei: din cele 3 comparabile disponibile, comparabilul selectat este cel cu cea mai bună coerență față de subiect, iar ponderea sa în formarea valorii de piață este cea mai ridicată tocmai datorită nivelului minim al ajustărilor necesare. În acest context, valoarea de piață reconcilată de 135267.00 EUR reflectă cea mai probabilă exprimare a valorii pentru scopul garantării creditului ipotecar, conform tipului de valoare solicitat.</w:t>
       </w:r>
     </w:p>
     <w:p>
@@ -916,13 +1023,26 @@
     </w:p>
     <w:p>
       <w:r>
-        <w:t>În urma aplicării abordărilor de evaluare considerate relevante pentru scopul prezentei lucrări, respectiv garantarea creditului ipotecar, au fost obținute indicații distincte ale valorii pentru proprietatea imobiliară evaluată, exprimate în moneda EUR și raportate la data evaluării. Abordarea prin piață a condus la o valoare de 135267.00 EUR, pe baza a 3 comparabile, fiind selectat comparabilul cu indicele 0 pentru stabilirea prețului total. Abordarea prin cost a condus la o valoare de 178735.07 EUR, rezultată din însumarea valorii terenului și a valorii construcțiilor depreciate, având la bază CIB = 182600.00 EUR, Vcp = 16.00 ani, depreciere fizică = 17.27% și CIN = 151071.07 EUR.</w:t>
+        <w:rPr>
+          <w:i/>
+          <w:color w:val="B06A00"/>
+          <w:sz w:val="17"/>
+        </w:rPr>
+        <w:t>▮ NOTA DEMO — [CALCULAT] Selectia metodei si valoarea finala sunt calculate. [AI] Textul explicativ.</w:t>
+      </w:r>
+    </w:p>
+    <w:p>
+      <w:r>
+        <w:t>În cadrul prezentei evaluări, având ca scop garantarea creditului ipotecar și ca tip de valoare valoarea de piață (SEV 104), rezultatele obținute prin abordarea prin piață și abordarea prin cost au fost analizate și reconciliate în vederea exprimării unei opinii finale credibile și adecvate scopului evaluării. Conform principiilor generale ale evaluării, reconcilierea constă în selectarea valorii considerate de evaluator cea mai potrivită situației concrete dintre valorile obținute prin metodele aplicate.</w:t>
         <w:br/>
         <w:br/>
-        <w:t>Diferența dintre cele două indicații ale valorii reflectă faptul că abordarea prin cost capitalizează costul de înlocuire depreciat al activului, în timp ce abordarea prin piață surprinde mai direct comportamentul participanților de pe piață pentru proprietăți comparabile și condițiile curente de tranzacționare. În cadrul analizei separate a terenului, valoarea acestuia a fost estimată prin comparație la 39.52 EUR/mp, rezultând 27664.00 EUR pentru suprafața de 700 mp, pe baza comparabilului selectat cu indicele 2 din 3 comparabile de teren. Pentru construcție, valoarea alocată a fost de 107603.00 EUR.</w:t>
+        <w:t>Abordarea prin cost a condus la o valoare de 178735.07 EUR, determinată pe baza CIB = 182600.00, a duratei de viață economică Vcp = 16.00 ani, a deprecierii fizice de 17.27% și a CIN = 151071.07. Această abordare oferă o indicație utilă asupra valorii prin raportare la costul de înlocuire, diminuat cu deprecierea relevantă, însă în cazul proprietății evaluate ea are un caracter mai degrabă suportiv, întrucât nu reflectă direct comportamentul pieței pentru bunul subiect.</w:t>
         <w:br/>
         <w:br/>
-        <w:t>În etapa de reconciliere, s-a acordat pondere preponderentă abordării prin piață, întrucât aceasta oferă indicația cea mai relevantă pentru tipul de valoare urmărit, respectiv valoarea de piață (SEV 104), în contextul unui bun imobil pentru care există informații suficiente de comparabile. Abordarea prin cost a fost utilizată ca metodă de control și verificare a plauzibilității rezultatului obținut prin piață, fără a prevala în concluzia finală. Pe baza analizei comparative și a ponderării aplicate, valoarea finală reconciliată a proprietății este de 135267.00 EUR.</w:t>
+        <w:t>Abordarea prin piață a furnizat indicația de 135267.00 EUR, pe baza analizei a 3 comparabile, cu comparabilul selectat index 0 pentru prețul total, respectiv comparabilul selectat index 2 pentru teren. Pentru teren, rezultatul derivat din comparație este de 39.52 EUR/mp, ceea ce, aplicat la suprafața de 700 mp, conduce la o valoare de 27664.00 EUR; valoarea alocată construcțiilor este de 107603.00 EUR. Având în vedere scopul evaluării, tipul de valoare solicitat și faptul că abordarea prin piață reflectă cel mai direct comportamentul participanților la piață, aceasta a fost considerată metoda cu ponderea decisivă în reconciliere.</w:t>
+        <w:br/>
+        <w:br/>
+        <w:t>În consecință, valoarea finală reconciliată a proprietății imobiliare situate la Breaza de Sus, jud. Prahova, identificată prin 2xxxx (demo) și CF xxxxx Breaza (demo), este de 135267.00 EUR, în opinia [Nume evaluator autorizat ANEVAR], pentru beneficiarul/finanțatorul Banca Comerciala Exemplu S.A..</w:t>
       </w:r>
     </w:p>
     <w:p>
@@ -936,6 +1056,16 @@
       </w:pPr>
       <w:r>
         <w:t>ALOCAREA VALORII</w:t>
+      </w:r>
+    </w:p>
+    <w:p>
+      <w:r>
+        <w:rPr>
+          <w:i/>
+          <w:color w:val="B06A00"/>
+          <w:sz w:val="17"/>
+        </w:rPr>
+        <w:t>▮ NOTA DEMO — [CALCULAT] Valoare constructii = valoare proprietate − valoare teren.</w:t>
       </w:r>
     </w:p>
     <w:tbl>
@@ -1052,16 +1182,26 @@
     </w:p>
     <w:p>
       <w:r>
-        <w:t>Analiza riscului asociat garanției, realizată în conformitate cu GEV 520, are în vedere capacitatea proprietății de a susține în mod adecvat recuperarea creanței de către Banca Comerciala Exemplu S.A., prin raportare la valoarea de piață estimată și la comportamentul preconizabil al pieței relevante. În prezentul caz, valoarea de piață stabilită prin abordarea prin piață este de 135267.00 EUR, pe baza a 3 comparabile, ceea ce indică existența unui reper de piață relevant pentru tipul de proprietate evaluat și susține utilizarea imobilului ca garanție pentru scopul declarat.</w:t>
+        <w:rPr>
+          <w:i/>
+          <w:color w:val="B06A00"/>
+          <w:sz w:val="17"/>
+        </w:rPr>
+        <w:t>▮ NOTA DEMO — [AI] Text standard GEV 520 generat de AI; de adaptat la caz.</w:t>
+      </w:r>
+    </w:p>
+    <w:p>
+      <w:r>
+        <w:t>Riscul asociat garanției este apreciat ca fiind moderat, în contextul unei proprietăți rezidențiale pentru care valoarea de piață estimată, în scopul garantării creditului ipotecar, este de 135267.00 EUR, determinată prin abordarea prin piață, pe baza a 3 comparabile, cu comparabilul selectat index 0. Analiza este realizată în logica GEV 520, care solicită evaluarea valorii de piață și examinarea factorilor relevanți pentru performanța garanției pe perioada creditului, inclusiv activitatea și tendințele pieței relevante, cererea pentru tipul de imobil și localizarea acestuia.</w:t>
         <w:br/>
         <w:br/>
-        <w:t>Din perspectiva lichidității și a activității pieței locale, existența comparabilelor utilizate în procesul de evaluare sugerează o piață funcțională pentru proprietăți similare, însă nivelul de lichiditate rămâne dependent de timpul de expunere necesar pentru identificarea unui cumpărător la un preț apropiat de valoarea de piață. Pentru o proprietate cu teren intravilan de 700 mp și arie utilă de 180 mp / arie construită desfășurată de 220 mp, vandabilitatea este susținută de caracteristicile uzuale ale activului, dar nu poate fi disociată de sensibilitatea inerentă a prețului la condițiile curente ale pieței imobiliare și la eventuala schimbare a cererii pentru acest tip de proprietate.</w:t>
+        <w:t>Din perspectiva lichidității și a activității pieței locale, proprietatea beneficiază de o piață de referință identificabilă, reflectată de existența comparabilelor de piață utilizate în evaluare. Totuși, numărul limitat de comparabile relevante indică o piață de profunzime moderată, în care viteza de valorificare poate fi influențată de condițiile curente ale cererii și ofertei. În aceste condiții, lichiditatea garanției este considerată rezonabilă, dar nu ridicată, iar expunerea la variații de preț în cazul unei valorificări forțate rămâne prezentă.</w:t>
         <w:br/>
         <w:br/>
-        <w:t>Gradul de adecvare al proprietății ca garanție este apreciat ca fiind corespunzător scopului de garantare a creditului ipotecar, având în vedere că evaluarea a fost efectuată pentru determinarea valorii de piață, iar valoarea rezultată din piață este inferioară valorii obținute prin abordarea prin cost, respectiv 178735.07 EUR, ceea ce oferă un reper suplimentar de prudență în analiza riscului. În plus, alocarea valorii indică 107603.00 EUR pentru construcții și 27664.00 EUR pentru teren, ceea ce confirmă o structură valorică relativ echilibrată a proprietății și permite o apreciere separată a componentelor relevante pentru executarea garanției.</w:t>
+        <w:t>Gradul de adecvare al proprietății ca garanție este susținut de caracteristicile fizice și funcționale ale acesteia, respectiv teren intravilan de 700 mp, arie utilă de 180 mp și arie construită desfășurată de 220 mp. Valoarea obținută prin abordarea prin cost, respectiv 178735.07 EUR, este superioară valorii de piață reconcilate, ceea ce confirmă faptul că prețul estimat al garanției este ancorat în condițiile pieței și nu doar în costul de înlocuire. Alocarea valorii indică 107603.00 EUR pentru construcții și 27664.00 EUR pentru teren, ceea ce reflectă o structură de valoare echilibrată pentru o garanție ipotecară.</w:t>
         <w:br/>
         <w:br/>
-        <w:t>În ceea ce privește expunerea estimată și sensibilitatea valorii la condițiile pieței, valoarea finală reconciliată de 135267.00 EUR trebuie interpretată ca o valoare de piață la data evaluării, susceptibilă de variații în funcție de evoluția cererii, a ofertei și a timpului de expunere necesar vânzării. În consecință, riscul asociat garanției este influențat în principal de dinamica pieței locale și de menținerea caracterului vandabil al proprietății pe durata creditului, însă, pe baza datelor disponibile, proprietatea prezintă un profil acceptabil de garantare pentru scopul declarat.</w:t>
+        <w:t>Vandabilitatea este considerată bună în condițiile unei expuneri estimate la piață corespunzătoare tipului de proprietate și localizării, însă aceasta poate fi afectată de durata necesară identificării unui cumpărător la prețul de piață. Sensibilitatea valorii la condițiile pieței trebuie apreciată ca medie, întrucât valoarea finală este derivată din analiza comparabilelor de piață și poate varia în funcție de evoluția cererii, a nivelului prețurilor și a timpului de expunere. Pentru finanțatorul Banca Comerciala Exemplu S.A., garanția prezintă un profil de risc acceptabil pentru scopul urmărit, cu mențiunea că valoarea de recuperare într-un scenariu nefavorabil poate fi inferioară valorii de piață estimate.</w:t>
       </w:r>
     </w:p>
     <w:p>
@@ -1070,6 +1210,16 @@
       </w:pPr>
       <w:r>
         <w:t>ANEXE</w:t>
+      </w:r>
+    </w:p>
+    <w:p>
+      <w:r>
+        <w:rPr>
+          <w:i/>
+          <w:color w:val="B06A00"/>
+          <w:sz w:val="17"/>
+        </w:rPr>
+        <w:t>▮ NOTA DEMO — [EXTRAS] Sursele comparabilelor sunt linkuri reale. [EXEMPLU] Fotografiile sunt exemplificative. [PLACEHOLDER] Documentele cadastrale — de atasat.</w:t>
       </w:r>
     </w:p>
     <w:p>
@@ -1181,6 +1331,16 @@
     <w:p>
       <w:r>
         <w:t>Anexa 3 — Documente cadastrale, extras CF si acte juridice [de atasat].</w:t>
+      </w:r>
+    </w:p>
+    <w:p>
+      <w:r>
+        <w:rPr>
+          <w:i/>
+          <w:color w:val="B06A00"/>
+          <w:sz w:val="17"/>
+        </w:rPr>
+        <w:t>▮ NOTA DEMO — [PLACEHOLDER] Caseta de semnatura — de completat de evaluator.</w:t>
       </w:r>
     </w:p>
     <w:p/>

</xml_diff>

<commit_message>
feat: conformitate SEV 2025 + checklist GEV 520 in raport (din PDF oficial ANEVAR)
- Tip valoare: SEV 102 (era SEV 104); raportare conform SEV 106; termeni SEV 101
- Declaratie + scrisoare citeaza editia 2025 (HCN 2/2025) + Ghidul GEV 520
- Termeni de referinta: independenta/implicare materiala (A3), ipoteze speciale/vanzare fortata (A4),
  ipoteza transfer liber proprietar-ocupant (A8)
- Sectiunea GEV 520: factorii obligatorii A5 (a-d) + lichiditate/vandabilitate + inregistrare BIG
- Ghid AI pentru GEV 520 aliniat la A5
- roadmap: itemii Now 1/2/3 -> Done; raport Breaza regenerat conform

Co-Authored-By: Claude Opus 4.8 (1M context) <noreply@anthropic.com>
</commit_message>
<xml_diff>
--- a/docs/exemplu-raport-breaza.docx
+++ b/docs/exemplu-raport-breaza.docx
@@ -121,7 +121,7 @@
     </w:p>
     <w:p>
       <w:r>
-        <w:t>Raportul a fost elaborat in conformitate cu Standardele de evaluare a bunurilor ANEVAR in vigoare si poate fi utilizat exclusiv in scopul mentionat.</w:t>
+        <w:t>Raportul a fost elaborat in conformitate cu Standardele de evaluare a bunurilor ANEVAR, editia 2025 (in vigoare de la 1 iulie 2025, aprobate prin HCN nr. 2/2025), si cu Ghidul GEV 520 — Evaluarea pentru garantarea imprumutului. Poate fi utilizat exclusiv in scopul mentionat, de catre utilizatorul desemnat.</w:t>
       </w:r>
     </w:p>
     <w:p>
@@ -152,7 +152,7 @@
         <w:pStyle w:val="ListBullet"/>
       </w:pPr>
       <w:r>
-        <w:t>Prezentul raport a fost elaborat in conformitate cu Standardele de evaluare ANEVAR (SEV) in vigoare la data raportului.</w:t>
+        <w:t>Prezentul raport a fost elaborat in conformitate cu Standardele de evaluare a bunurilor ANEVAR (SEV), editia 2025, in vigoare de la 1 iulie 2025 (HCN nr. 2/2025), incluzand Ghidul GEV 520 — Evaluarea pentru garantarea imprumutului.</w:t>
       </w:r>
     </w:p>
     <w:p>
@@ -230,7 +230,7 @@
     </w:p>
     <w:p>
       <w:r>
-        <w:t>Tipul valorii estimate: Valoarea de piata (SEV 104).</w:t>
+        <w:t>Tipul valorii estimate: Valoarea de piață (SEV 102).</w:t>
       </w:r>
     </w:p>
     <w:p>
@@ -250,7 +250,17 @@
     </w:p>
     <w:p>
       <w:r>
-        <w:t>Premise: proprietatea este evaluata in ipoteza utilizarii continue, libera de sarcini, cu exceptia celor mentionate explicit in raport.</w:t>
+        <w:t>Premise: proprietatea este evaluata in ipoteza utilizarii continue, libera de sarcini, cu exceptia celor mentionate explicit in raport. Daca este ocupata de proprietar, se evalueaza in ipoteza transferului ca bun liber/disponibil (GEV 520, A8).</w:t>
+      </w:r>
+    </w:p>
+    <w:p>
+      <w:r>
+        <w:t>Independenta: evaluatorul declara ca nu are nicio implicare materiala, prezenta sau anterioara, cu bunul evaluat, cu debitorul sau cu un debitor potential, care sa afecteze obiectivitatea (GEV 520, A3; SEV 101). Utilizatorul desemnat al raportului este creditorul nominalizat; orice alta utilizare necesita personalizare de catre evaluator.</w:t>
+      </w:r>
+    </w:p>
+    <w:p>
+      <w:r>
+        <w:t>Ipoteze speciale: daca se solicita o valoare in premisa unei vanzari fortate sau cu perioada de marketing limitata, aceasta se precizeaza distinct; valoarea pe ipoteza speciala este valabila numai la data evaluarii si poate sa nu fie realizabila la o data viitoare (GEV 520, A4-A5).</w:t>
       </w:r>
     </w:p>
     <w:p>
@@ -288,7 +298,7 @@
     </w:p>
     <w:p>
       <w:r>
-        <w:t>Tipul valorii: Valoarea de piata (SEV 104).</w:t>
+        <w:t>Tipul valorii: Valoarea de piață (SEV 102).</w:t>
       </w:r>
     </w:p>
     <w:p>
@@ -321,13 +331,13 @@
     </w:p>
     <w:p>
       <w:r>
-        <w:t>În elaborarea prezentului raport s-au avut în vedere ipotezele generale și condițiile limitative standard aplicabile unei misiuni de evaluare pentru garantarea creditului ipotecar, în conformitate cu SEV în vigoare. Se presupune că dreptul de proprietate asupra bunului evaluat este valabil, opozabil și liber de sarcini, cu excepția situațiilor care ar fi fost menționate expres în documentația pusă la dispoziție; de asemenea, se presupune că informațiile furnizate de client sunt complete, corecte și suficiente pentru fundamentarea concluziei de evaluare.</w:t>
+        <w:t>La prezenta evaluare a fost întocmită având la bază ipoteza că dreptul de proprietate asupra bunului evaluat este valabil, opozabil și liber de sarcini, cu excepția situațiilor menționate expres în raport, iar documentația pusă la dispoziție reflectă în mod corect situația juridică și tehnică a proprietății. De asemenea, s-a presupus că imobilul are o structură de rezistență corespunzătoare și că elementele constructive, funcționale și de exploatare sunt conforme cu destinația actuală și cu cerințele uzuale pentru o proprietate similară.</w:t>
         <w:br/>
         <w:br/>
-        <w:t>Evaluarea s-a realizat pe baza analizei documentelor și a observațiilor disponibile la data evaluării, fără efectuarea de investigații ascunse, destructiv-invazive sau geotehnice, și fără deschiderea elementelor de construcție care nu sunt vizibile în mod obișnuit. În consecință, se presupune că structura de rezistență, instalațiile și celelalte elemente constructive ale imobilului sunt corespunzătoare utilizării curente, nefiind identificate în cadrul acestei misiuni defecte ascunse, vicii de structură, contaminări, poluări ori alte condiții speciale care ar putea influența semnificativ valoarea.</w:t>
+        <w:t>Evaluarea s-a realizat fără efectuarea de investigații distructive, geotehnice, structurale sau asupra elementelor ascunse ale construcției și terenului, astfel încât eventualele deficiențe care nu puteau fi identificate prin inspectarea uzuală nu au putut fi cuantificate distinct în cadrul prezentului raport. În consecință, orice concluzie privind starea tehnică, comportarea în exploatare sau caracteristicile ascunse ale proprietății este formulată exclusiv pe baza informațiilor disponibile la data evaluării și a constatărilor vizuale efectuate.</w:t>
         <w:br/>
         <w:br/>
-        <w:t>Raportul de evaluare este întocmit exclusiv pentru scopul declarat, respectiv garantarea creditului ipotecar, și pentru beneficiarul/finanțatorul Client demonstrativ – Banca Comerciala Exemplu S.A.; orice altă utilizare, difuzare sau reproducere parțială ori integrală fără acordul evaluatorului și fără analiza contextului de utilizare este exclusă. Concluzia de valoare exprimată în EUR, precum și alocările rezultate din abordările utilizate, sunt valabile numai în condițiile și ipotezele enunțate în prezentul raport, pentru imobilul identificat la Breaza de Sus, jud. Prahova, având 2xxxx (demo) și CF xxxxx Breaza (demo), și nu pot fi desprinse de cadrul de evaluare în care au fost stabilite.</w:t>
+        <w:t>Prezentul raport de evaluare a fost elaborat exclusiv în scopul declarat, respectiv garantarea creditului ipotecar pentru beneficiarul/finanțatorul Banca Comercială Exemplu S.A., și nu poate fi utilizat în alte scopuri, nici preluat parțial, fără acordul evaluatorului și fără verificarea contextului de utilizare. Valoarea estimată este expresia condițiilor de piață considerate la data evaluării, pentru bunul analizat în configurația sa actuală, având în vedere datele furnizate privind terenul intravilan de 700 mp, aria utilă de 180 mp și aria construită desfășurată de 220 mp. Concluzia de valoare nu poate fi separată de ipotezele, limitările și condițiile speciale menționate în prezentul raport, inclusiv de faptul că aceasta se bazează pe informațiile disponibile și pe premisele de evaluare acceptate în cadrul misiunii.</w:t>
       </w:r>
     </w:p>
     <w:p>
@@ -350,16 +360,13 @@
     </w:p>
     <w:p>
       <w:r>
-        <w:t>Piața imobiliară locală relevantă pentru proprietatea evaluată a fost analizată prin raportare la zona de amplasament și la comparabilele utilizate în abordarea prin piață, respectiv la comparațiile de teren folosite în fundamentarea valorii. În contextul scopului evaluării, respectiv garantarea creditului ipotecar, a fost avută în vedere o piață specifică în care formarea prețurilor rezultă din interacțiunea dintre cerere și ofertă, iar estimarea valorii de piață se bazează pe proprietăți similare vândute recent sau oferite la vânzare.</w:t>
+        <w:t>Piața imobiliară locală relevantă pentru proprietatea evaluată se caracterizează, în contextul datelor analizate, printr-un nivel de activitate suficient pentru susținerea unei estimări prin comparații directe, întrucât au fost identificate și utilizate 3 comparabile de piață, iar valoarea finală a fost reconciliată prin abordarea prin piață la 135267.00 EUR. Prezența comparabilelor și diferențele moderate dintre acestea indică existența unei piețe funcționale, în care prețurile sunt formate prin raportare la oferte și tranzacții similare, iar lichiditatea este una obișnuită pentru segmentul analizat, fără a rezulta elemente de blocaj sau o piață profund inactivă.</w:t>
         <w:br/>
         <w:br/>
-        <w:t>În zona analizată, cererea pentru proprietăți cu caracteristici similare pare susținută de utilizarea rezidențială și de interesul pentru suprafețe de teren intravilan și locuințe individuale cu arie utilă și arie construită comparabile cu subiectul evaluării. Oferta disponibilă este limitată la comparabilele identificate și selectate în analiză, iar numărul redus de comparabile relevante indică o piață de dimensiune restrânsă, specifică segmentelor locale în care diferențele de amplasament, teren și suprafață construită influențează semnificativ nivelul prețurilor.</w:t>
+        <w:t>Din punct de vedere al raportului cerere-ofertă, datele de evaluare susțin o piață selectivă, în care cumpărătorii își fundamentează decizia pe poziționarea în zonă, suprafață și caracteristicile fizice ale imobilului, iar nivelul valorilor observate în comparabile permite o corelare cu proprietatea subiect. Valoarea terenului determinată prin comparație, de 39.52 EUR/mp, aplicată la 700 mp, conduce la o valoare de 27664.00 EUR, ceea ce confirmă existența unui reper de piață distinct pentru componenta terenului și sugerează o cerere atent raportată la preț.</w:t>
         <w:br/>
         <w:br/>
-        <w:t>Lichiditatea pieței este apreciată ca fiind moderată, în sensul că tranzacționarea unor active cu caracteristici apropiate este posibilă, dar necesită selecția atentă a comparabilelor și ajustarea diferențelor de poziționare, dimensiune și caracteristici constructive. Valoarea obținută prin abordarea prin piață, de 135267.00 EUR, susținută de un comparabil selectat din 3 comparabile analizate, confirmă existența unor repere de piață utilizabile pentru estimare, însă și dependența rezultatelor de calitatea și gradul de relevanță al datelor de piață disponibile.</w:t>
-        <w:br/>
-        <w:br/>
-        <w:t>Pentru teren, analiza comparativă a condus la un nivel de 39.52 EUR/mp, ceea ce reflectă existența unui segment de piață activ pentru terenuri intravilane similare, dar și necesitatea corelării cu particularitățile parcelei analizate, având suprafața de 700 mp. În ansamblu, tendința relevantă pentru evaluare este aceea a unei piețe locale funcționale, cu volum limitat de informații comparabile și cu prețuri influențate de caracteristicile individuale ale proprietăților, fapt evidențiat și de diferența dintre valoarea rezultată prin piață și rezultatul abordării prin cost.</w:t>
+        <w:t>Tendințele observate prin analiza comparabilelor utilizate arată o orientare a pieței către proprietăți care pot fi evaluate prin comparare directă, iar diferențele dintre teren și construcție impun o structurare a valorii pe componente. În acest sens, valoarea alocată construcțiilor este de 107603.00 EUR, iar rezultatul final reflectă prețul cel mai probabil de piață pentru proprietatea evaluată, în condițiile pieței analizate și ale scopului de garantare a creditului ipotecar în beneficiul Banca Comerciala Exemplu S.A.</w:t>
       </w:r>
     </w:p>
     <w:p>
@@ -392,13 +399,13 @@
     </w:p>
     <w:p>
       <w:r>
-        <w:t>Imobilul evaluat este identificat din punct de vedere juridic prin elementele cadastrale și de carte funciară puse la dispoziție în documentația de evaluare, respectiv 2xxxx (demo) și CF xxxxx Breaza (demo), acestea reprezentând reperele de individualizare ale proprietății în evidențele de cadastru și publicitate imobiliară.</w:t>
+        <w:t>Proprietatea analizată este identificată din punct de vedere juridic prin numerele cadastrale și de carte funciară indicate în documentația pusă la dispoziție, respectiv 2xxxx (demo) și CF xxxxx Breaza (demo), elemente ce permit individualizarea imobilului în evidențele cadastrale și de publicitate imobiliară. Evaluarea a fost efectuată pentru garantarea unui credit ipotecar, în favoarea beneficiarul/finanțator Client demonstrativ, în scopul estimării valorii de piață conform SEV 102.</w:t>
         <w:br/>
         <w:br/>
-        <w:t>Din punct de vedere fizic, proprietatea este compusă din teren în suprafață de 700 mp, încadrat la categoria de folosință intravilan, și dintr-o construcție cu arie utilă de 180 mp și arie construită desfășurată de 220 mp, aferentă anului de referință 2026. Ansamblul analizat prezintă caracteristicile unei proprietăți rezidențiale/imobiliare individualizate prin amplasament și prin parametrii dimensionali menționați, fără a se modifica datele numerice furnizate.</w:t>
+        <w:t>Din punct de vedere fizic, imobilul este amplasat pe un teren intravilan în suprafață de 700 mp. Terenul este aferent unei construcții cu aria utilă de 180 mp și aria construită desfășurată de 220 mp, iar anul de referință considerat este 2026. În baza datelor disponibile, terenul și construcția au fost analizate distinct, valoarea terenului fiind fundamentată prin comparație, iar valoarea construcției fiind alocată prin reconcilierea abordărilor utilizate.</w:t>
         <w:br/>
         <w:br/>
-        <w:t>Evaluarea a fost realizată pentru garantarea creditului ipotecar, în vederea stabilirii valorii de piață conform SEV 104, pentru beneficiarul/finanțatorul Banca Comerciala Exemplu S.A.. În cadrul abordării prin piață, valoarea terenului a fost estimată la 27.664,00 EUR, iar valoarea alocată construcției la 107.603,00 EUR, rezultând o valoare finală reconciliată de 135.267,00 EUR.</w:t>
+        <w:t>În urma analizei, terenul a fost evaluat la 27.664,00 EUR, rezultând dintr-un nivel de 39,52 EUR/mp aplicat suprafeței de 700 mp, iar valoarea alocată construcției este de 107.603,00 EUR. Ansamblul imobilului a fost reconciliat la valoarea de piață de 135.267,00 EUR, valoare utilizată în contextul scopului raportului. Din perspectiva caracteristicilor constructive, evaluarea prin cost a condus la o valoare a construcției de 178.735,07 EUR, pe baza unui CIB de 182.600,00, a unui Vcp de 16,00 ani și a unei deprecieri fizice de 17,27%, date utilizate exclusiv în procesul de analiză internă a valorii.</w:t>
       </w:r>
     </w:p>
     <w:p>
@@ -421,13 +428,16 @@
     </w:p>
     <w:p>
       <w:r>
-        <w:t>Analiza celei mai bune utilizări a proprietății subiect se realizează prin raportare la utilizarea care este permisă legal, posibilă fizic, fezabilă financiar și maximum productivă, în sensul definiției din standardele de evaluare aplicabile. În cazul de față, având în vedere caracteristicile bunului evaluat — teren intravilan cu suprafața de 700 mp, construcție existentă cu arie utilă de 180 mp și arie construită desfășurată de 220 mp — utilizarea rezidențială existentă reprezintă opțiunea cea mai probabilă și relevantă pentru piață.</w:t>
+        <w:t xml:space="preserve">Analiza celei mai bune utilizări a proprietății a fost realizată în raport cu criteriile de permisibilitate legală, posibilitate fizică, fezabilitate financiară și maximum productivitate, conform cerințelor standardelor de evaluare aplicabile. În cazul de față, proprietatea evaluată este o proprietate construită situată pe un teren de 700 mp în intravilan, având o arie utilă de 180 mp și o arie construită desfășurată de 220 mp, în anul de referință 2026. </w:t>
         <w:br/>
         <w:br/>
-        <w:t>Din punct de vedere fizic, proprietatea permite continuarea utilizării actuale, fără a rezulta din datele disponibile o limitare care să impună schimbarea destinației sau o reconfigurare care să conducă la o utilizare superioară. Din punct de vedere legal, utilizarea rezidențială este considerată admisibilă în cadrul analizei, în absența unor informații contrare privind restricții urbanistice sau de reglementare. În consecință, utilizarea actuală îndeplinește criteriile de permisibilitate legală și posibilitate fizică.</w:t>
+        <w:t>Din punct de vedere al utilizării legale și fizice, configurația terenului și existența construcției permit continuarea utilizării rezidențiale existente, fără a rezulta din datele disponibile indicii care să susțină o schimbare de destinație mai avantajoasă. Utilizarea rezidențială este, în mod uzual, compatibilă cu o proprietate construită de acest tip și reprezintă o opțiune realistă din perspectiva pieței, întrucât răspunde criteriilor de utilizare rezonabilă și probabilă ale unui activ imobiliar.</w:t>
         <w:br/>
         <w:br/>
-        <w:t>Sub aspectul fezabilității financiare și al maximului productiv, rezultatele abordărilor de evaluare susțin menținerea utilizării rezidențiale existente. Valoarea finală reconciliată este de 135267.00 EUR, obținută prin abordarea prin piață, iar abordarea prin cost indică o valoare de 178735.07 EUR, cu valoarea terenului estimată prin comparație la 27664.00 EUR și valoarea alocată construcțiilor la 107603.00 EUR. În contextul scopului evaluării — garantarea creditului ipotecar pentru Client demonstrativ, în favoarea Client demonstrativ/[FINANTATOR] — utilizarea rezidențială existentă se confirmă ca fiind fezabilă financiar și, în raport cu datele disponibile, cea mai productivă utilizare a proprietății.</w:t>
+        <w:t>Sub aspectul fezabilității financiare, analiza prin piață conduce la o valoare de 135267.00 EUR, iar analiza prin cost indică o valoare prin cost de 178735.07 EUR, obținută din CIB = 182600.00, cu depreciere fizică de 17.27%, respectiv CIN = 151071.07. De asemenea, valoarea terenului determinată prin comparație este de 27664.00 EUR pentru 700 mp, iar valoarea alocată construcției este de 107603.00 EUR; aceste rezultate susțin menținerea utilizării curente, în condițiile în care nu se evidențiază, pe baza datelor furnizate, o alternativă de exploatare care să genereze o valoare superioară și să justifice o schimbare de utilizare.</w:t>
+        <w:br/>
+        <w:br/>
+        <w:t>În consecință, cea mai bună utilizare a proprietății, în ipoteza actuală de evaluare pentru garantarea creditului ipotecar și pentru determinarea valorii de piață, este utilizarea rezidențială existentă, aceasta fiind singura utilizare susținută de datele disponibile ca fiind permisă legal, posibilă fizic, fezabilă financiar și, în lipsa unor elemente contrare, maxim productivă.</w:t>
       </w:r>
     </w:p>
     <w:p>
@@ -1004,13 +1014,13 @@
     </w:p>
     <w:p>
       <w:r>
-        <w:t>Ajustările din grila de comparație au fost aplicate pentru a aduce prețurile comparabilelor la nivelul proprietății subiect, conform principiului substituției și cerinței de comparare a unor active similare, cu corecții pentru diferențele de caracteristici relevante dintre acestea și proprietatea evaluată. În etapa de tranzacție s-au operat ajustările care țin de condițiile efective ale pieței și de particularitățile vânzării fiecărui comparabil, astfel încât prețul utilizat să reflecte o tranzacție cât mai apropiată de condițiile de piață curente. În etapa de proprietate s-au aplicat ajustările pentru diferențele fizice și funcționale ale imobilului, respectiv pentru elementele care derivă din amplasare, suprafețe și caracteristicile constructive, astfel încât comparația să fie făcută între bunuri cu utilitate echivalentă.</w:t>
+        <w:t xml:space="preserve">Ajustările aplicate în grila de piață au fost stabilite astfel încât prețurile comparabile să poată fi aduse la nivelul proprietății evaluate, prin reflectarea diferențelor relevante dintre tranzacția efectivă și proprietatea subiect. În logica evaluării prin comparații directe, corecțiile se aplică asupra prețului comparabilului pentru a evidenția diferențele de localizare, caracteristici fizice, condiții de piață și, acolo unde este cazul, diferența dintre *tranzacție* și *ofertă*, astfel încât rezultatul final să exprime cea mai bună estimare a valorii de piață a proprietății evaluate. </w:t>
         <w:br/>
         <w:br/>
-        <w:t>Comparabilul selectat are ajustarea brută minimă deoarece prezintă cel mai redus nivel cumulat de diferențe față de proprietatea subiect, ceea ce implică necesitatea celor mai puține corecții pentru alinierea la caracteristicile acesteia. În consecință, comparabilul respectiv este cel mai apropiat de subiect din punctul de vedere al atributelor relevante pentru piață, iar prețul său necesită cea mai mică intervenție de ajustare pentru a deveni reprezentativ pentru evaluare.</w:t>
+        <w:t xml:space="preserve">Separarea ajustărilor în etapa de *tranzacție* și etapa de *proprietate* urmărește să distingă între corecțiile care țin de condițiile în care s-a realizat transferul dreptului de proprietate și corecțiile care țin de însușirile intrinseci ale comparabilului. Ajustările de tranzacție vizează, în esență, caracterul negocierii, condițiile vânzării și contextul pieței, în timp ce ajustările de proprietate reflectă diferențele obiective dintre imobilul comparabil și imobilul evaluat, precum suprafața, arie utilă, arie construită desfășurată, terenul aferent și alte elemente comparabile analizate în grilă. </w:t>
         <w:br/>
         <w:br/>
-        <w:t>Aceeași logică de selecție și ajustare este susținută și de rezultatul final al analizei: din cele 3 comparabile disponibile, comparabilul selectat este cel cu cea mai bună coerență față de subiect, iar ponderea sa în formarea valorii de piață este cea mai ridicată tocmai datorită nivelului minim al ajustărilor necesare. În acest context, valoarea de piață reconcilată de 135267.00 EUR reflectă cea mai probabilă exprimare a valorii pentru scopul garantării creditului ipotecar, conform tipului de valoare solicitat.</w:t>
+        <w:t>Comparabilul selectat a fost cel cu ajustarea brută minimă deoarece acesta a necesitat cele mai mici corecții totale pentru a deveni comparabil cu proprietatea evaluată, ceea ce indică cel mai înalt grad de asemănare față de subiect și, implicit, cea mai bună relevanță pentru estimarea valorii. În consecință, comparabilul cu ajustarea brută minimă a primit ponderea cea mai mare în reconcilierea valorilor, întrucât necesarul redus de corecții este un indicator al calității superioare a comparației și al încrederii mai mari în informațiile de piață utilizate.</w:t>
       </w:r>
     </w:p>
     <w:p>
@@ -1033,16 +1043,13 @@
     </w:p>
     <w:p>
       <w:r>
-        <w:t>În cadrul prezentei evaluări, având ca scop garantarea creditului ipotecar și ca tip de valoare valoarea de piață (SEV 104), rezultatele obținute prin abordarea prin piață și abordarea prin cost au fost analizate și reconciliate în vederea exprimării unei opinii finale credibile și adecvate scopului evaluării. Conform principiilor generale ale evaluării, reconcilierea constă în selectarea valorii considerate de evaluator cea mai potrivită situației concrete dintre valorile obținute prin metodele aplicate.</w:t>
+        <w:t>În urma aplicării abordărilor de evaluare considerate adecvate scopului raportului, s-au obținut indicații diferite ale valorii. Abordarea prin cost a condus la o valoare de 178735.07 EUR, determinată pe baza costului brut de înlocuire de 182600.00 EUR, a vârstei economice de 16.00 ani, a deprecierii fizice de 17.27% și a costului net de înlocuire de 151071.07 EUR. Abordarea prin piață a furnizat o valoare de 135267.00 EUR, pe baza comparației cu 3 comparabile, fiind selectat comparabilul cu index 0; pentru teren, analiza comparativă a condus la un nivel de 39.52 EUR/mp, aplicat la suprafața de 700 mp, rezultând 27664.00 EUR, iar valoarea alocată construcției este de 107603.00 EUR.</w:t>
         <w:br/>
         <w:br/>
-        <w:t>Abordarea prin cost a condus la o valoare de 178735.07 EUR, determinată pe baza CIB = 182600.00, a duratei de viață economică Vcp = 16.00 ani, a deprecierii fizice de 17.27% și a CIN = 151071.07. Această abordare oferă o indicație utilă asupra valorii prin raportare la costul de înlocuire, diminuat cu deprecierea relevantă, însă în cazul proprietății evaluate ea are un caracter mai degrabă suportiv, întrucât nu reflectă direct comportamentul pieței pentru bunul subiect.</w:t>
+        <w:t>Diferența dintre cele două rezultate reflectă natura distinctă a celor două abordări. Abordarea prin cost exprimă în principal o indicație tehnică a valorii, derivată din costul de refacere al proprietății, ajustat cu deprecierea estimată, în timp ce abordarea prin piață surprinde mai fidel comportamentul tranzacțional observat pentru proprietăți comparabile și este, în contextul de față, mai relevantă pentru estimarea valorii de piață în sensul SEV 102. Având în vedere scopul evaluării, respectiv garantarea creditului ipotecar, și disponibilitatea unui set de comparații de piață, metoda pieței a fost considerată preponderentă în reconciliere.</w:t>
         <w:br/>
         <w:br/>
-        <w:t>Abordarea prin piață a furnizat indicația de 135267.00 EUR, pe baza analizei a 3 comparabile, cu comparabilul selectat index 0 pentru prețul total, respectiv comparabilul selectat index 2 pentru teren. Pentru teren, rezultatul derivat din comparație este de 39.52 EUR/mp, ceea ce, aplicat la suprafața de 700 mp, conduce la o valoare de 27664.00 EUR; valoarea alocată construcțiilor este de 107603.00 EUR. Având în vedere scopul evaluării, tipul de valoare solicitat și faptul că abordarea prin piață reflectă cel mai direct comportamentul participanților la piață, aceasta a fost considerată metoda cu ponderea decisivă în reconciliere.</w:t>
-        <w:br/>
-        <w:br/>
-        <w:t>În consecință, valoarea finală reconciliată a proprietății imobiliare situate la Breaza de Sus, jud. Prahova, identificată prin 2xxxx (demo) și CF xxxxx Breaza (demo), este de 135267.00 EUR, în opinia [Nume evaluator autorizat ANEVAR], pentru beneficiarul/finanțatorul Banca Comerciala Exemplu S.A..</w:t>
+        <w:t>În consecință, rezultatul final reconciliat a fost stabilit la 135267.00 EUR, valoare adoptată din abordarea prin piață și considerată cea mai reprezentativă pentru proprietatea evaluată la data de referință 2026. Această valoare exprimă opinia evaluatorului asupra valorii de piață a imobilului identificat prin 2xxxx (demo) și CF xxxxx Breaza (demo), pentru beneficiarul / finantatorul Banca Comerciala Exemplu S.A..</w:t>
       </w:r>
     </w:p>
     <w:p>
@@ -1192,16 +1199,63 @@
     </w:p>
     <w:p>
       <w:r>
-        <w:t>Riscul asociat garanției este apreciat ca fiind moderat, în contextul unei proprietăți rezidențiale pentru care valoarea de piață estimată, în scopul garantării creditului ipotecar, este de 135267.00 EUR, determinată prin abordarea prin piață, pe baza a 3 comparabile, cu comparabilul selectat index 0. Analiza este realizată în logica GEV 520, care solicită evaluarea valorii de piață și examinarea factorilor relevanți pentru performanța garanției pe perioada creditului, inclusiv activitatea și tendințele pieței relevante, cererea pentru tipul de imobil și localizarea acestuia.</w:t>
+        <w:t>Perioada de menținere a garanției impune aprecierea capacității imobilului de a-și conserva valoarea de piață și de a putea fi valorificat într-un interval rezonabil, în condițiile pieței locale. Conform cerințelor GEV 520, analiza include activitatea curentă și tendințele pieței relevante, precum și cererea anterioară, curentă și viitoare pentru tipul de bun și pentru localizare, elemente care au fost avute în vedere la stabilirea valorii de piață de 135267.00 EUR, prin abordarea prin piață, pe baza a 3 comparabile, cu valoarea terenului estimată la 39.52 EUR/mp pentru 700 mp și valoarea alocată construcției de 107603.00 EUR.</w:t>
         <w:br/>
         <w:br/>
-        <w:t>Din perspectiva lichidității și a activității pieței locale, proprietatea beneficiază de o piață de referință identificabilă, reflectată de existența comparabilelor de piață utilizate în evaluare. Totuși, numărul limitat de comparabile relevante indică o piață de profunzime moderată, în care viteza de valorificare poate fi influențată de condițiile curente ale cererii și ofertei. În aceste condiții, lichiditatea garanției este considerată rezonabilă, dar nu ridicată, iar expunerea la variații de preț în cazul unei valorificări forțate rămâne prezentă.</w:t>
+        <w:t>Din perspectiva cererii, proprietatea analizată, având teren intravilan de 700 mp și arie utilă de 180 mp, se înscrie în categoria bunurilor rezidențiale care, în mod uzual, beneficiază de o piață activă atunci când localizarea și caracteristicile constructive sunt compatibile cu preferințele cumpărătorilor. Cererea anterioară și curentă pentru astfel de proprietăți susține, în principiu, vandabilitatea bunului, iar cererea viitoare depinde de menținerea atractivității zonei, de evoluția pieței imobiliare locale și de capacitatea proprietății de a răspunde utilizărilor rezidențiale curente.</w:t>
         <w:br/>
         <w:br/>
-        <w:t>Gradul de adecvare al proprietății ca garanție este susținut de caracteristicile fizice și funcționale ale acesteia, respectiv teren intravilan de 700 mp, arie utilă de 180 mp și arie construită desfășurată de 220 mp. Valoarea obținută prin abordarea prin cost, respectiv 178735.07 EUR, este superioară valorii de piață reconcilate, ceea ce confirmă faptul că prețul estimat al garanției este ancorat în condițiile pieței și nu doar în costul de înlocuire. Alocarea valorii indică 107603.00 EUR pentru construcții și 27664.00 EUR pentru teren, ceea ce reflectă o structură de valoare echilibrată pentru o garanție ipotecară.</w:t>
+        <w:t xml:space="preserve">În ceea ce privește cererea pentru alte utilizări, imobilul are, în principal, o utilitate rezidențială, iar posibilitățile de conversie spre alte destinații trebuie privite prin prisma reglementărilor urbanistice, a dimensiunii terenului și a cererii de piață pentru asemenea alternative. Evenimentele previzibile care pot influența valoarea viitoare a garanției includ modificările generale ale pieței imobiliare, ale condițiilor de finanțare și ale preferințelor cumpărătorilor, precum și eventuale schimbări de context local care pot afecta viteza de valorificare sau nivelul prețurilor. </w:t>
         <w:br/>
         <w:br/>
-        <w:t>Vandabilitatea este considerată bună în condițiile unei expuneri estimate la piață corespunzătoare tipului de proprietate și localizării, însă aceasta poate fi afectată de durata necesară identificării unui cumpărător la prețul de piață. Sensibilitatea valorii la condițiile pieței trebuie apreciată ca medie, întrucât valoarea finală este derivată din analiza comparabilelor de piață și poate varia în funcție de evoluția cererii, a nivelului prețurilor și a timpului de expunere. Pentru finanțatorul Banca Comerciala Exemplu S.A., garanția prezintă un profil de risc acceptabil pentru scopul urmărit, cu mențiunea că valoarea de recuperare într-un scenariu nefavorabil poate fi inferioară valorii de piață estimate.</w:t>
+        <w:t>Pe baza valorii de piață determinate și a caracteristicilor fizice și funcționale prezentate, garanția poate fi apreciată ca având un grad de adecvare corespunzător pentru scopul garantării creditului ipotecar, cu o lichiditate și o vandabilitate dependente de menținerea condițiilor normale de piață. Valoarea rezultată reprezintă baza de analiză pentru creditor, iar performanța garanției pe perioada creditului trebuie urmărită în raport cu evoluția efectivă a pieței și cu eventualele schimbări ale cererii pentru acest tip de proprietate.</w:t>
+      </w:r>
+    </w:p>
+    <w:p>
+      <w:r>
+        <w:t>Factori relevanti pentru performanta garantiei (GEV 520, A5):</w:t>
+      </w:r>
+    </w:p>
+    <w:p>
+      <w:pPr>
+        <w:pStyle w:val="ListBullet"/>
+      </w:pPr>
+      <w:r>
+        <w:t>activitatea curenta si tendintele pietei relevante;</w:t>
+      </w:r>
+    </w:p>
+    <w:p>
+      <w:pPr>
+        <w:pStyle w:val="ListBullet"/>
+      </w:pPr>
+      <w:r>
+        <w:t>cererea anterioara, curenta si viitoare pentru tipul de bun si pentru localizare;</w:t>
+      </w:r>
+    </w:p>
+    <w:p>
+      <w:pPr>
+        <w:pStyle w:val="ListBullet"/>
+      </w:pPr>
+      <w:r>
+        <w:t>cererea potentiala sau probabila pentru alte utilizari, la data evaluarii;</w:t>
+      </w:r>
+    </w:p>
+    <w:p>
+      <w:pPr>
+        <w:pStyle w:val="ListBullet"/>
+      </w:pPr>
+      <w:r>
+        <w:t>impactul evenimentelor previzibile la data evaluarii asupra valorii viitoare a garantiei pe perioada creditului.</w:t>
+      </w:r>
+    </w:p>
+    <w:p>
+      <w:r>
+        <w:t>Lichiditate si vandabilitate: se apreciaza lichiditatea pietei locale, gradul de adecvare al proprietatii ca garantie si perioada de comercializare estimata.</w:t>
+      </w:r>
+    </w:p>
+    <w:p>
+      <w:r>
+        <w:t>Inregistrare BIG: raportul, avand utilizarea desemnata de garantare a imprumutului, se inregistreaza in Baza Imobiliara de Garantii (BIG), conform reglementarilor ANEVAR.</w:t>
       </w:r>
     </w:p>
     <w:p>

</xml_diff>

<commit_message>
feat: termeni de referinta conform SEV 101 (16 elemente) + ESG (nou 2025) din textul complet SEV 2025
Din standardele-de-evaluare-a-bunurilor-2025.md (text integral): SEV 101 20.1 (a-p) si SEV 106 30.6
(a-r). Adaugat elementele lipsa: evaluator (e), amploarea activitatilor/limitari (i), sursa
informatiilor (j), FACTORI ESG mediu/social/guvernanta (m - nou in 2025), specialist (o),
tip raport + restrictii difuzare (n,o). Raport Breaza regenerat.

Co-Authored-By: Claude Opus 4.8 (1M context) <noreply@anthropic.com>
</commit_message>
<xml_diff>
--- a/docs/exemplu-raport-breaza.docx
+++ b/docs/exemplu-raport-breaza.docx
@@ -83,7 +83,7 @@
         <w:rPr>
           <w:b/>
         </w:rPr>
-        <w:t>VALOAREA ESTIMATA: 135.267 EUR. Valoarea nu contine TVA.</w:t>
+        <w:t>VALOAREA ESTIMATA: 135.267 EUR (echivalent ~672.953 LEI la cursul BNR 4.9750). Valoarea nu contine TVA.</w:t>
       </w:r>
     </w:p>
     <w:p>
@@ -264,6 +264,36 @@
       </w:r>
     </w:p>
     <w:p>
+      <w:r>
+        <w:t>Evaluatorul: [Nume evaluator autorizat ANEVAR], membru ANEVAR, legitimatia [nr. legitimatie] (SEV 101, 20.1 e).</w:t>
+      </w:r>
+    </w:p>
+    <w:p>
+      <w:r>
+        <w:t>Natura si amploarea activitatilor: inspectia si analiza in limitele mandatului de evaluator autorizat, fara investigatii distructive, geotehnice sau juridice de specialitate (SEV 101, 20.1 i).</w:t>
+      </w:r>
+    </w:p>
+    <w:p>
+      <w:r>
+        <w:t>Sursa informatiilor: documentele proprietatii puse la dispozitie, date de piata din oferte publice (cu caracter indicativ, verificate de evaluator) si cursul de schimb BNR (SEV 101, 20.1 j).</w:t>
+      </w:r>
+    </w:p>
+    <w:p>
+      <w:r>
+        <w:t>Factori de mediu, sociali si de guvernanta (ESG): se au in vedere factorii cunoscuti, relevanti pentru valoare (ex. performanta energetica conform certificatului energetic, daca exista); nu s-au efectuat investigatii de mediu specializate (SEV 101/106, 20.1/30.6 m).</w:t>
+      </w:r>
+    </w:p>
+    <w:p>
+      <w:r>
+        <w:t>Specialist: nu a fost cazul utilizarii unui specialist sau furnizor extern de servicii (SEV 106, 30.6 o).</w:t>
+      </w:r>
+    </w:p>
+    <w:p>
+      <w:r>
+        <w:t>Tipul raportului si restrictii: raport scris, narativ. Raportul poate fi utilizat exclusiv in scopul declarat, de catre utilizatorul desemnat; difuzarea sau publicarea, integrala ori partiala, se face numai cu acordul scris al evaluatorului (SEV 101, 20.1 n, o).</w:t>
+      </w:r>
+    </w:p>
+    <w:p>
       <w:pPr>
         <w:pStyle w:val="Heading1"/>
       </w:pPr>
@@ -331,13 +361,16 @@
     </w:p>
     <w:p>
       <w:r>
-        <w:t>La prezenta evaluare a fost întocmită având la bază ipoteza că dreptul de proprietate asupra bunului evaluat este valabil, opozabil și liber de sarcini, cu excepția situațiilor menționate expres în raport, iar documentația pusă la dispoziție reflectă în mod corect situația juridică și tehnică a proprietății. De asemenea, s-a presupus că imobilul are o structură de rezistență corespunzătoare și că elementele constructive, funcționale și de exploatare sunt conforme cu destinația actuală și cu cerințele uzuale pentru o proprietate similară.</w:t>
+        <w:t>Ipotezele și condițiile limitative ale prezentului raport au fost formulate în conformitate cu SEV și cu scopul declarat al evaluării, respectiv garantarea creditului ipotecar. Se presupune că dreptul de proprietate asupra imobilului evaluat este valabil, opozabil și liber de sarcini, cu excepția eventualelor sarcini sau limitări care au fost menționate în documentele puse la dispoziția evaluatorului și care au fost avute în vedere la elaborarea raportului.</w:t>
         <w:br/>
         <w:br/>
-        <w:t>Evaluarea s-a realizat fără efectuarea de investigații distructive, geotehnice, structurale sau asupra elementelor ascunse ale construcției și terenului, astfel încât eventualele deficiențe care nu puteau fi identificate prin inspectarea uzuală nu au putut fi cuantificate distinct în cadrul prezentului raport. În consecință, orice concluzie privind starea tehnică, comportarea în exploatare sau caracteristicile ascunse ale proprietății este formulată exclusiv pe baza informațiilor disponibile la data evaluării și a constatărilor vizuale efectuate.</w:t>
+        <w:t>Se consideră că imobilul are o structură de rezistență corespunzătoare, că elementele constructive și instalațiile se află într-o stare compatibilă cu exploatarea normală și că nu există vicii ascunse, degradări neobservabile sau alte defecte care ar putea influența valoarea, în absența unor investigații de specialitate. De asemenea, raportul nu include investigații tehnice ascunse, expertize structurale, studii geotehnice, verificări de laborator sau alte analize care depășesc sfera unei inspecții de evaluare și a documentației disponibile.</w:t>
         <w:br/>
         <w:br/>
-        <w:t>Prezentul raport de evaluare a fost elaborat exclusiv în scopul declarat, respectiv garantarea creditului ipotecar pentru beneficiarul/finanțatorul Banca Comercială Exemplu S.A., și nu poate fi utilizat în alte scopuri, nici preluat parțial, fără acordul evaluatorului și fără verificarea contextului de utilizare. Valoarea estimată este expresia condițiilor de piață considerate la data evaluării, pentru bunul analizat în configurația sa actuală, având în vedere datele furnizate privind terenul intravilan de 700 mp, aria utilă de 180 mp și aria construită desfășurată de 220 mp. Concluzia de valoare nu poate fi separată de ipotezele, limitările și condițiile speciale menționate în prezentul raport, inclusiv de faptul că aceasta se bazează pe informațiile disponibile și pe premisele de evaluare acceptate în cadrul misiunii.</w:t>
+        <w:t>Suprafața terenului, categoria de folosință, ariile construite și celelalte date numerice utilizate în raport au fost preluate exclusiv din informațiile furnizate și au fost considerate corecte și complete în limitele mandatului primit. Evaluarea a fost realizată pentru un imobil cu teren de 700 mp, intravilan, și construcție cu Au de 180 mp și Acd de 220 mp, în condițiile anului de referință 2026, fără a se efectua măsurători independente ori verificări cadastrale suplimentare.</w:t>
+        <w:br/>
+        <w:br/>
+        <w:t>Prezentul raport poate fi utilizat exclusiv în scopul declarat și de către beneficiarul/finanțatorul Banca Comerciala Exemplu S.A., pentru obiectivul evaluării stabilit în misiune. Orice utilizare parțială, în alt scop, în alt context sau de către alte persoane decât cele pentru care a fost întocmit raportul, fără acordul evaluatorului, poate conduce la concluzii neadecvate și nu intră în responsabilitatea evaluatorului.</w:t>
       </w:r>
     </w:p>
     <w:p>
@@ -360,13 +393,13 @@
     </w:p>
     <w:p>
       <w:r>
-        <w:t>Piața imobiliară locală relevantă pentru proprietatea evaluată se caracterizează, în contextul datelor analizate, printr-un nivel de activitate suficient pentru susținerea unei estimări prin comparații directe, întrucât au fost identificate și utilizate 3 comparabile de piață, iar valoarea finală a fost reconciliată prin abordarea prin piață la 135267.00 EUR. Prezența comparabilelor și diferențele moderate dintre acestea indică existența unei piețe funcționale, în care prețurile sunt formate prin raportare la oferte și tranzacții similare, iar lichiditatea este una obișnuită pentru segmentul analizat, fără a rezulta elemente de blocaj sau o piață profund inactivă.</w:t>
+        <w:t>Piața imobiliară locală relevantă pentru proprietatea evaluată este caracterizată de o formare a prețului prin interacțiunea dintre cerere și ofertă, iar analiza a fost fundamentată pe zona de amplasament și pe comparabilele utilizate în abordarea prin piață. În cadrul acestei piețe, nivelul de lichiditate este influențat de gradul de disponibilitate al proprietăților similare și de ritmul tranzacțiilor observabile pentru active comparabile, aspecte care au permis selectarea a 3 comparabile relevante pentru determinarea valorii de piață.</w:t>
         <w:br/>
         <w:br/>
-        <w:t>Din punct de vedere al raportului cerere-ofertă, datele de evaluare susțin o piață selectivă, în care cumpărătorii își fundamentează decizia pe poziționarea în zonă, suprafață și caracteristicile fizice ale imobilului, iar nivelul valorilor observate în comparabile permite o corelare cu proprietatea subiect. Valoarea terenului determinată prin comparație, de 39.52 EUR/mp, aplicată la 700 mp, conduce la o valoare de 27664.00 EUR, ceea ce confirmă existența unui reper de piață distinct pentru componenta terenului și sugerează o cerere atent raportată la preț.</w:t>
+        <w:t>Cererea se manifestă pentru proprietăți cu caracteristici apropiate de cele ale activului evaluat, respectiv teren intravilan de 700 mp și construcție cu aria utilă de 180 mp și aria construită desfășurată de 220 mp. Oferta relevantă este reprezentată de proprietăți comparabile din aceeași piață locală, utilizate pentru ajustarea și susținerea concluziei de valoare, ceea ce indică existența unor repere de piață suficiente pentru o abordare prin comparație directă. Selectarea comparabilului 0 ca reper principal în abordarea prin piață confirmă adecvarea acestui segment de piață pentru estimarea valorii.</w:t>
         <w:br/>
         <w:br/>
-        <w:t>Tendințele observate prin analiza comparabilelor utilizate arată o orientare a pieței către proprietăți care pot fi evaluate prin comparare directă, iar diferențele dintre teren și construcție impun o structurare a valorii pe componente. În acest sens, valoarea alocată construcțiilor este de 107603.00 EUR, iar rezultatul final reflectă prețul cel mai probabil de piață pentru proprietatea evaluată, în condițiile pieței analizate și ale scopului de garantare a creditului ipotecar în beneficiul Banca Comerciala Exemplu S.A.</w:t>
+        <w:t>Din perspectiva tendințelor, piața analizată prezintă un comportament specific unei piețe locale în care diferențele dintre proprietăți sunt reflectate în preț prin poziționare, caracteristici fizice și atractivitate relativă, iar evaluarea prin piață a condus la o valoare totală de 135267.00 EUR. Valoarea terenului a fost determinată prin comparație la 39.52 EUR/mp, rezultând 27664.00 EUR pentru suprafața de 700 mp, iar valoarea alocată construcțiilor este de 107603.00 EUR. În ansamblu, nivelul de lichiditate și comportamentul cerere-ofertă au fost considerate suficiente pentru susținerea concluziei de valoare în scopul garantării creditului ipotecar pentru Client demonstrativ în favoarea [BENEFICIAR] / [FINANTATOR].</w:t>
       </w:r>
     </w:p>
     <w:p>
@@ -399,13 +432,13 @@
     </w:p>
     <w:p>
       <w:r>
-        <w:t>Proprietatea analizată este identificată din punct de vedere juridic prin numerele cadastrale și de carte funciară indicate în documentația pusă la dispoziție, respectiv 2xxxx (demo) și CF xxxxx Breaza (demo), elemente ce permit individualizarea imobilului în evidențele cadastrale și de publicitate imobiliară. Evaluarea a fost efectuată pentru garantarea unui credit ipotecar, în favoarea beneficiarul/finanțator Client demonstrativ, în scopul estimării valorii de piață conform SEV 102.</w:t>
+        <w:t>Imobilul evaluat este identificat prin elementele de evidență cadastrală și de carte funciară puse la dispoziție, respectiv 2xxxx (demo) și CF xxxxx Breaza (demo), acestea reprezentând baza de individualizare juridică a proprietății în raport cu scopul evaluării. Evaluarea a fost realizată pentru garantarea creditului ipotecar, în beneficiul Banca Comerciala Exemplu S.A., având ca referință valoarea de piață conform SEV 102.</w:t>
         <w:br/>
         <w:br/>
-        <w:t>Din punct de vedere fizic, imobilul este amplasat pe un teren intravilan în suprafață de 700 mp. Terenul este aferent unei construcții cu aria utilă de 180 mp și aria construită desfășurată de 220 mp, iar anul de referință considerat este 2026. În baza datelor disponibile, terenul și construcția au fost analizate distinct, valoarea terenului fiind fundamentată prin comparație, iar valoarea construcției fiind alocată prin reconcilierea abordărilor utilizate.</w:t>
+        <w:t>Din punct de vedere fizic, proprietatea este amplasată pe un teren intravilan cu suprafața de 700 mp. Pe amplasament se află o construcție cu arie utilă de 180 mp și arie construită desfășurată de 220 mp, identificată în raport la anul de referință 2026. Regimul de înălțime și celelalte caracteristici constructive se mențin conform datelor puse la dispoziție pentru evaluare.</w:t>
         <w:br/>
         <w:br/>
-        <w:t>În urma analizei, terenul a fost evaluat la 27.664,00 EUR, rezultând dintr-un nivel de 39,52 EUR/mp aplicat suprafeței de 700 mp, iar valoarea alocată construcției este de 107.603,00 EUR. Ansamblul imobilului a fost reconciliat la valoarea de piață de 135.267,00 EUR, valoare utilizată în contextul scopului raportului. Din perspectiva caracteristicilor constructive, evaluarea prin cost a condus la o valoare a construcției de 178.735,07 EUR, pe baza unui CIB de 182.600,00, a unui Vcp de 16,00 ani și a unei deprecieri fizice de 17,27%, date utilizate exclusiv în procesul de analiză internă a valorii.</w:t>
+        <w:t>Sub aspectul descrierii economice utilizate în fundamentarea valorii, terenul a fost estimat prin comparație la 39.52 EUR/mp, rezultând o valoare de 27,664.00 EUR pentru teren, iar valoarea alocată construcției este de 107,603.00 EUR. Valoarea finală reconciliată a proprietății a fost stabilită la 135,267.00 EUR, în baza abordării prin piață.</w:t>
       </w:r>
     </w:p>
     <w:p>
@@ -428,16 +461,16 @@
     </w:p>
     <w:p>
       <w:r>
-        <w:t xml:space="preserve">Analiza celei mai bune utilizări a proprietății a fost realizată în raport cu criteriile de permisibilitate legală, posibilitate fizică, fezabilitate financiară și maximum productivitate, conform cerințelor standardelor de evaluare aplicabile. În cazul de față, proprietatea evaluată este o proprietate construită situată pe un teren de 700 mp în intravilan, având o arie utilă de 180 mp și o arie construită desfășurată de 220 mp, în anul de referință 2026. </w:t>
+        <w:t xml:space="preserve">În analiza celei mai bune utilizări, proprietatea subiect este examinată prin raportare la criteriile de permisibilitate legală, posibilitate fizică, fezabilitate financiară și maximă productivitate, conform conceptului de CMBU aplicabil în evaluare. În cazul de față, având în vedere caracteristicile proprietății evaluate și scopul raportului, utilizarea rezidențială existentă reprezintă utilizarea care răspunde în mod rezonabil cerințelor pieței și este, în absența unor informații contrare privind restricții urbanistice sau alternative superioare, cea mai probabilă soluție de exploatare. </w:t>
         <w:br/>
         <w:br/>
-        <w:t>Din punct de vedere al utilizării legale și fizice, configurația terenului și existența construcției permit continuarea utilizării rezidențiale existente, fără a rezulta din datele disponibile indicii care să susțină o schimbare de destinație mai avantajoasă. Utilizarea rezidențială este, în mod uzual, compatibilă cu o proprietate construită de acest tip și reprezintă o opțiune realistă din perspectiva pieței, întrucât răspunde criteriilor de utilizare rezonabilă și probabilă ale unui activ imobiliar.</w:t>
+        <w:t xml:space="preserve">Din punct de vedere fizic, terenul intravilan în suprafață de 700 mp și construcția cu arie utilă de 180 mp și arie construită desfășurată de 220 mp permit continuarea utilizării curente, fără a fi identificate elemente numerice care să impună o reconversie sau o reorganizare funcțională a amplasamentului. Fezabilitatea financiară a utilizării rezidențiale este susținută de faptul că valoarea finală reconciliată a proprietății, rezultată prin abordarea prin piață, este de 135267.00 EUR, iar valoarea alocată construcțiilor este de 107603.00 EUR, ceea ce indică existența unei contribuții economice a îmbunătățirilor la valoarea totală a proprietății. </w:t>
         <w:br/>
         <w:br/>
-        <w:t>Sub aspectul fezabilității financiare, analiza prin piață conduce la o valoare de 135267.00 EUR, iar analiza prin cost indică o valoare prin cost de 178735.07 EUR, obținută din CIB = 182600.00, cu depreciere fizică de 17.27%, respectiv CIN = 151071.07. De asemenea, valoarea terenului determinată prin comparație este de 27664.00 EUR pentru 700 mp, iar valoarea alocată construcției este de 107603.00 EUR; aceste rezultate susțin menținerea utilizării curente, în condițiile în care nu se evidențiază, pe baza datelor furnizate, o alternativă de exploatare care să genereze o valoare superioară și să justifice o schimbare de utilizare.</w:t>
+        <w:t xml:space="preserve">În raport cu abordarea prin cost, valoarea prin cost de 178735.07 EUR, obținută pe baza CIB de 182600.00, a duratei de viață economică de 16.00 ani și a deprecierii fizice de 17.27%, confirmă că imobilul existent are încă utilitate economică, fără a rezulta o justificare pentru o utilizare alternativă mai intensă din punct de vedere investițional. De asemenea, valoarea terenului determinată prin comparație, respectiv 39.52 EUR/mp, conduce la o valoare a terenului de 27664.00 EUR, element compatibil cu menținerea utilizării rezidențiale curente, care se dovedește astfel a fi și maxim productivă în sensul unei exploatări prudente și conforme pieței. </w:t>
         <w:br/>
         <w:br/>
-        <w:t>În consecință, cea mai bună utilizare a proprietății, în ipoteza actuală de evaluare pentru garantarea creditului ipotecar și pentru determinarea valorii de piață, este utilizarea rezidențială existentă, aceasta fiind singura utilizare susținută de datele disponibile ca fiind permisă legal, posibilă fizic, fezabilă financiar și, în lipsa unor elemente contrare, maxim productivă.</w:t>
+        <w:t>În consecință, cea mai bună utilizare a proprietății analizate este considerată utilizarea rezidențială existentă, aceasta fiind utilizarea care îndeplinește cumulativ criteriile de analiză CMBU și susține concluzia valorii de piață estimată în prezentul raport.</w:t>
       </w:r>
     </w:p>
     <w:p>
@@ -643,6 +676,11 @@
     <w:p>
       <w:r>
         <w:t>Valoarea prin comparatie de piata: 135.267 EUR.</w:t>
+      </w:r>
+    </w:p>
+    <w:p>
+      <w:r>
+        <w:t>Sursele comparabilelor au caracter indicativ (oferte de pe portaluri publice); preturile si atributele au fost verificate si retinute de evaluator pe baza rationamentului profesional.</w:t>
       </w:r>
     </w:p>
     <w:p>
@@ -1014,13 +1052,13 @@
     </w:p>
     <w:p>
       <w:r>
-        <w:t xml:space="preserve">Ajustările aplicate în grila de piață au fost stabilite astfel încât prețurile comparabile să poată fi aduse la nivelul proprietății evaluate, prin reflectarea diferențelor relevante dintre tranzacția efectivă și proprietatea subiect. În logica evaluării prin comparații directe, corecțiile se aplică asupra prețului comparabilului pentru a evidenția diferențele de localizare, caracteristici fizice, condiții de piață și, acolo unde este cazul, diferența dintre *tranzacție* și *ofertă*, astfel încât rezultatul final să exprime cea mai bună estimare a valorii de piață a proprietății evaluate. </w:t>
+        <w:t>Ajustările aplicate în grila de comparații au fost fundamentate pe diferențele dintre proprietatea evaluată și comparabile la nivelul etapei de tranzacție și al etapei de proprietate, astfel încât prețurile analizate să fie aduse la un nivel cât mai apropiat de condițiile de piață ale subiectului. În etapa de tranzacție s-au avut în vedere corecțiile care țin de natura prețului observat și de condițiile în care acesta a fost obținut, astfel încât comparația să reflecte un preț echivalent cu o tranzacție de piață și nu particularități ale ofertei sau ale negocierii. În etapa de proprietate au fost avute în vedere diferențele dintre caracteristicile fizice și economice ale comparabilelor și cele ale proprietății evaluate, respectiv terenul de 700 mp, categoria intravilan, respectiv construcția cu Au = 180 mp și Acd = 220 mp, în raport cu datele disponibile pentru fiecare comparabil.</w:t>
         <w:br/>
         <w:br/>
-        <w:t xml:space="preserve">Separarea ajustărilor în etapa de *tranzacție* și etapa de *proprietate* urmărește să distingă între corecțiile care țin de condițiile în care s-a realizat transferul dreptului de proprietate și corecțiile care țin de însușirile intrinseci ale comparabilului. Ajustările de tranzacție vizează, în esență, caracterul negocierii, condițiile vânzării și contextul pieței, în timp ce ajustările de proprietate reflectă diferențele obiective dintre imobilul comparabil și imobilul evaluat, precum suprafața, arie utilă, arie construită desfășurată, terenul aferent și alte elemente comparabile analizate în grilă. </w:t>
+        <w:t>Logica ajustărilor a urmărit ca diferențele relevante să fie tratate numai în măsura în care influențează comparabilitatea și nivelul prețului, fără a altera datele numerice utilizate în calcul. Prin urmare, comparabilul selectat a fost cel pentru care cumulul diferențelor față de proprietatea subiect a condus la cea mai redusă ajustare brută, ceea ce indică cel mai bun grad de similitudine economică și fizică dintre cele trei comparabile analizate. Într-o abordare prin piață, un comparabil cu ajustare brută minimă este preferat deoarece necesită cele mai puține corecții și, implicit, oferă cea mai directă reflectare a comportamentului pieței pentru proprietatea evaluată.</w:t>
         <w:br/>
         <w:br/>
-        <w:t>Comparabilul selectat a fost cel cu ajustarea brută minimă deoarece acesta a necesitat cele mai mici corecții totale pentru a deveni comparabil cu proprietatea evaluată, ceea ce indică cel mai înalt grad de asemănare față de subiect și, implicit, cea mai bună relevanță pentru estimarea valorii. În consecință, comparabilul cu ajustarea brută minimă a primit ponderea cea mai mare în reconcilierea valorilor, întrucât necesarul redus de corecții este un indicator al calității superioare a comparației și al încrederii mai mari în informațiile de piață utilizate.</w:t>
+        <w:t>Selecția comparabilului cu ajustarea brută minimă este susținută și de faptul că el prezintă cele mai mici deviații cumulate față de caracteristicile esențiale ale subiectului, astfel încât estimarea valorii să fie dominată de date de piață și nu de ajustări de corecție. În acest context, valoarea de piață rezultată prin abordarea prin piață, de 135267.00 EUR, este derivată din comparabilul care a oferit cea mai bună potrivire globală, iar separarea valorii terenului, de 27664.00 EUR, și a valorii construcțiilor alocate, de 107603.00 EUR, confirmă coerența logicii de analiză utilizate.</w:t>
       </w:r>
     </w:p>
     <w:p>
@@ -1043,18 +1081,21 @@
     </w:p>
     <w:p>
       <w:r>
-        <w:t>În urma aplicării abordărilor de evaluare considerate adecvate scopului raportului, s-au obținut indicații diferite ale valorii. Abordarea prin cost a condus la o valoare de 178735.07 EUR, determinată pe baza costului brut de înlocuire de 182600.00 EUR, a vârstei economice de 16.00 ani, a deprecierii fizice de 17.27% și a costului net de înlocuire de 151071.07 EUR. Abordarea prin piață a furnizat o valoare de 135267.00 EUR, pe baza comparației cu 3 comparabile, fiind selectat comparabilul cu index 0; pentru teren, analiza comparativă a condus la un nivel de 39.52 EUR/mp, aplicat la suprafața de 700 mp, rezultând 27664.00 EUR, iar valoarea alocată construcției este de 107603.00 EUR.</w:t>
+        <w:t>În urma aplicării abordărilor de evaluare considerate relevante pentru scopul raportului, s-au obținut indicații diferite asupra valorii proprietății. Abordarea prin cost a condus la o valoare de 178735.07 EUR, rezultată din CIB de 182600.00 EUR, cu o viață economică probabilă de 16.00 ani și o depreciere fizică de 17.27%, ceea ce evidențiază costul depreciat al construcției în condițiile pieței curente.</w:t>
         <w:br/>
         <w:br/>
-        <w:t>Diferența dintre cele două rezultate reflectă natura distinctă a celor două abordări. Abordarea prin cost exprimă în principal o indicație tehnică a valorii, derivată din costul de refacere al proprietății, ajustat cu deprecierea estimată, în timp ce abordarea prin piață surprinde mai fidel comportamentul tranzacțional observat pentru proprietăți comparabile și este, în contextul de față, mai relevantă pentru estimarea valorii de piață în sensul SEV 102. Având în vedere scopul evaluării, respectiv garantarea creditului ipotecar, și disponibilitatea unui set de comparații de piață, metoda pieței a fost considerată preponderentă în reconciliere.</w:t>
+        <w:t>Abordarea prin piață a fost fundamentată pe comparația cu trei comparabile, iar comparabilul selectat a fost cel de la index 0, conducând la o valoare de 135267.00 EUR pentru întregul imobil. Pentru teren, analiza prin comparație a indicat o valoare unitară de 39.52 EUR/mp, respectiv 27664.00 EUR pentru 700 mp, pe baza comparabilului selectat de la index 2 dintre cele 3 comparabile analizate. Prin alocare, valoarea aferentă construcțiilor a fost stabilită la 107603.00 EUR.</w:t>
         <w:br/>
         <w:br/>
-        <w:t>În consecință, rezultatul final reconciliat a fost stabilit la 135267.00 EUR, valoare adoptată din abordarea prin piață și considerată cea mai reprezentativă pentru proprietatea evaluată la data de referință 2026. Această valoare exprimă opinia evaluatorului asupra valorii de piață a imobilului identificat prin 2xxxx (demo) și CF xxxxx Breaza (demo), pentru beneficiarul / finantatorul Banca Comerciala Exemplu S.A..</w:t>
+        <w:t>În reconcilierea rezultatelor, abordarea prin piață a fost considerată mai reprezentativă pentru estimarea valorii de piață în sensul SEV 102, întrucât reflectă direct comportamentul pieței pentru proprietăți comparabile și este susținută de datele disponibile privind terenul și construcțiile. Abordarea prin cost are rol de control și de verificare a plauzibilității rezultatului, însă, pentru scopul garantării creditului ipotecar și în condițiile datelor analizate, ponderea determinantă a fost atribuită abordării prin piață.</w:t>
+        <w:br/>
+        <w:br/>
+        <w:t>Pe această bază, valoarea finală reconciliată a proprietății imobiliare este de 135267.00 EUR, valoare estimată ca valoare de piață, pentru beneficiar / finantator Banca Comerciala Exemplu S.A..</w:t>
       </w:r>
     </w:p>
     <w:p>
       <w:r>
-        <w:t>Valoarea finala: 135.267 EUR. Valoarea nu contine TVA.</w:t>
+        <w:t>Valoarea finala: 135.267 EUR (echivalent ~672.953 LEI la cursul BNR 4.9750). Valoarea nu contine TVA.</w:t>
       </w:r>
     </w:p>
     <w:p>
@@ -1199,16 +1240,16 @@
     </w:p>
     <w:p>
       <w:r>
-        <w:t>Perioada de menținere a garanției impune aprecierea capacității imobilului de a-și conserva valoarea de piață și de a putea fi valorificat într-un interval rezonabil, în condițiile pieței locale. Conform cerințelor GEV 520, analiza include activitatea curentă și tendințele pieței relevante, precum și cererea anterioară, curentă și viitoare pentru tipul de bun și pentru localizare, elemente care au fost avute în vedere la stabilirea valorii de piață de 135267.00 EUR, prin abordarea prin piață, pe baza a 3 comparabile, cu valoarea terenului estimată la 39.52 EUR/mp pentru 700 mp și valoarea alocată construcției de 107603.00 EUR.</w:t>
+        <w:t>Riscul asociat garanției a fost analizat având în vedere cerințele GEV 520, Anexa A5, prin raportare la factorii relevanți pentru performanța garanției pe perioada creditului, respectiv activitatea curentă și tendințele pieței relevante, cererea pentru tipul de bun și localizare, posibilitățile de utilizare alternativă și evenimentele previzibile care pot influența valoarea viitoare a proprietății. Imobilul evaluat, cu teren intravilan de 700 mp, arie utilă de 180 mp și arie construită desfășurată de 220 mp, este destinat garantării unui credit ipotecar, iar valoarea de piață estimată de 135267.00 EUR reflectă condițiile curente ale pieței și interesul observat pentru proprietăți similare în zona analizată.</w:t>
         <w:br/>
         <w:br/>
-        <w:t>Din perspectiva cererii, proprietatea analizată, având teren intravilan de 700 mp și arie utilă de 180 mp, se înscrie în categoria bunurilor rezidențiale care, în mod uzual, beneficiază de o piață activă atunci când localizarea și caracteristicile constructive sunt compatibile cu preferințele cumpărătorilor. Cererea anterioară și curentă pentru astfel de proprietăți susține, în principiu, vandabilitatea bunului, iar cererea viitoare depinde de menținerea atractivității zonei, de evoluția pieței imobiliare locale și de capacitatea proprietății de a răspunde utilizărilor rezidențiale curente.</w:t>
+        <w:t>În raport cu activitatea curentă și tendințele pieței, abordarea prin piață a fost cea care a fundamentat valoarea reconciliată, utilizând un număr de 3 comparabile pentru proprietate și comparabilul selectat pentru teren, la un nivel de 39.52 EUR/mp pentru teren, rezultând o valoare alocată terenului de 27664.00 EUR și o valoare alocată construcției de 107603.00 EUR. Această structură a valorii indică o piață funcțională pentru bunuri imobiliare de tipul celui evaluat, cu lichiditate moderată și cu posibilitatea de valorificare într-un interval rezonabil de timp, în condițiile unei comercializări corecte și ale menținerii parametrilor actuali de amplasament, utilitate și stare fizică.</w:t>
         <w:br/>
         <w:br/>
-        <w:t xml:space="preserve">În ceea ce privește cererea pentru alte utilizări, imobilul are, în principal, o utilitate rezidențială, iar posibilitățile de conversie spre alte destinații trebuie privite prin prisma reglementărilor urbanistice, a dimensiunii terenului și a cererii de piață pentru asemenea alternative. Evenimentele previzibile care pot influența valoarea viitoare a garanției includ modificările generale ale pieței imobiliare, ale condițiilor de finanțare și ale preferințelor cumpărătorilor, precum și eventuale schimbări de context local care pot afecta viteza de valorificare sau nivelul prețurilor. </w:t>
+        <w:t>Cererea anterioară, curentă și anticipată pentru acest tip de bun și pentru localizare este apreciată ca fiind susținută de utilizarea rezidențială și de caracteristicile intravilane ale terenului, însă nivelul efectiv al lichidității depinde de evoluția generală a pieței imobiliare, de condițiile de finanțare și de preferințele cumpărătorilor din segmentul relevant. Cererea pentru alte utilizări este limitată de caracteristicile fizice și urbanistice ale proprietății, astfel încât adaptabilitatea la utilizări alternative poate exista, dar nu poate fi tratată ca principal motor de valoare fără informații suplimentare specifice pieței și reglementărilor locale. Evenimentele previzibile, precum modificări ale condițiilor economice, ale costurilor de finanțare sau ale cererii regionale, pot influența valoarea viitoare, însă, la data evaluării, nu se identifică elemente care să conducă la o vulnerabilitate neobișnuită a garanției.</w:t>
         <w:br/>
         <w:br/>
-        <w:t>Pe baza valorii de piață determinate și a caracteristicilor fizice și funcționale prezentate, garanția poate fi apreciată ca având un grad de adecvare corespunzător pentru scopul garantării creditului ipotecar, cu o lichiditate și o vandabilitate dependente de menținerea condițiilor normale de piață. Valoarea rezultată reprezintă baza de analiză pentru creditor, iar performanța garanției pe perioada creditului trebuie urmărită în raport cu evoluția efectivă a pieței și cu eventualele schimbări ale cererii pentru acest tip de proprietate.</w:t>
+        <w:t>Având în vedere valoarea de piață determinată, structura fizică a proprietății și rezultatul analizei comparative, garanția prezintă un grad de adecvare corespunzător pentru scopul declarat, fiind considerată vandabilă și aptă să susțină recuperarea creanței în condiții obișnuite de piață. Evaluarea confirmă că proprietatea oferă creditorului un activ real, cu comportament de piață identificabil și cu perspectivă rezonabilă de valorificare pe durata creditului, fără a elimina însă riscul de piață inerent oricărei garanții imobiliare.</w:t>
       </w:r>
     </w:p>
     <w:p>
@@ -1384,7 +1425,12 @@
     </w:p>
     <w:p>
       <w:r>
-        <w:t>Anexa 3 — Documente cadastrale, extras CF si acte juridice [de atasat].</w:t>
+        <w:t>Anexa 3 — Documente cadastrale, extras CF si acte juridice:</w:t>
+      </w:r>
+    </w:p>
+    <w:p>
+      <w:r>
+        <w:t>[de atasat].</w:t>
       </w:r>
     </w:p>
     <w:p>

</xml_diff>

<commit_message>
docs: regenerare raport Breaza + prezentare (cod la zi)
- exemplu-raport-breaza.docx: regenerat cu citarea SEV 103/105 (A3.1) + formatare
  ro-RO; comparabile reale, valoare finala 135.267 EUR.
- prezentare-aplicatie.pptx: 12 slide-uri, regenerate.

Co-Authored-By: Claude Opus 4.8 (1M context) <noreply@anthropic.com>
</commit_message>
<xml_diff>
--- a/docs/exemplu-raport-breaza.docx
+++ b/docs/exemplu-raport-breaza.docx
@@ -121,7 +121,7 @@
     </w:p>
     <w:p>
       <w:r>
-        <w:t>Raportul a fost elaborat in conformitate cu Standardele de evaluare a bunurilor ANEVAR, editia 2025 (in vigoare de la 1 iulie 2025, aprobate prin HCN nr. 2/2025), si cu Ghidul GEV 520 — Evaluarea pentru garantarea imprumutului. Poate fi utilizat exclusiv in scopul mentionat, de catre utilizatorul desemnat.</w:t>
+        <w:t>Raportul a fost elaborat in conformitate cu Standardele de evaluare a bunurilor ANEVAR, editia 2025 (in vigoare de la 1 iulie 2025, aprobate prin HCN nr. 2/2025) si cu Ghidul GEV 520 — Evaluarea pentru garantarea imprumutului. Poate fi utilizat exclusiv in scopul mentionat, de catre utilizatorul desemnat.</w:t>
       </w:r>
     </w:p>
     <w:p>
@@ -361,16 +361,16 @@
     </w:p>
     <w:p>
       <w:r>
-        <w:t>Ipotezele și condițiile limitative ale prezentului raport au fost formulate în conformitate cu SEV și cu scopul declarat al evaluării, respectiv garantarea creditului ipotecar. Se presupune că dreptul de proprietate asupra imobilului evaluat este valabil, opozabil și liber de sarcini, cu excepția eventualelor sarcini sau limitări care au fost menționate în documentele puse la dispoziția evaluatorului și care au fost avute în vedere la elaborarea raportului.</w:t>
+        <w:t>Ipotezele și condițiile limitative care fundamentează prezentul raport sunt cele uzuale unei misiuni de evaluare realizate în conformitate cu SEV, pentru scopul declarat al evaluării, respectiv garantarea creditului ipotecar. Raportul are ca obiect estimarea valorii de piață a proprietății imobiliare, exprimată în EUR, iar utilizarea lui este limitată exclusiv la scopul indicat de beneficiar și finanțator, respectiv Banca Comerciala Exemplu S.A.; orice altă utilizare, totală sau parțială, în afara acestui context, nu este permisă.</w:t>
         <w:br/>
         <w:br/>
-        <w:t>Se consideră că imobilul are o structură de rezistență corespunzătoare, că elementele constructive și instalațiile se află într-o stare compatibilă cu exploatarea normală și că nu există vicii ascunse, degradări neobservabile sau alte defecte care ar putea influența valoarea, în absența unor investigații de specialitate. De asemenea, raportul nu include investigații tehnice ascunse, expertize structurale, studii geotehnice, verificări de laborator sau alte analize care depășesc sfera unei inspecții de evaluare și a documentației disponibile.</w:t>
+        <w:t>Se presupune, în lipsa unor informații contrare comunicate evaluatorului, că dreptul de proprietate este valabil, opozabil și liber de sarcini, cu excepția eventualelor mențiuni exprimate în mod explicit în documentele puse la dispoziție. De asemenea, se consideră că imobilul analizat are structura de rezistență corespunzătoare, că nu există vicii ascunse, defecte structurale sau degradări care nu pot fi identificate prin inspecția efectuată, și că nu există situații tehnice ori juridice care să afecteze semnificativ valoarea și care să nu fi fost aduse la cunoștința evaluatorului.</w:t>
         <w:br/>
         <w:br/>
-        <w:t>Suprafața terenului, categoria de folosință, ariile construite și celelalte date numerice utilizate în raport au fost preluate exclusiv din informațiile furnizate și au fost considerate corecte și complete în limitele mandatului primit. Evaluarea a fost realizată pentru un imobil cu teren de 700 mp, intravilan, și construcție cu Au de 180 mp și Acd de 220 mp, în condițiile anului de referință 2026, fără a se efectua măsurători independente ori verificări cadastrale suplimentare.</w:t>
+        <w:t>Nu s-au efectuat investigații de specialitate de natură geotehnică, expertize structurale distructive sau alte verificări invazive asupra elementelor ascunse ale construcției ori terenului. Prin urmare, orice apreciere privind condițiile din fundație, terenul de fundare, instalațiile ascunse sau alte componente inaccesibile este formulată pe baza informațiilor disponibile și a inspecției vizuale, fără garantarea existenței unor condiții nedeclarate.</w:t>
         <w:br/>
         <w:br/>
-        <w:t>Prezentul raport poate fi utilizat exclusiv în scopul declarat și de către beneficiarul/finanțatorul Banca Comerciala Exemplu S.A., pentru obiectivul evaluării stabilit în misiune. Orice utilizare parțială, în alt scop, în alt context sau de către alte persoane decât cele pentru care a fost întocmit raportul, fără acordul evaluatorului, poate conduce la concluzii neadecvate și nu intră în responsabilitatea evaluatorului.</w:t>
+        <w:t>Datele numerice utilizate în raport sunt cele furnizate pentru această misiune, inclusiv suprafața terenului de 700 mp, categoria de intravilan, arie utilă de 180 mp, arie construită desfășurată de 220 mp și anul de referință 2026. Orice concluzie, estimare sau alocare de valoare din raport se bazează exclusiv pe aceste date și pe informațiile comparabile disponibile, fără extinderea analizei dincolo de limitele informaționale ale misiunii.</w:t>
       </w:r>
     </w:p>
     <w:p>
@@ -393,13 +393,13 @@
     </w:p>
     <w:p>
       <w:r>
-        <w:t>Piața imobiliară locală relevantă pentru proprietatea evaluată este caracterizată de o formare a prețului prin interacțiunea dintre cerere și ofertă, iar analiza a fost fundamentată pe zona de amplasament și pe comparabilele utilizate în abordarea prin piață. În cadrul acestei piețe, nivelul de lichiditate este influențat de gradul de disponibilitate al proprietăților similare și de ritmul tranzacțiilor observabile pentru active comparabile, aspecte care au permis selectarea a 3 comparabile relevante pentru determinarea valorii de piață.</w:t>
+        <w:t>Piața imobiliară locală relevantă pentru proprietatea evaluată este o piață de dimensiune limitată, în care valoarea de piață a fost fundamentată prin analiza comparabilelor disponibile și prin corelarea acestora cu caracteristicile proprietății subiect. În contextul evaluării pentru garantarea creditului ipotecar, cererea este susținută de interesul pentru proprietăți similare, iar oferta este reprezentată de proprietăți comparabile identificate pe piața locală, suficiente pentru aplicarea abordării prin piață și pentru estimarea valorii terenului prin comparație.</w:t>
         <w:br/>
         <w:br/>
-        <w:t>Cererea se manifestă pentru proprietăți cu caracteristici apropiate de cele ale activului evaluat, respectiv teren intravilan de 700 mp și construcție cu aria utilă de 180 mp și aria construită desfășurată de 220 mp. Oferta relevantă este reprezentată de proprietăți comparabile din aceeași piață locală, utilizate pentru ajustarea și susținerea concluziei de valoare, ceea ce indică existența unor repere de piață suficiente pentru o abordare prin comparație directă. Selectarea comparabilului 0 ca reper principal în abordarea prin piață confirmă adecvarea acestui segment de piață pentru estimarea valorii.</w:t>
+        <w:t>Din analiza comparabilelor utilizate rezultă că piața prezintă un grad de lichiditate moderată, cu posibilitatea de identificare a unor tranzacții sau oferte relevante, dar cu un număr redus de repere direct comparabile. Alegerea a 3 comparabile pentru abordarea prin piață și a 3 comparabile pentru teren indică existența unor informații de piață utilizabile, însă nu într-un volum foarte mare, ceea ce impune o selecție atentă și ajustarea comparabilelor în funcție de suprafață, amplasament și caracteristicile tehnice ale proprietății.</w:t>
         <w:br/>
         <w:br/>
-        <w:t>Din perspectiva tendințelor, piața analizată prezintă un comportament specific unei piețe locale în care diferențele dintre proprietăți sunt reflectate în preț prin poziționare, caracteristici fizice și atractivitate relativă, iar evaluarea prin piață a condus la o valoare totală de 135267.00 EUR. Valoarea terenului a fost determinată prin comparație la 39.52 EUR/mp, rezultând 27664.00 EUR pentru suprafața de 700 mp, iar valoarea alocată construcțiilor este de 107603.00 EUR. În ansamblu, nivelul de lichiditate și comportamentul cerere-ofertă au fost considerate suficiente pentru susținerea concluziei de valoare în scopul garantării creditului ipotecar pentru Client demonstrativ în favoarea [BENEFICIAR] / [FINANTATOR].</w:t>
+        <w:t>Tendințele rezultate din comparația datelor de piață indică o poziționare a proprietății într-un segment în care prețurile sunt influențate în principal de raportul cerere-ofertă și de caracteristicile individuale ale imobilului. Valoarea finală reconcilată, stabilită prin abordarea prin piață la 135267.00 EUR, susține concluzia că piața locală permite formarea unui preț credibil pe baza comparabilelor disponibile, iar valoarea terenului rezultată din comparație, de 39.52 EUR/mp, confirmă existența unor repere de piață utile pentru fundamentarea estimării.</w:t>
       </w:r>
     </w:p>
     <w:p>
@@ -432,13 +432,13 @@
     </w:p>
     <w:p>
       <w:r>
-        <w:t>Imobilul evaluat este identificat prin elementele de evidență cadastrală și de carte funciară puse la dispoziție, respectiv 2xxxx (demo) și CF xxxxx Breaza (demo), acestea reprezentând baza de individualizare juridică a proprietății în raport cu scopul evaluării. Evaluarea a fost realizată pentru garantarea creditului ipotecar, în beneficiul Banca Comerciala Exemplu S.A., având ca referință valoarea de piață conform SEV 102.</w:t>
+        <w:t>Imobilul analizat este identificat prin numărul cadastral 2xxxx (demo) și este înscris în cartea funciară CF xxxxx Breaza (demo), proprietatea fiind individualizată în evidențele de publicitate imobiliară aferente. Din punct de vedere juridic, descrierea de față are la bază identificarea cadastrală și intabularea corespunzătoare, proprietatea fiind considerată în contextul transmiterii sau garantării unui drept real asupra imobilului, pentru beneficiarul / finanțatorul Banca Comerciala Exemplu S.A.</w:t>
         <w:br/>
         <w:br/>
-        <w:t>Din punct de vedere fizic, proprietatea este amplasată pe un teren intravilan cu suprafața de 700 mp. Pe amplasament se află o construcție cu arie utilă de 180 mp și arie construită desfășurată de 220 mp, identificată în raport la anul de referință 2026. Regimul de înălțime și celelalte caracteristici constructive se mențin conform datelor puse la dispoziție pentru evaluare.</w:t>
+        <w:t>Din punct de vedere fizic, proprietatea este amplasată pe un teren intravilan în suprafață de 700 mp. Terenul aferent imobilului reprezintă suportul funcțional al construcției și este evaluat în contextul amplasamentului și al utilizării sale curente, în cadrul abordării prin piață.</w:t>
         <w:br/>
         <w:br/>
-        <w:t>Sub aspectul descrierii economice utilizate în fundamentarea valorii, terenul a fost estimat prin comparație la 39.52 EUR/mp, rezultând o valoare de 27,664.00 EUR pentru teren, iar valoarea alocată construcției este de 107,603.00 EUR. Valoarea finală reconciliată a proprietății a fost stabilită la 135,267.00 EUR, în baza abordării prin piață.</w:t>
+        <w:t>Construcția existentă are o arie utilă de 180 mp și o arie construită desfășurată de 220 mp, fiind realizată în anul de referință 2026. Imobilul este analizat ca ansamblu teren + construcție, valoarea de piață fiind stabilită prin reconciliere la 135267.00 EUR, din care valoarea alocată terenului este de 27664.00 EUR, iar valoarea alocată construcției este de 107603.00 EUR.</w:t>
       </w:r>
     </w:p>
     <w:p>
@@ -461,16 +461,13 @@
     </w:p>
     <w:p>
       <w:r>
-        <w:t xml:space="preserve">În analiza celei mai bune utilizări, proprietatea subiect este examinată prin raportare la criteriile de permisibilitate legală, posibilitate fizică, fezabilitate financiară și maximă productivitate, conform conceptului de CMBU aplicabil în evaluare. În cazul de față, având în vedere caracteristicile proprietății evaluate și scopul raportului, utilizarea rezidențială existentă reprezintă utilizarea care răspunde în mod rezonabil cerințelor pieței și este, în absența unor informații contrare privind restricții urbanistice sau alternative superioare, cea mai probabilă soluție de exploatare. </w:t>
+        <w:t>Analiza celei mai bune utilizări a proprietății s-a realizat având în vedere criteriile de permisibilitate legală, posibilitate fizică, fezabilitate financiară și maximă productivitate, conform conceptului CMBU din standardele de evaluare. În absența unor informații care să indice o oportunitate superioară de reconversie, utilizarea existentă rezidențială este considerată, în ipotezele prezentei evaluări, utilizarea care îndeplinește cel mai probabil aceste criterii și care susține determinarea valorii de piață pentru scopul garantării creditului ipotecar.</w:t>
         <w:br/>
         <w:br/>
-        <w:t xml:space="preserve">Din punct de vedere fizic, terenul intravilan în suprafață de 700 mp și construcția cu arie utilă de 180 mp și arie construită desfășurată de 220 mp permit continuarea utilizării curente, fără a fi identificate elemente numerice care să impună o reconversie sau o reorganizare funcțională a amplasamentului. Fezabilitatea financiară a utilizării rezidențiale este susținută de faptul că valoarea finală reconciliată a proprietății, rezultată prin abordarea prin piață, este de 135267.00 EUR, iar valoarea alocată construcțiilor este de 107603.00 EUR, ceea ce indică existența unei contribuții economice a îmbunătățirilor la valoarea totală a proprietății. </w:t>
+        <w:t>Din punct de vedere fizic, proprietatea dispune de un teren intravilan de 700 mp și o construcție cu arie utilă de 180 mp și arie construită desfășurată de 220 mp, configurare care este compatibilă cu exploatarea rezidențială curentă. Din punct de vedere legal, în lipsa unor restricții cunoscute care să impună o altă destinație, utilizarea rezidențială este prezumată permisă. Din punct de vedere economic, abordarea prin piață indică o valoare de 135267.00 EUR, iar analiza prin cost conduce la o valoare prin cost de 178735.07 EUR, însă valoarea de piață reconcilată este cea relevantă în contextul CMBU, fiind susținută de comportamentul pieței pentru proprietăți comparabile.</w:t>
         <w:br/>
         <w:br/>
-        <w:t xml:space="preserve">În raport cu abordarea prin cost, valoarea prin cost de 178735.07 EUR, obținută pe baza CIB de 182600.00, a duratei de viață economică de 16.00 ani și a deprecierii fizice de 17.27%, confirmă că imobilul existent are încă utilitate economică, fără a rezulta o justificare pentru o utilizare alternativă mai intensă din punct de vedere investițional. De asemenea, valoarea terenului determinată prin comparație, respectiv 39.52 EUR/mp, conduce la o valoare a terenului de 27664.00 EUR, element compatibil cu menținerea utilizării rezidențiale curente, care se dovedește astfel a fi și maxim productivă în sensul unei exploatări prudente și conforme pieței. </w:t>
-        <w:br/>
-        <w:br/>
-        <w:t>În consecință, cea mai bună utilizare a proprietății analizate este considerată utilizarea rezidențială existentă, aceasta fiind utilizarea care îndeplinește cumulativ criteriile de analiză CMBU și susține concluzia valorii de piață estimată în prezentul raport.</w:t>
+        <w:t>În raport cu datele disponibile, nu rezultă elemente care să justifice o utilizare alternativă care să producă o valoare superioară celei aferente utilizării rezidențiale existente. Valoarea terenului determinată prin comparație, de 39.52 EUR/mp, respectiv 27664.00 EUR pentru terenul evaluat, iar valoarea alocată construcțiilor de 107603.00 EUR, confirmă faptul că ansamblul proprietății funcționează ca o proprietate rezidențială completă, iar utilizarea actuală este cea care maximizează în mod rezonabil valoarea în ipotezele și condițiile analizate.</w:t>
       </w:r>
     </w:p>
     <w:p>
@@ -489,6 +486,11 @@
           <w:sz w:val="17"/>
         </w:rPr>
         <w:t>▮ NOTA DEMO — [CALCULAT] Grilele (teren + casa) si costul CIN sunt calculate real de motor. [EXTRAS] Preturile/suprafetele comparabilelor sunt reale (din anunturi). [EXEMPLU] Ajustarile din grila sunt demonstrative — de stabilit de evaluator la inspectie.</w:t>
+      </w:r>
+    </w:p>
+    <w:p>
+      <w:r>
+        <w:t>Abordările și metodele aplicate respectă SEV 103 „Abordări în evaluare” și SEV 105 „Modele de evaluare” (echivalente IVS 103/IVS 105). Selecția abordării este justificată în reconcilierea de la capitolul 7.</w:t>
       </w:r>
     </w:p>
     <w:p>
@@ -1052,13 +1054,13 @@
     </w:p>
     <w:p>
       <w:r>
-        <w:t>Ajustările aplicate în grila de comparații au fost fundamentate pe diferențele dintre proprietatea evaluată și comparabile la nivelul etapei de tranzacție și al etapei de proprietate, astfel încât prețurile analizate să fie aduse la un nivel cât mai apropiat de condițiile de piață ale subiectului. În etapa de tranzacție s-au avut în vedere corecțiile care țin de natura prețului observat și de condițiile în care acesta a fost obținut, astfel încât comparația să reflecte un preț echivalent cu o tranzacție de piață și nu particularități ale ofertei sau ale negocierii. În etapa de proprietate au fost avute în vedere diferențele dintre caracteristicile fizice și economice ale comparabilelor și cele ale proprietății evaluate, respectiv terenul de 700 mp, categoria intravilan, respectiv construcția cu Au = 180 mp și Acd = 220 mp, în raport cu datele disponibile pentru fiecare comparabil.</w:t>
+        <w:t>Ajustările din grila de comparații au fost aplicate diferențiat, în funcție de etapa de analiză: la tranzacție s-au corectat diferențele ce țin de prețul observat în piață și condițiile vânzării/comparării, iar la proprietate s-au operat ajustările pentru caracteristicile intrinseci ale activului evaluat, astfel încât comparabilele să fie aduse la un nivel cât mai apropiat de proprietatea subiect. Această separare este coerentă cu abordarea prin piață, care urmărește estimarea prețului cel mai probabil prin compararea cu active similare, pe baza unor intrări observabile și a condițiilor pieței.</w:t>
         <w:br/>
         <w:br/>
-        <w:t>Logica ajustărilor a urmărit ca diferențele relevante să fie tratate numai în măsura în care influențează comparabilitatea și nivelul prețului, fără a altera datele numerice utilizate în calcul. Prin urmare, comparabilul selectat a fost cel pentru care cumulul diferențelor față de proprietatea subiect a condus la cea mai redusă ajustare brută, ceea ce indică cel mai bun grad de similitudine economică și fizică dintre cele trei comparabile analizate. Într-o abordare prin piață, un comparabil cu ajustare brută minimă este preferat deoarece necesită cele mai puține corecții și, implicit, oferă cea mai directă reflectare a comportamentului pieței pentru proprietatea evaluată.</w:t>
+        <w:t>Logica aplicării ajustărilor este una de omogenizare succesivă a datelor de piață: întâi se elimină efectele particulare ale tranzacției, apoi se ajustează diferențele de proprietate relevante pentru utilizare, dimensiune și caracteristicile care influențează direct percepția cumpărătorului. În acest mod, valoarea estimată reflectă mai bine comportamentul pieței pentru un activ cu utilitate comparabilă, fără a introduce distorsiuni generate de elemente nereprezentative ale fiecărei tranzacții analizate.</w:t>
         <w:br/>
         <w:br/>
-        <w:t>Selecția comparabilului cu ajustarea brută minimă este susținută și de faptul că el prezintă cele mai mici deviații cumulate față de caracteristicile esențiale ale subiectului, astfel încât estimarea valorii să fie dominată de date de piață și nu de ajustări de corecție. În acest context, valoarea de piață rezultată prin abordarea prin piață, de 135267.00 EUR, este derivată din comparabilul care a oferit cea mai bună potrivire globală, iar separarea valorii terenului, de 27664.00 EUR, și a valorii construcțiilor alocate, de 107603.00 EUR, confirmă coerența logicii de analiză utilizate.</w:t>
+        <w:t>Comparabilul selectat are ajustarea brută minimă deoarece este cel mai apropiat de proprietatea evaluată în ansamblul caracteristicilor relevante folosite în grilă, ceea ce a redus amplitudinea corecțiilor necesare pentru aducerea la echivalență. În consecință, comparabilul cu cel mai mic volum de ajustări brute a oferit cea mai bună indicație de piață și a fost selectat pentru reconciliarea finală a valorii prin metoda comparațiilor.</w:t>
       </w:r>
     </w:p>
     <w:p>
@@ -1081,16 +1083,13 @@
     </w:p>
     <w:p>
       <w:r>
-        <w:t>În urma aplicării abordărilor de evaluare considerate relevante pentru scopul raportului, s-au obținut indicații diferite asupra valorii proprietății. Abordarea prin cost a condus la o valoare de 178735.07 EUR, rezultată din CIB de 182600.00 EUR, cu o viață economică probabilă de 16.00 ani și o depreciere fizică de 17.27%, ceea ce evidențiază costul depreciat al construcției în condițiile pieței curente.</w:t>
+        <w:t>În fundamentarea concluziei asupra valorii, s-au avut în vedere rezultatele obținute prin abordarea prin piață și abordarea prin cost, în conformitate cu cerința de reconciliere a rezultatelor și de selectare a valorii celei mai potrivite scopului evaluării. Pentru proprietatea evaluată în scopul garantării creditului ipotecar, tipul valorii estimat este valoarea de piață, exprimată în EUR, iar concluzia finală reflectă indicatorul considerat cel mai relevant pentru condițiile concrete ale proprietății și pentru utilizarea preconizată a raportului.</w:t>
         <w:br/>
         <w:br/>
-        <w:t>Abordarea prin piață a fost fundamentată pe comparația cu trei comparabile, iar comparabilul selectat a fost cel de la index 0, conducând la o valoare de 135267.00 EUR pentru întregul imobil. Pentru teren, analiza prin comparație a indicat o valoare unitară de 39.52 EUR/mp, respectiv 27664.00 EUR pentru 700 mp, pe baza comparabilului selectat de la index 2 dintre cele 3 comparabile analizate. Prin alocare, valoarea aferentă construcțiilor a fost stabilită la 107603.00 EUR.</w:t>
+        <w:t>Abordarea prin cost a condus la o valoare estimată de 178735.07 EUR, rezultată din costul brut de înlocuire de 182600.00 EUR, din care s-a dedus deprecierea fizică de 17.27%, obținându-se costul de înlocuire depreciat de 151071.07 EUR, la care s-a adăugat valoarea terenului determinată prin comparație, respectiv 27664.00 EUR. Această abordare oferă o indicație utilă asupra valorii tehnice a proprietății, însă rezultatul său se situează peste nivelul evidențiat de piață, ceea ce impune acordarea unei ponderi mai reduse în reconciliere.</w:t>
         <w:br/>
         <w:br/>
-        <w:t>În reconcilierea rezultatelor, abordarea prin piață a fost considerată mai reprezentativă pentru estimarea valorii de piață în sensul SEV 102, întrucât reflectă direct comportamentul pieței pentru proprietăți comparabile și este susținută de datele disponibile privind terenul și construcțiile. Abordarea prin cost are rol de control și de verificare a plauzibilității rezultatului, însă, pentru scopul garantării creditului ipotecar și în condițiile datelor analizate, ponderea determinantă a fost atribuită abordării prin piață.</w:t>
-        <w:br/>
-        <w:br/>
-        <w:t>Pe această bază, valoarea finală reconciliată a proprietății imobiliare este de 135267.00 EUR, valoare estimată ca valoare de piață, pentru beneficiar / finantator Banca Comerciala Exemplu S.A..</w:t>
+        <w:t>Abordarea prin piață a fost considerată predominantă, întrucât se bazează direct pe comportamentul pieței și pe compararea cu un număr de 3 comparabile, dintre care a fost selectat comparabilul cu index 0 pentru estimarea valorii totale, respectiv 135267.00 EUR. În cadrul analizei terenului, valoarea de 39.52 EUR/mp aplicată suprafeței de 700 mp a condus la valoarea terenului de 27664.00 EUR, iar valoarea alocată construcțiilor a fost de 107603.00 EUR. Având în vedere scopul evaluării, tipul valorii urmărit și relevanța superioară a datelor de piață pentru proprietatea analizată, valoarea finală reconciliată este stabilită la 135267.00 EUR, prin metoda pieței.</w:t>
       </w:r>
     </w:p>
     <w:p>
@@ -1240,16 +1239,16 @@
     </w:p>
     <w:p>
       <w:r>
-        <w:t>Riscul asociat garanției a fost analizat având în vedere cerințele GEV 520, Anexa A5, prin raportare la factorii relevanți pentru performanța garanției pe perioada creditului, respectiv activitatea curentă și tendințele pieței relevante, cererea pentru tipul de bun și localizare, posibilitățile de utilizare alternativă și evenimentele previzibile care pot influența valoarea viitoare a proprietății. Imobilul evaluat, cu teren intravilan de 700 mp, arie utilă de 180 mp și arie construită desfășurată de 220 mp, este destinat garantării unui credit ipotecar, iar valoarea de piață estimată de 135267.00 EUR reflectă condițiile curente ale pieței și interesul observat pentru proprietăți similare în zona analizată.</w:t>
+        <w:t>În conformitate cu GEV 520, performanța garanției pe perioada creditului trebuie analizată prin raportare la activitatea curentă și tendințele pieței relevante, la cererea anterioară, curentă și viitoare pentru tipul de bun și pentru localizare, precum și la cererea pentru alte utilizări și la impactul evenimentelor previzibile asupra valorii viitoare a garanției. Pentru imobilul evaluat, destinat garantării creditului ipotecar al Client demonstrativ pentru Breaza de Sus, jud. Prahova, datele de evaluare indică o proprietate cu teren intravilan de 700 mp și arie utilă de 180 mp, cu valoarea de piață reconciliată de 135267.00 EUR, determinată prin abordarea prin piață pe baza a 3 comparabile, ceea ce susține adecvarea analizelor de piață în fundamentarea valorii de garantare.</w:t>
         <w:br/>
         <w:br/>
-        <w:t>În raport cu activitatea curentă și tendințele pieței, abordarea prin piață a fost cea care a fundamentat valoarea reconciliată, utilizând un număr de 3 comparabile pentru proprietate și comparabilul selectat pentru teren, la un nivel de 39.52 EUR/mp pentru teren, rezultând o valoare alocată terenului de 27664.00 EUR și o valoare alocată construcției de 107603.00 EUR. Această structură a valorii indică o piață funcțională pentru bunuri imobiliare de tipul celui evaluat, cu lichiditate moderată și cu posibilitatea de valorificare într-un interval rezonabil de timp, în condițiile unei comercializări corecte și ale menținerii parametrilor actuali de amplasament, utilitate și stare fizică.</w:t>
+        <w:t>Având în vedere tipul proprietății și contextul localizării, se apreciază că cererea pentru bunuri similare este relevantă în prezent, iar menținerea acesteia pe perioada creditului va depinde de evoluția generală a pieței imobiliare din zonă, de nivelul lichidității segmentului și de compatibilitatea caracteristicilor imobilului cu preferințele potențialilor cumpărători. Valoarea terenului rezultată prin comparație, de 27664.00 EUR, și valoarea alocată construcțiilor, de 107603.00 EUR, indică o structură a valorii bazată pe utilizarea curentă a proprietății, iar acest aspect este favorabil atunci când utilizarea actuală rămâne cea mai probabilă și cea mai atractivă economic.</w:t>
         <w:br/>
         <w:br/>
-        <w:t>Cererea anterioară, curentă și anticipată pentru acest tip de bun și pentru localizare este apreciată ca fiind susținută de utilizarea rezidențială și de caracteristicile intravilane ale terenului, însă nivelul efectiv al lichidității depinde de evoluția generală a pieței imobiliare, de condițiile de finanțare și de preferințele cumpărătorilor din segmentul relevant. Cererea pentru alte utilizări este limitată de caracteristicile fizice și urbanistice ale proprietății, astfel încât adaptabilitatea la utilizări alternative poate exista, dar nu poate fi tratată ca principal motor de valoare fără informații suplimentare specifice pieței și reglementărilor locale. Evenimentele previzibile, precum modificări ale condițiilor economice, ale costurilor de finanțare sau ale cererii regionale, pot influența valoarea viitoare, însă, la data evaluării, nu se identifică elemente care să conducă la o vulnerabilitate neobișnuită a garanției.</w:t>
+        <w:t>Cererea pentru alte utilizări poate influența pozitiv sau negativ valoarea viitoare numai dacă apar schimbări de destinație mai avantajoase ori restricții care diminuează flexibilitatea de exploatare; în absența unor date specifice privind o reconversie imobiliară, evaluarea se fundamentează pe utilizarea curentă. Evenimentele previzibile, precum modificări ale condițiilor de piață, ale costurilor de finanțare sau ale regimului urbanistic, pot afecta viteza de valorificare și nivelul prețului de vânzare, însă pe baza datelor disponibile nu se identifică elemente care să conducă la o depreciere anticipată semnificativă a valorii de piață față de nivelul estimat la data evaluării.</w:t>
         <w:br/>
         <w:br/>
-        <w:t>Având în vedere valoarea de piață determinată, structura fizică a proprietății și rezultatul analizei comparative, garanția prezintă un grad de adecvare corespunzător pentru scopul declarat, fiind considerată vandabilă și aptă să susțină recuperarea creanței în condiții obișnuite de piață. Evaluarea confirmă că proprietatea oferă creditorului un activ real, cu comportament de piață identificabil și cu perspectivă rezonabilă de valorificare pe durata creditului, fără a elimina însă riscul de piață inerent oricărei garanții imobiliare.</w:t>
+        <w:t>Din perspectiva creditorului, garanția prezintă un grad de adecvare corespunzător scopului evaluării, întrucât valoarea de piață a fost estimată printr-o metodă de piață susținută de date comparabile, iar proprietatea are caracteristici uzuale pentru segmentul analizat. Lichiditatea și vandabilitatea sunt apreciate ca fiind satisfăcătoare, în măsura în care bunul rămâne competitiv față de proprietăți similare din zonă și își menține utilizarea curentă, însă realizarea efectivă a garanției va depinde de condițiile pieței la momentul eventualei valorificări și de timpul necesar găsirii unui cumpărător.</w:t>
       </w:r>
     </w:p>
     <w:p>

</xml_diff>

<commit_message>
docs: regenerare raport Breaza cu verificarea de consistenta cost<->piata (28.77%)
</commit_message>
<xml_diff>
--- a/docs/exemplu-raport-breaza.docx
+++ b/docs/exemplu-raport-breaza.docx
@@ -361,16 +361,16 @@
     </w:p>
     <w:p>
       <w:r>
-        <w:t>Ipotezele și condițiile limitative care fundamentează prezentul raport sunt cele uzuale unei misiuni de evaluare realizate în conformitate cu SEV, pentru scopul declarat al evaluării, respectiv garantarea creditului ipotecar. Raportul are ca obiect estimarea valorii de piață a proprietății imobiliare, exprimată în EUR, iar utilizarea lui este limitată exclusiv la scopul indicat de beneficiar și finanțator, respectiv Banca Comerciala Exemplu S.A.; orice altă utilizare, totală sau parțială, în afara acestui context, nu este permisă.</w:t>
+        <w:t>Se presupune că dreptul de proprietate asupra imobilului evaluat este valabil, opozabil și transferabil, iar imobilul este liber de sarcini, cu excepția eventualelor mențiuni expres consemnate în documentația pusă la dispoziție. Evaluarea a fost întocmită pentru garantarea creditului ipotecar în favoarea Băncii Comerciale Exemplu S.A., având ca bază valoarea de piață definită conform SEV 102, exprimată în EUR.</w:t>
         <w:br/>
         <w:br/>
-        <w:t>Se presupune, în lipsa unor informații contrare comunicate evaluatorului, că dreptul de proprietate este valabil, opozabil și liber de sarcini, cu excepția eventualelor mențiuni exprimate în mod explicit în documentele puse la dispoziție. De asemenea, se consideră că imobilul analizat are structura de rezistență corespunzătoare, că nu există vicii ascunse, defecte structurale sau degradări care nu pot fi identificate prin inspecția efectuată, și că nu există situații tehnice ori juridice care să afecteze semnificativ valoarea și care să nu fi fost aduse la cunoștința evaluatorului.</w:t>
+        <w:t>Se presupune că elementele constructive și instalațiile aferente sunt în stare normală de exploatare, că structura de rezistență este corespunzătoare, iar nu există vicii ascunse, defecte structurale sau degradări care să influențeze semnificativ valoarea, în afara celor observabile la inspecția efectuată. De asemenea, nu au fost efectuate investigații distructive, expertize tehnice ascunse ori investigații geotehnice, astfel încât eventualele particularități ale terenului, ale fundațiilor sau ale elementelor inaccesibile nu pot fi validate decât în măsura informațiilor disponibile.</w:t>
         <w:br/>
         <w:br/>
-        <w:t>Nu s-au efectuat investigații de specialitate de natură geotehnică, expertize structurale distructive sau alte verificări invazive asupra elementelor ascunse ale construcției ori terenului. Prin urmare, orice apreciere privind condițiile din fundație, terenul de fundare, instalațiile ascunse sau alte componente inaccesibile este formulată pe baza informațiilor disponibile și a inspecției vizuale, fără garantarea existenței unor condiții nedeclarate.</w:t>
+        <w:t>Suprafața terenului luată în calcul este de 700 mp, teren intravilan, iar pentru corpul de construcție s-au utilizat datele de arie utilă 180 mp și arie construită desfășurată 220 mp, cu an de referință 2026. Analiza valorii s-a realizat pe baza datelor furnizate și a metodelor prezentate în raport, rezultatul final reconciliat fiind de 135267.00 EUR; acest rezultat trebuie interpretat strict în contextul ipotezelor și al limitărilor menționate în raport.</w:t>
         <w:br/>
         <w:br/>
-        <w:t>Datele numerice utilizate în raport sunt cele furnizate pentru această misiune, inclusiv suprafața terenului de 700 mp, categoria de intravilan, arie utilă de 180 mp, arie construită desfășurată de 220 mp și anul de referință 2026. Orice concluzie, estimare sau alocare de valoare din raport se bazează exclusiv pe aceste date și pe informațiile comparabile disponibile, fără extinderea analizei dincolo de limitele informaționale ale misiunii.</w:t>
+        <w:t>Prezentul raport se utilizează exclusiv în scopul declarat al evaluării pentru garantarea creditului ipotecar și nu poate fi folosit pentru alte destinații, fără acordul evaluatorului și fără o reanalizare adecvată a ipotezelor și condițiilor de evaluare. Orice utilizare în afara acestui cadru, precum și orice modificare a datelor de intrare, a stării fizice a imobilului sau a regimului juridic al proprietății, poate conduce la rezultate diferite și la necesitatea actualizării evaluării.</w:t>
       </w:r>
     </w:p>
     <w:p>
@@ -393,13 +393,13 @@
     </w:p>
     <w:p>
       <w:r>
-        <w:t>Piața imobiliară locală relevantă pentru proprietatea evaluată este o piață de dimensiune limitată, în care valoarea de piață a fost fundamentată prin analiza comparabilelor disponibile și prin corelarea acestora cu caracteristicile proprietății subiect. În contextul evaluării pentru garantarea creditului ipotecar, cererea este susținută de interesul pentru proprietăți similare, iar oferta este reprezentată de proprietăți comparabile identificate pe piața locală, suficiente pentru aplicarea abordării prin piață și pentru estimarea valorii terenului prin comparație.</w:t>
+        <w:t>Pe piața imobiliară locală relevantă pentru proprietatea evaluată, analiza comparabilelor utilizate sugerează existența unei cereri active, dar selective, orientate către proprietăți care corespund cât mai bine amplasamentului, suprafeței terenului de 700 mp, ariei utile de 180 mp și ariei construite desfășurate de 220 mp. În acest context, oferta disponibilă pare să fie comparabilă doar pentru proprietăți cu caracteristici apropiate, iar formarea valorii de piață este influențată de nivelul de adecvare dintre cererea potențială și oferta efectiv tranzacționabilă.</w:t>
         <w:br/>
         <w:br/>
-        <w:t>Din analiza comparabilelor utilizate rezultă că piața prezintă un grad de lichiditate moderată, cu posibilitatea de identificare a unor tranzacții sau oferte relevante, dar cu un număr redus de repere direct comparabile. Alegerea a 3 comparabile pentru abordarea prin piață și a 3 comparabile pentru teren indică existența unor informații de piață utilizabile, însă nu într-un volum foarte mare, ceea ce impune o selecție atentă și ajustarea comparabilelor în funcție de suprafață, amplasament și caracteristicile tehnice ale proprietății.</w:t>
+        <w:t>Lichiditatea pieței poate fi apreciată ca moderată, în sensul că realizarea unei tranzacții la un nivel apropiat de valoarea de piață presupune o selecție atentă a comparabilelor și o ajustare prudentă a diferențelor relevante. Faptul că valoarea prin piață a rezultat dintr-un comparabil selectat dintr-un set de 3 comparabile, iar pentru teren a fost utilizat un preț de 39,52 EUR/mp, indică o piață în care informația de tranzacționare este utilă, dar nu abundentă, iar concluzia valorică depinde de gradul de similitudine al proprietăților analizate.</w:t>
         <w:br/>
         <w:br/>
-        <w:t>Tendințele rezultate din comparația datelor de piață indică o poziționare a proprietății într-un segment în care prețurile sunt influențate în principal de raportul cerere-ofertă și de caracteristicile individuale ale imobilului. Valoarea finală reconcilată, stabilită prin abordarea prin piață la 135267.00 EUR, susține concluzia că piața locală permite formarea unui preț credibil pe baza comparabilelor disponibile, iar valoarea terenului rezultată din comparație, de 39.52 EUR/mp, confirmă existența unor repere de piață utile pentru fundamentarea estimării.</w:t>
+        <w:t>Tendințele observate în cadrul analizei comparabilelor pot indica o stabilizare a prețurilor la nivelul segmentului relevant, fără elemente suficiente pentru a susține o evoluție accentuată în sus sau în jos. Alocarea valorii finale în sumă de 135267,00 EUR, din care 27664,00 EUR aferenți terenului și 107603,00 EUR aferenți construcțiilor, confirmă faptul că piața tratează distinct cele două componente ale proprietății, iar evaluarea este susținută preponderent de abordarea prin piață, considerată cea mai relevantă pentru scopul de garantare a creditului ipotecar.</w:t>
       </w:r>
     </w:p>
     <w:p>
@@ -432,13 +432,16 @@
     </w:p>
     <w:p>
       <w:r>
-        <w:t>Imobilul analizat este identificat prin numărul cadastral 2xxxx (demo) și este înscris în cartea funciară CF xxxxx Breaza (demo), proprietatea fiind individualizată în evidențele de publicitate imobiliară aferente. Din punct de vedere juridic, descrierea de față are la bază identificarea cadastrală și intabularea corespunzătoare, proprietatea fiind considerată în contextul transmiterii sau garantării unui drept real asupra imobilului, pentru beneficiarul / finanțatorul Banca Comerciala Exemplu S.A.</w:t>
+        <w:t>Proprietatea evaluată este identificată din punct de vedere juridic prin elementele cadastrale și de carte funciară puse la dispoziție în documentația de evaluare, respectiv 2xxxx (demo) și CF xxxxx Breaza (demo), acestea constituind reperele de individualizare a imobilului în evidențele specifice. Evaluarea a fost întocmită pentru scopul garantării creditului ipotecar, în vederea estimării valorii de piață conform SEV 102, pentru beneficiarul/finanțatorul Client demonstrativ / Banca Comerciala Exemplu S.A.</w:t>
         <w:br/>
         <w:br/>
-        <w:t>Din punct de vedere fizic, proprietatea este amplasată pe un teren intravilan în suprafață de 700 mp. Terenul aferent imobilului reprezintă suportul funcțional al construcției și este evaluat în contextul amplasamentului și al utilizării sale curente, în cadrul abordării prin piață.</w:t>
+        <w:t>Din punct de vedere fizic, imobilul este amplasat pe un teren cu suprafața de 700 mp, încadrat la categoria de teren intravilan. Această caracteristică indică faptul că terenul face parte din intravilanul localității, fiind apt pentru utilizări specifice zonelor construite, în limitele reglementărilor urbanistice aplicabile.</w:t>
         <w:br/>
         <w:br/>
-        <w:t>Construcția existentă are o arie utilă de 180 mp și o arie construită desfășurată de 220 mp, fiind realizată în anul de referință 2026. Imobilul este analizat ca ansamblu teren + construcție, valoarea de piață fiind stabilită prin reconciliere la 135267.00 EUR, din care valoarea alocată terenului este de 27664.00 EUR, iar valoarea alocată construcției este de 107603.00 EUR.</w:t>
+        <w:t>Corpul de proprietate cuprinde o construcție cu arie utilă de 180 mp și arie construită desfășurată de 220 mp, având anul de referință 2026. Regimul de înălțime nu a fost indicat în datele furnizate; în consecință, acesta nu poate fi precizat în prezenta descriere fără a depăși informațiile disponibile.</w:t>
+        <w:br/>
+        <w:br/>
+        <w:t>Din perspectiva evaluării, datele de intrare și rezultatele de piață indică o valoare finală reconciliată de 135267.00 EUR, cu o alocare estimată de 27664.00 EUR pentru teren și 107603.00 EUR pentru construcții. Aceste elemente sunt prezentate strict ca suport pentru caracterizarea generală a proprietății și nu modifică situația juridică ori fizică descrisă anterior.</w:t>
       </w:r>
     </w:p>
     <w:p>
@@ -461,13 +464,16 @@
     </w:p>
     <w:p>
       <w:r>
-        <w:t>Analiza celei mai bune utilizări a proprietății s-a realizat având în vedere criteriile de permisibilitate legală, posibilitate fizică, fezabilitate financiară și maximă productivitate, conform conceptului CMBU din standardele de evaluare. În absența unor informații care să indice o oportunitate superioară de reconversie, utilizarea existentă rezidențială este considerată, în ipotezele prezentei evaluări, utilizarea care îndeplinește cel mai probabil aceste criterii și care susține determinarea valorii de piață pentru scopul garantării creditului ipotecar.</w:t>
+        <w:t>Analiza celei mai bune utilizări pentru proprietatea evaluată indică, în condițiile date, menținerea utilizării rezidențiale existente ca scenariu cel mai probabil rezonabil. În cadrul testului de CMBU, utilizarea trebuie să fie permisă legal, posibilă fizic, fezabilă financiar și maxim productivă; în cazul de față, configurația proprietății, respectiv terenul intravilan de 700 mp și construcția cu Au 180 mp și Acd 220 mp, susține în mod plauzibil continuarea exploatării rezidențiale.</w:t>
         <w:br/>
         <w:br/>
-        <w:t>Din punct de vedere fizic, proprietatea dispune de un teren intravilan de 700 mp și o construcție cu arie utilă de 180 mp și arie construită desfășurată de 220 mp, configurare care este compatibilă cu exploatarea rezidențială curentă. Din punct de vedere legal, în lipsa unor restricții cunoscute care să impună o altă destinație, utilizarea rezidențială este prezumată permisă. Din punct de vedere economic, abordarea prin piață indică o valoare de 135267.00 EUR, iar analiza prin cost conduce la o valoare prin cost de 178735.07 EUR, însă valoarea de piață reconcilată este cea relevantă în contextul CMBU, fiind susținută de comportamentul pieței pentru proprietăți comparabile.</w:t>
+        <w:t>Din punct de vedere al permisibilității legale și al posibilității fizice, datele furnizate nu indică restricții care să impună o altă destinație și nici limitări fizice care să facă improbabilă utilizarea curentă. Având în vedere că analiza de piață a fost realizată pe baza unor comparabile pentru aceeași tipologie de proprietate, iar valoarea prin abordarea de piață a rezultat la 135267.00 EUR, analiza sugerează că utilizarea rezidențială este acceptată de piață și compatibilă cu caracteristicile proprietății.</w:t>
         <w:br/>
         <w:br/>
-        <w:t>În raport cu datele disponibile, nu rezultă elemente care să justifice o utilizare alternativă care să producă o valoare superioară celei aferente utilizării rezidențiale existente. Valoarea terenului determinată prin comparație, de 39.52 EUR/mp, respectiv 27664.00 EUR pentru terenul evaluat, iar valoarea alocată construcțiilor de 107603.00 EUR, confirmă faptul că ansamblul proprietății funcționează ca o proprietate rezidențială completă, iar utilizarea actuală este cea care maximizează în mod rezonabil valoarea în ipotezele și condițiile analizate.</w:t>
+        <w:t>Sub aspectul fezabilității financiare, abordarea prin cost conduce la o valoare de 178735.07 EUR, în timp ce abordarea prin piață indică 135267.00 EUR; diferența între aceste rezultate arată că piața nu capitalizează integral costul de înlocuire/reconstituire, ceea ce poate indica o contribuție economică limitată a îmbunătățirilor la nivelul costurilor istorice sau de înlocuire estimate. Totuși, în lipsa unor date care să susțină o reproiectare ori o conversie cu valoare superioară, utilizarea rezidențială existentă rămâne fezabilă financiar în sensul menținerii unei exploatări curente compatibile cu prețurile observate pe piață.</w:t>
+        <w:br/>
+        <w:br/>
+        <w:t>Din perspectiva maximului productiv, datele disponibile nu evidențiază o alternativă de utilizare care să conducă, în mod prudent, la o valoare superioară celei aferente utilizării rezidențiale existente. Valoarea terenului estimată prin comparație, de 27664.00 EUR la un nivel unitar de 39.52 EUR/mp, și alocarea valorii construcțiilor de 107603.00 EUR susțin concluzia că proprietatea își conservă cea mai bună utilizare prin exploatarea actuală, fără a rezulta elemente suficiente pentru a argumenta o schimbare de destinație care să fie credibil mai productivă.</w:t>
       </w:r>
     </w:p>
     <w:p>
@@ -1054,13 +1060,13 @@
     </w:p>
     <w:p>
       <w:r>
-        <w:t>Ajustările din grila de comparații au fost aplicate diferențiat, în funcție de etapa de analiză: la tranzacție s-au corectat diferențele ce țin de prețul observat în piață și condițiile vânzării/comparării, iar la proprietate s-au operat ajustările pentru caracteristicile intrinseci ale activului evaluat, astfel încât comparabilele să fie aduse la un nivel cât mai apropiat de proprietatea subiect. Această separare este coerentă cu abordarea prin piață, care urmărește estimarea prețului cel mai probabil prin compararea cu active similare, pe baza unor intrări observabile și a condițiilor pieței.</w:t>
+        <w:t>Justificarea ajustărilor aplicate în grila de comparație a urmărit diferențele dintre etapa de tranzacție și etapa de proprietate, astfel încât prețurile comparabile să reflecte cât mai fidel caracteristicile proprietății subiect. În abordarea prin piață, prețurile proprietăților comparabile se ajustează în funcție de deosebirile existente între acestea și proprietatea evaluată, iar alegerea comparabilelor și a corecțiilor aplicate trebuie să susțină obținerea unei indicații credibile a valorii de piață.</w:t>
         <w:br/>
         <w:br/>
-        <w:t>Logica aplicării ajustărilor este una de omogenizare succesivă a datelor de piață: întâi se elimină efectele particulare ale tranzacției, apoi se ajustează diferențele de proprietate relevante pentru utilizare, dimensiune și caracteristicile care influențează direct percepția cumpărătorului. În acest mod, valoarea estimată reflectă mai bine comportamentul pieței pentru un activ cu utilitate comparabilă, fără a introduce distorsiuni generate de elemente nereprezentative ale fiecărei tranzacții analizate.</w:t>
+        <w:t>În etapa de tranzacție au fost avute în vedere ajustările asociate momentului vânzării, respectiv diferențele de timp și condițiile pieței la data tranzacției față de data evaluării, precum și eventualele diferențe care decurg din modul în care a fost realizată tranzacția. În etapa de proprietate, ajustările au vizat diferențele dintre comparabile și subiect sub aspectul caracteristicilor relevante ale imobilului, în special cele care influențează direct nivelul prețului, precum terenul, suprafața construită și utilitatea generală. Această separare este coerentă cu principiul substituției și cu modul de aplicare al abordării prin piață, în care comparația trebuie să elimine, pe cât posibil, efectul diferențelor dintre proprietăți.</w:t>
         <w:br/>
         <w:br/>
-        <w:t>Comparabilul selectat are ajustarea brută minimă deoarece este cel mai apropiat de proprietatea evaluată în ansamblul caracteristicilor relevante folosite în grilă, ceea ce a redus amplitudinea corecțiilor necesare pentru aducerea la echivalență. În consecință, comparabilul cu cel mai mic volum de ajustări brute a oferit cea mai bună indicație de piață și a fost selectat pentru reconciliarea finală a valorii prin metoda comparațiilor.</w:t>
+        <w:t>Comparabilul selectat a fost cel cu ajustarea brută minimă deoarece, dintre cele trei comparabile analizate, acesta prezintă cel mai bun grad de similitudine globală față de proprietatea subiect, ceea ce a redus necesarul de corecții pentru a-l aduce la un nivel comparabil de analiză. În consecință, ajustarea brută minimă indică, în mod rezonabil, cel mai redus volum de diferențe relevante între comparabil și proprietatea evaluată, făcându-l cel mai potrivit pentru estimarea valorii de piață prin comparație. În prezenta evaluare, această logică a condus la valoarea finală reconciliată de 135267.00 EUR, cu alocarea valorii în sumă de 107603.00 EUR pentru construcții și 27664.00 EUR pentru teren, rezultate utilizate în cadrul reconcilierii finale.</w:t>
       </w:r>
     </w:p>
     <w:p>
@@ -1083,13 +1089,16 @@
     </w:p>
     <w:p>
       <w:r>
-        <w:t>În fundamentarea concluziei asupra valorii, s-au avut în vedere rezultatele obținute prin abordarea prin piață și abordarea prin cost, în conformitate cu cerința de reconciliere a rezultatelor și de selectare a valorii celei mai potrivite scopului evaluării. Pentru proprietatea evaluată în scopul garantării creditului ipotecar, tipul valorii estimat este valoarea de piață, exprimată în EUR, iar concluzia finală reflectă indicatorul considerat cel mai relevant pentru condițiile concrete ale proprietății și pentru utilizarea preconizată a raportului.</w:t>
+        <w:t>În cadrul analizei au fost utilizate două abordări relevante pentru proprietatea evaluată: abordarea prin piață și abordarea prin cost. Pentru scopul evaluării, respectiv garantarea creditului ipotecar, și pentru tipul de valoare urmărit, valoarea de piață, abordarea prin piață oferă indicația cea mai directă asupra prețului probabil de tranzacționare, prin raportare la comparabilele selectate din piață, iar abordarea prin cost furnizează o verificare complementară a valorii, pe baza costului de înlocuire și a deprecierii cumulate.</w:t>
         <w:br/>
         <w:br/>
-        <w:t>Abordarea prin cost a condus la o valoare estimată de 178735.07 EUR, rezultată din costul brut de înlocuire de 182600.00 EUR, din care s-a dedus deprecierea fizică de 17.27%, obținându-se costul de înlocuire depreciat de 151071.07 EUR, la care s-a adăugat valoarea terenului determinată prin comparație, respectiv 27664.00 EUR. Această abordare oferă o indicație utilă asupra valorii tehnice a proprietății, însă rezultatul său se situează peste nivelul evidențiat de piață, ceea ce impune acordarea unei ponderi mai reduse în reconciliere.</w:t>
+        <w:t>Abordarea prin cost a condus la o valoare de 178735.07 EUR, rezultată din CIB de 182600.00 EUR, din care s-a dedus deprecierea fizică de 17.27%, obținându-se CIN de 151071.07 EUR, la care s-a adăugat valoarea terenului determinată prin comparație, respectiv 27664.00 EUR. Această indicație este utilă ca reper tehnic, însă poate reflecta mai degrabă costul de reproducere a utilității decât comportamentul efectiv al pieței în contextul curent.</w:t>
         <w:br/>
         <w:br/>
-        <w:t>Abordarea prin piață a fost considerată predominantă, întrucât se bazează direct pe comportamentul pieței și pe compararea cu un număr de 3 comparabile, dintre care a fost selectat comparabilul cu index 0 pentru estimarea valorii totale, respectiv 135267.00 EUR. În cadrul analizei terenului, valoarea de 39.52 EUR/mp aplicată suprafeței de 700 mp a condus la valoarea terenului de 27664.00 EUR, iar valoarea alocată construcțiilor a fost de 107603.00 EUR. Având în vedere scopul evaluării, tipul valorii urmărit și relevanța superioară a datelor de piață pentru proprietatea analizată, valoarea finală reconciliată este stabilită la 135267.00 EUR, prin metoda pieței.</w:t>
+        <w:t>Abordarea prin piață a condus la o valoare de 135267.00 EUR, pe baza a 3 comparabile, cu comparabilul selectat de index 0 pentru valoarea totală și comparabilul de index 2 pentru teren, la un nivel al valorii terenului de 39.52 EUR/mp, aplicat la suprafața de 700 mp. În reconciliere, această abordare a fost considerată mai reprezentativă, întrucât reflectă mai direct condițiile de piață pentru un activ similar și rezultă din compararea cu tranzacții/comparabile relevante, ceea ce este adecvat pentru estimarea valorii de piață în scopul garantării creditului ipotecar.</w:t>
+        <w:br/>
+        <w:br/>
+        <w:t>Prin urmare, după analiza comparativă a indicațiilor obținute, valoarea finală reconciliată a proprietății imobiliare este de 135267.00 EUR, valoare estimată prin abordarea prin piață, iar alocarea internă a acesteia este de 27664.00 EUR pentru teren și 107603.00 EUR pentru construcții. Această concluzie este formulată pentru beneficiar / finantator: Banca Comerciala Exemplu S.A. și trebuie utilizată exclusiv în contextul și pentru scopul evaluării menționate.</w:t>
       </w:r>
     </w:p>
     <w:p>
@@ -1220,6 +1229,14 @@
       </w:r>
     </w:p>
     <w:p>
+      <w:r>
+        <w:rPr>
+          <w:b/>
+        </w:rPr>
+        <w:t>VERIFICARE DE CONSISTENTA (GEV 520): valoarea constructiilor alocata (107.603 EUR) difera cu 28.77% fata de costul de inlocuire net (151.071 EUR). O diferenta de aceasta amplitudine trebuie justificata explicit (depreciere fizica/functionala/externa, supraoferta sau localizare inferioara) - altfel poate fi semnalata la verificarea bancara.</w:t>
+      </w:r>
+    </w:p>
+    <w:p>
       <w:pPr>
         <w:pStyle w:val="Heading1"/>
       </w:pPr>
@@ -1239,16 +1256,13 @@
     </w:p>
     <w:p>
       <w:r>
-        <w:t>În conformitate cu GEV 520, performanța garanției pe perioada creditului trebuie analizată prin raportare la activitatea curentă și tendințele pieței relevante, la cererea anterioară, curentă și viitoare pentru tipul de bun și pentru localizare, precum și la cererea pentru alte utilizări și la impactul evenimentelor previzibile asupra valorii viitoare a garanției. Pentru imobilul evaluat, destinat garantării creditului ipotecar al Client demonstrativ pentru Breaza de Sus, jud. Prahova, datele de evaluare indică o proprietate cu teren intravilan de 700 mp și arie utilă de 180 mp, cu valoarea de piață reconciliată de 135267.00 EUR, determinată prin abordarea prin piață pe baza a 3 comparabile, ceea ce susține adecvarea analizelor de piață în fundamentarea valorii de garantare.</w:t>
+        <w:t>Conform GEV 520, evaluarea pentru garantarea creditului trebuie să includă comentarii asupra factorilor relevanți pentru estimarea performanței garanției pe perioada creditului, respectiv activitatea curentă și tendințele pieței, cererea anterioară, curentă și viitoare pentru tipul de proprietate și localizare, cererea pentru alte utilizări și impactul evenimentelor previzibile asupra valorii viitoare a garanției.</w:t>
         <w:br/>
         <w:br/>
-        <w:t>Având în vedere tipul proprietății și contextul localizării, se apreciază că cererea pentru bunuri similare este relevantă în prezent, iar menținerea acesteia pe perioada creditului va depinde de evoluția generală a pieței imobiliare din zonă, de nivelul lichidității segmentului și de compatibilitatea caracteristicilor imobilului cu preferințele potențialilor cumpărători. Valoarea terenului rezultată prin comparație, de 27664.00 EUR, și valoarea alocată construcțiilor, de 107603.00 EUR, indică o structură a valorii bazată pe utilizarea curentă a proprietății, iar acest aspect este favorabil atunci când utilizarea actuală rămâne cea mai probabilă și cea mai atractivă economic.</w:t>
+        <w:t>În cazul proprietății evaluate, compusă din teren intravilan de 700 mp și construcție cu arie utilă de 180 mp și arie construită desfășurată de 220 mp, analiza de piață utilizată la estimarea valorii de piață indică o valoare finală reconciliată de 135267,00 EUR, stabilită prin metoda pieței, cu suport din comparabile selectate și o alocare a valorii de 27664,00 EUR pentru teren și 107603,00 EUR pentru construcții. Raportat la utilizarea actuală și la configurația proprietății, aceste rezultate pot indica o adecvare rezonabilă ca garanție pentru scopul declarat, cu mențiunea că valoarea obținută prin alocare nu reprezintă, în sine, o valoare de piață individuală.</w:t>
         <w:br/>
         <w:br/>
-        <w:t>Cererea pentru alte utilizări poate influența pozitiv sau negativ valoarea viitoare numai dacă apar schimbări de destinație mai avantajoase ori restricții care diminuează flexibilitatea de exploatare; în absența unor date specifice privind o reconversie imobiliară, evaluarea se fundamentează pe utilizarea curentă. Evenimentele previzibile, precum modificări ale condițiilor de piață, ale costurilor de finanțare sau ale regimului urbanistic, pot afecta viteza de valorificare și nivelul prețului de vânzare, însă pe baza datelor disponibile nu se identifică elemente care să conducă la o depreciere anticipată semnificativă a valorii de piață față de nivelul estimat la data evaluării.</w:t>
-        <w:br/>
-        <w:br/>
-        <w:t>Din perspectiva creditorului, garanția prezintă un grad de adecvare corespunzător scopului evaluării, întrucât valoarea de piață a fost estimată printr-o metodă de piață susținută de date comparabile, iar proprietatea are caracteristici uzuale pentru segmentul analizat. Lichiditatea și vandabilitatea sunt apreciate ca fiind satisfăcătoare, în măsura în care bunul rămâne competitiv față de proprietăți similare din zonă și își menține utilizarea curentă, însă realizarea efectivă a garanției va depinde de condițiile pieței la momentul eventualei valorificări și de timpul necesar găsirii unui cumpărător.</w:t>
+        <w:t>Din perspectiva lichidității și vandabilității, valoarea de piață estimată pe baza comparabilelor sugerează existența unui interes de piață pentru proprietăți similare, însă realizarea unei tranzacții depinde de menținerea cererii pentru acest tip de bun și de localizarea sa, precum și de condițiile generale ale pieței pe durata creditului. Cererea pentru alte utilizări poate influența favorabil sau nefavorabil valorificarea, în funcție de flexibilitatea proprietății și de eventuale modificări ale regimului de utilizare, iar evenimentele previzibile relevante — precum evoluții ale pieței imobiliare, modificări ale mediului economic sau ale condițiilor de finanțare — pot afecta nivelul valorii viitoare și timpul necesar valorificării garanției. În aceste condiții, garanția poate fi apreciată ca având o lichiditate moderată, vandabilitate bună în condiții de piață normale și un grad de adecvare corespunzător pentru garantarea creditului ipotecar acordat de Banca Comerciala Exemplu S.A.</w:t>
       </w:r>
     </w:p>
     <w:p>

</xml_diff>

<commit_message>
feat(raport): valoare de lichidare (B4) + anexa de certificare GEV 520 (B5)
Sectiuni aditive pentru profilul de garantare (nu schimba calculele existente):
- B4: valoarea de lichidare/vanzare fortata = valoare piata x factor, cu estimare
  orientativa (0.85) si nota explicita ca factorul se stabileste de evaluator.
- B5: checklist de certificare a conformitatii (16 puncte, bifabil), de aliniat la
  Anexa 1 GEV 520 de catre evaluator.
Raport Breaza regenerat cu noile sectiuni. 381 teste verzi, ruff curat.

Co-Authored-By: Claude Opus 4.8 (1M context) <noreply@anthropic.com>
</commit_message>
<xml_diff>
--- a/docs/exemplu-raport-breaza.docx
+++ b/docs/exemplu-raport-breaza.docx
@@ -361,16 +361,13 @@
     </w:p>
     <w:p>
       <w:r>
-        <w:t>Se presupune că dreptul de proprietate asupra imobilului evaluat este valabil, opozabil și transferabil, iar imobilul este liber de sarcini, cu excepția eventualelor mențiuni expres consemnate în documentația pusă la dispoziție. Evaluarea a fost întocmită pentru garantarea creditului ipotecar în favoarea Băncii Comerciale Exemplu S.A., având ca bază valoarea de piață definită conform SEV 102, exprimată în EUR.</w:t>
+        <w:t>Se presupune că dreptul de proprietate asupra imobilului evaluat este valabil, opozabil și liber de sarcini, cu excepția eventualelor înscrieri sau restricții care ar putea fi identificate în documentele puse la dispoziție de Client demonstrativ. De asemenea, se consideră că toate informațiile furnizate sunt complete, corecte și pot fi utilizate la realizarea evaluării, fără a fi necesare verificări suplimentare de natură juridică, fiscală sau tehnică. Evaluarea a fost întocmită în contextul garantării creditului ipotecar, pentru Client demonstrativ, iar rezultatele sunt valabile în raport cu scopul declarat al misiunii.</w:t>
         <w:br/>
         <w:br/>
-        <w:t>Se presupune că elementele constructive și instalațiile aferente sunt în stare normală de exploatare, că structura de rezistență este corespunzătoare, iar nu există vicii ascunse, defecte structurale sau degradări care să influențeze semnificativ valoarea, în afara celor observabile la inspecția efectuată. De asemenea, nu au fost efectuate investigații distructive, expertize tehnice ascunse ori investigații geotehnice, astfel încât eventualele particularități ale terenului, ale fundațiilor sau ale elementelor inaccesibile nu pot fi validate decât în măsura informațiilor disponibile.</w:t>
+        <w:t>Se presupune că imobilul are o structură de rezistență corespunzătoare, că elementele constructive sunt realizate și exploatate în condiții normale și că nu există vicii ascunse, defecte structurale sau degradări care nu pot fi identificate prin inspecția vizuală obișnuită. Totodată, nu au fost efectuate investigații tehnice invazive, sondaje, desfaceri, expertize de laborator ori studii geotehnice, astfel încât eventualele condiții nefavorabile din subsol, teren sau din elementele ascunse ale construcției pot influența valoarea și nu pot fi cuantificate în mod direct în cadrul prezentei lucrări.</w:t>
         <w:br/>
         <w:br/>
-        <w:t>Suprafața terenului luată în calcul este de 700 mp, teren intravilan, iar pentru corpul de construcție s-au utilizat datele de arie utilă 180 mp și arie construită desfășurată 220 mp, cu an de referință 2026. Analiza valorii s-a realizat pe baza datelor furnizate și a metodelor prezentate în raport, rezultatul final reconciliat fiind de 135267.00 EUR; acest rezultat trebuie interpretat strict în contextul ipotezelor și al limitărilor menționate în raport.</w:t>
-        <w:br/>
-        <w:br/>
-        <w:t>Prezentul raport se utilizează exclusiv în scopul declarat al evaluării pentru garantarea creditului ipotecar și nu poate fi folosit pentru alte destinații, fără acordul evaluatorului și fără o reanalizare adecvată a ipotezelor și condițiilor de evaluare. Orice utilizare în afara acestui cadru, precum și orice modificare a datelor de intrare, a stării fizice a imobilului sau a regimului juridic al proprietății, poate conduce la rezultate diferite și la necesitatea actualizării evaluării.</w:t>
+        <w:t>Raportul se bazează pe ipoteza că situația juridică și tehnică a proprietății rămâne conformă cu cele observate și cu datele puse la dispoziție la data evaluării, iar concluzia asupra valorii este formulată pentru valoarea de piață (SEV 102), exprimată în EUR, conform scopului declarat. Prezentul raport nu poate fi utilizat decât pentru destinația stabilită și nu poate fi extrapolat la alte scopuri, tranzacții sau contexte fără acordul evaluatorului și fără o analiză de evaluare distinctă. În lipsa unor informații contrare, se consideră că terenul este intravilan, cu suprafața de 700 mp, iar aria utilă și aria construită desfășurată sunt cele comunicate, respectiv 180 mp și 220 mp.</w:t>
       </w:r>
     </w:p>
     <w:p>
@@ -393,13 +390,13 @@
     </w:p>
     <w:p>
       <w:r>
-        <w:t>Pe piața imobiliară locală relevantă pentru proprietatea evaluată, analiza comparabilelor utilizate sugerează existența unei cereri active, dar selective, orientate către proprietăți care corespund cât mai bine amplasamentului, suprafeței terenului de 700 mp, ariei utile de 180 mp și ariei construite desfășurate de 220 mp. În acest context, oferta disponibilă pare să fie comparabilă doar pentru proprietăți cu caracteristici apropiate, iar formarea valorii de piață este influențată de nivelul de adecvare dintre cererea potențială și oferta efectiv tranzacționabilă.</w:t>
+        <w:t>Piața imobiliară locală relevantă pentru proprietatea evaluată poate fi caracterizată, pe baza comparabilelor utilizate, ca o piață activă, dar selectivă, în care formarea valorii este influențată de raportul dintre cerere și ofertă și de gradul de potrivire între proprietățile disponibile și cerințele cumpărătorilor. În contextul scopului evaluării – garantarea creditului ipotecar – analiza sugerează existența unei cereri funcționale pentru proprietăți similare, însă cu un comportament prudent al cumpărătorilor, reflectat în necesitatea selectării unui număr limitat de comparabile relevante și a unui comparabil principal pentru reconcilierea prin piață.</w:t>
         <w:br/>
         <w:br/>
-        <w:t>Lichiditatea pieței poate fi apreciată ca moderată, în sensul că realizarea unei tranzacții la un nivel apropiat de valoarea de piață presupune o selecție atentă a comparabilelor și o ajustare prudentă a diferențelor relevante. Faptul că valoarea prin piață a rezultat dintr-un comparabil selectat dintr-un set de 3 comparabile, iar pentru teren a fost utilizat un preț de 39,52 EUR/mp, indică o piață în care informația de tranzacționare este utilă, dar nu abundentă, iar concluzia valorică depinde de gradul de similitudine al proprietăților analizate.</w:t>
+        <w:t>Oferta locală pentru astfel de proprietăți pare relativ restrânsă la nivelul caracteristicilor comparabile analizate, iar diferențele dintre amplasament, teren și construcție pot conduce la variații semnificative ale prețurilor observate. Pentru teren, valoarea rezultată prin comparație de 39,52 EUR/mp, aplicată la suprafața de 700 mp, indică un nivel de piață utilizat în evaluare de 27.664,00 EUR, ceea ce poate sugera că tranzacțiile comparabile au fost suficiente pentru conturarea unui reper de piață, dar nu foarte numeroase.</w:t>
         <w:br/>
         <w:br/>
-        <w:t>Tendințele observate în cadrul analizei comparabilelor pot indica o stabilizare a prețurilor la nivelul segmentului relevant, fără elemente suficiente pentru a susține o evoluție accentuată în sus sau în jos. Alocarea valorii finale în sumă de 135267,00 EUR, din care 27664,00 EUR aferenți terenului și 107603,00 EUR aferenți construcțiilor, confirmă faptul că piața tratează distinct cele două componente ale proprietății, iar evaluarea este susținută preponderent de abordarea prin piață, considerată cea mai relevantă pentru scopul de garantare a creditului ipotecar.</w:t>
+        <w:t>Lichiditatea pieței poate fi apreciată ca moderată, în sensul că proprietățile cu caracteristici apropiate pot fi valorificate într-un orizont rezonabil de timp, însă numai dacă sunt poziționate competitiv față de oferta existentă. Reconcilierea finală la o valoare de piață de 135.267,00 EUR, cu alocarea a 107.603,00 EUR pentru construcții, arată că piața a susținut mai degrabă abordarea prin comparații decât rezultatul obținut prin cost, ceea ce poate indica faptul că prețurile de piață observate au reflectat mai bine comportamentul actual al cumpărătorilor decât costul de înlocuire net al proprietății.</w:t>
       </w:r>
     </w:p>
     <w:p>
@@ -432,16 +429,13 @@
     </w:p>
     <w:p>
       <w:r>
-        <w:t>Proprietatea evaluată este identificată din punct de vedere juridic prin elementele cadastrale și de carte funciară puse la dispoziție în documentația de evaluare, respectiv 2xxxx (demo) și CF xxxxx Breaza (demo), acestea constituind reperele de individualizare a imobilului în evidențele specifice. Evaluarea a fost întocmită pentru scopul garantării creditului ipotecar, în vederea estimării valorii de piață conform SEV 102, pentru beneficiarul/finanțatorul Client demonstrativ / Banca Comerciala Exemplu S.A.</w:t>
+        <w:t>Imobilul evaluat este identificat juridic prin elementele cadastrale și de carte funciară puse la dispoziție în documentația de evaluare, respectiv 2xxxx (demo) și CF xxxxx Breaza (demo), acestea reprezentând referințele de individualizare ale proprietății în evidențele de specialitate. Evaluarea a fost întocmită pentru Client demonstrativ, în vederea garantării unui credit ipotecar acordat de Banca Comerciala Exemplu S.A., având ca obiect valoarea de piață, în sensul SEV 102.</w:t>
         <w:br/>
         <w:br/>
-        <w:t>Din punct de vedere fizic, imobilul este amplasat pe un teren cu suprafața de 700 mp, încadrat la categoria de teren intravilan. Această caracteristică indică faptul că terenul face parte din intravilanul localității, fiind apt pentru utilizări specifice zonelor construite, în limitele reglementărilor urbanistice aplicabile.</w:t>
+        <w:t>Din punct de vedere fizic, proprietatea este compusă dintr-un teren în suprafață de 700 mp, încadrat la categoria de folosință intravilan, și o construcție edificată pe acesta. Construcția are o arie utilă de 180 mp și o arie construită desfășurată de 220 mp, iar anul de referință considerat în evaluare este 2026. Regimul de înălțime al construcției nu a fost indicat în datele furnizate.</w:t>
         <w:br/>
         <w:br/>
-        <w:t>Corpul de proprietate cuprinde o construcție cu arie utilă de 180 mp și arie construită desfășurată de 220 mp, având anul de referință 2026. Regimul de înălțime nu a fost indicat în datele furnizate; în consecință, acesta nu poate fi precizat în prezenta descriere fără a depăși informațiile disponibile.</w:t>
-        <w:br/>
-        <w:br/>
-        <w:t>Din perspectiva evaluării, datele de intrare și rezultatele de piață indică o valoare finală reconciliată de 135267.00 EUR, cu o alocare estimată de 27664.00 EUR pentru teren și 107603.00 EUR pentru construcții. Aceste elemente sunt prezentate strict ca suport pentru caracterizarea generală a proprietății și nu modifică situația juridică ori fizică descrisă anterior.</w:t>
+        <w:t>Din analiza valorii, terenul a fost estimat prin comparație la 39,52 EUR/mp, rezultând o valoare de 27.664,00 EUR pentru suprafața de 700 mp. Valoarea alocată construcției este de 107.603,00 EUR, iar valoarea finală reconciliată a proprietății este de 135.267,00 EUR, prin abordarea prin piață. Abordarea prin cost a condus la o valoare de 178.735,07 EUR, pe baza unui CIB de 182.600,00 EUR, a unui Vcp de 16,00 ani și a unei deprecieri fizice de 17,27%, însă reconcilierea finală a fost realizată în favoarea rezultatului de piață.</w:t>
       </w:r>
     </w:p>
     <w:p>
@@ -464,16 +458,16 @@
     </w:p>
     <w:p>
       <w:r>
-        <w:t>Analiza celei mai bune utilizări pentru proprietatea evaluată indică, în condițiile date, menținerea utilizării rezidențiale existente ca scenariu cel mai probabil rezonabil. În cadrul testului de CMBU, utilizarea trebuie să fie permisă legal, posibilă fizic, fezabilă financiar și maxim productivă; în cazul de față, configurația proprietății, respectiv terenul intravilan de 700 mp și construcția cu Au 180 mp și Acd 220 mp, susține în mod plauzibil continuarea exploatării rezidențiale.</w:t>
+        <w:t>Analiza celei mai bune utilizări a proprietății a fost realizată prin raportare la cele patru criterii specifice: permisibilitatea legală, posibilitatea fizică, fezabilitatea financiară și maximul de productivitate. În cazul de față, proprietatea este o locuință existentă amplasată pe un teren intravilan de 700 mp, cu arie utilă de 180 mp și arie construită desfășurată de 220 mp, iar ipoteza de lucru relevantă pentru evaluare este menținerea utilizării rezidențiale curente, aceasta fiind în mod obișnuit compatibilă cu caracteristicile unui astfel de activ și cu comportamentul pieței pentru proprietăți similare.</w:t>
         <w:br/>
         <w:br/>
-        <w:t>Din punct de vedere al permisibilității legale și al posibilității fizice, datele furnizate nu indică restricții care să impună o altă destinație și nici limitări fizice care să facă improbabilă utilizarea curentă. Având în vedere că analiza de piață a fost realizată pe baza unor comparabile pentru aceeași tipologie de proprietate, iar valoarea prin abordarea de piață a rezultat la 135267.00 EUR, analiza sugerează că utilizarea rezidențială este acceptată de piață și compatibilă cu caracteristicile proprietății.</w:t>
+        <w:t>Din punct de vedere al criteriului de permisibilitate legală, utilizarea rezidențială existentă este, în mod rezonabil, acceptabilă pentru o proprietate de tip intravilan, în absența unor informații care să indice restricții speciale sau incompatibilități urbanistice. Din punct de vedere fizic, suprafața terenului și configurația construcției permit exploatarea în continuare ca locuință, fără să rezulte din datele furnizate necesitatea unei reorganizări majore a amplasamentului sau a structurii existente. În acest context, analiza sugerează că utilizarea actuală este și posibilă fizic, și compatibilă cu caracteristicile proprietății.</w:t>
         <w:br/>
         <w:br/>
-        <w:t>Sub aspectul fezabilității financiare, abordarea prin cost conduce la o valoare de 178735.07 EUR, în timp ce abordarea prin piață indică 135267.00 EUR; diferența între aceste rezultate arată că piața nu capitalizează integral costul de înlocuire/reconstituire, ceea ce poate indica o contribuție economică limitată a îmbunătățirilor la nivelul costurilor istorice sau de înlocuire estimate. Totuși, în lipsa unor date care să susțină o reproiectare ori o conversie cu valoare superioară, utilizarea rezidențială existentă rămâne fezabilă financiar în sensul menținerii unei exploatări curente compatibile cu prețurile observate pe piață.</w:t>
+        <w:t>Sub aspectul fezabilității financiare, rezultatele abordării prin piață indică o valoare de piață de 135267.00 EUR, în timp ce abordarea prin cost conduce la o valoare de 178735.07 EUR, cu o valoare alocată terenului de 27664.00 EUR și o valoare alocată construcțiilor de 107603.00 EUR. Diferența dintre rezultatele abordărilor reflectă specificul pieței și al proprietății analizate, însă, pentru scopul evaluării, nivelul valorii de piață obținut prin comparații este relevant pentru susținerea unei utilizări curente care poate fi comercializată în condițiile pieței. În lipsa unor date care să susțină o conversie mai profitabilă, utilizarea rezidențială existentă apare ca fiind fezabilă financiar și, totodată, consistentă cu comportamentul pieței pentru bunuri comparabile.</w:t>
         <w:br/>
         <w:br/>
-        <w:t>Din perspectiva maximului productiv, datele disponibile nu evidențiază o alternativă de utilizare care să conducă, în mod prudent, la o valoare superioară celei aferente utilizării rezidențiale existente. Valoarea terenului estimată prin comparație, de 27664.00 EUR la un nivel unitar de 39.52 EUR/mp, și alocarea valorii construcțiilor de 107603.00 EUR susțin concluzia că proprietatea își conservă cea mai bună utilizare prin exploatarea actuală, fără a rezulta elemente suficiente pentru a argumenta o schimbare de destinație care să fie credibil mai productivă.</w:t>
+        <w:t>În consecință, cea mai bună utilizare a proprietății, în accepțiunea utilizării care maximizează valoarea în condițiile date, este menținerea utilizării rezidențiale existente. Această concluzie este susținută de faptul că utilizarea curentă îndeplinește, în mod rezonabil, testele de permisibilitate legală, posibilitate fizică și fezabilitate financiară, iar din datele disponibile nu rezultă o alternativă care să indice un potențial superior de valorificare în raport cu utilizarea actuală.</w:t>
       </w:r>
     </w:p>
     <w:p>
@@ -1060,13 +1054,10 @@
     </w:p>
     <w:p>
       <w:r>
-        <w:t>Justificarea ajustărilor aplicate în grila de comparație a urmărit diferențele dintre etapa de tranzacție și etapa de proprietate, astfel încât prețurile comparabile să reflecte cât mai fidel caracteristicile proprietății subiect. În abordarea prin piață, prețurile proprietăților comparabile se ajustează în funcție de deosebirile existente între acestea și proprietatea evaluată, iar alegerea comparabilelor și a corecțiilor aplicate trebuie să susțină obținerea unei indicații credibile a valorii de piață.</w:t>
+        <w:t>Justificarea ajustarilor aplicate se bazeaza pe analiza comparativa a caracteristicilor fizice, de amplasare si ale tranzactiei intre proprietatea subiect si comparabilele identificate, in conformitate cu principiile economice ale substitutiei si anticiparii beneficiilor. In etapa de tranzactie, ajustarile au fost aplicate pentru a corecta diferentele legate de conditiile de vanzare, motivatia partilor si contextul pietei, astfel incat preturile comparabile sa fie aduse la un nivel de comparabilitate cu o tranzactie ipotetica de tip pietei, in conditii normale, intre parti aflate in cunostinta de cauza si fara relatii de dependenta. In etapa proprietatii, ajustarile au vizat diferentele semnificative privind suprafata utila, suprafata construita desfasurata, anul de constructie, starea fizica, calitatea finisajelor, dotarile si alte caracteristici relevante care influenteaza direct pretul per unitate de suprafata sau per imobil.</w:t>
         <w:br/>
         <w:br/>
-        <w:t>În etapa de tranzacție au fost avute în vedere ajustările asociate momentului vânzării, respectiv diferențele de timp și condițiile pieței la data tranzacției față de data evaluării, precum și eventualele diferențe care decurg din modul în care a fost realizată tranzacția. În etapa de proprietate, ajustările au vizat diferențele dintre comparabile și subiect sub aspectul caracteristicilor relevante ale imobilului, în special cele care influențează direct nivelul prețului, precum terenul, suprafața construită și utilitatea generală. Această separare este coerentă cu principiul substituției și cu modul de aplicare al abordării prin piață, în care comparația trebuie să elimine, pe cât posibil, efectul diferențelor dintre proprietăți.</w:t>
-        <w:br/>
-        <w:br/>
-        <w:t>Comparabilul selectat a fost cel cu ajustarea brută minimă deoarece, dintre cele trei comparabile analizate, acesta prezintă cel mai bun grad de similitudine globală față de proprietatea subiect, ceea ce a redus necesarul de corecții pentru a-l aduce la un nivel comparabil de analiză. În consecință, ajustarea brută minimă indică, în mod rezonabil, cel mai redus volum de diferențe relevante între comparabil și proprietatea evaluată, făcându-l cel mai potrivit pentru estimarea valorii de piață prin comparație. În prezenta evaluare, această logică a condus la valoarea finală reconciliată de 135267.00 EUR, cu alocarea valorii în sumă de 107603.00 EUR pentru construcții și 27664.00 EUR pentru teren, rezultate utilizate în cadrul reconcilierii finale.</w:t>
+        <w:t>Comparabilul selectat (index 0) a fost ales ca referinta principala deoarece prezinta cele mai mici diferente brute de caracteristici fata de proprietatea subiect, ceea ce se traduce printr-o suma de ajustari brute minima in raport cu celelalte comparabile. Aceasta situatie indica o similaritate sporita in ceea ce priveste amplasarea, tipul de constructie, suprafata utila, suprafata construita desfasurata, anul de constructie si conditiile de exploatare, fapt care reduce incertitudinea asociata ajustarilor si sporeste gradul de relevanta al indicatiei de valoare obtinuta prin metoda comparatiei directe. Ajustarile aplicate au fost cuantificate pe baza analizei pietei locale, a informatiilor disponibile privind tranzactiile recente si a rationamentului profesional al evaluatorului, asigurandu-se ca fiecare corectie reflecta o diferenta reala si cuantificabila intre proprietatea subiect si comparabil, fara a depasi limitele rezonabile ale influentei acelei caracteristici asupra pretului de piata.</w:t>
       </w:r>
     </w:p>
     <w:p>
@@ -1089,16 +1080,16 @@
     </w:p>
     <w:p>
       <w:r>
-        <w:t>În cadrul analizei au fost utilizate două abordări relevante pentru proprietatea evaluată: abordarea prin piață și abordarea prin cost. Pentru scopul evaluării, respectiv garantarea creditului ipotecar, și pentru tipul de valoare urmărit, valoarea de piață, abordarea prin piață oferă indicația cea mai directă asupra prețului probabil de tranzacționare, prin raportare la comparabilele selectate din piață, iar abordarea prin cost furnizează o verificare complementară a valorii, pe baza costului de înlocuire și a deprecierii cumulate.</w:t>
+        <w:t>Reconcilierea rezultatelor a avut în vedere compararea celor două abordări aplicate, respectiv abordarea prin piață și abordarea prin cost, în raport cu scopul evaluării, acela de garantare a creditului ipotecar, și cu definiția valorii de piață. În fundamentarea concluziei asupra valorii, rezultatele obținute prin metode diferite se analizează comparativ, iar valoarea finală se selectează dintre valorile estimate ca fiind cea mai potrivită situației concrete a proprietății evaluate.</w:t>
         <w:br/>
         <w:br/>
-        <w:t>Abordarea prin cost a condus la o valoare de 178735.07 EUR, rezultată din CIB de 182600.00 EUR, din care s-a dedus deprecierea fizică de 17.27%, obținându-se CIN de 151071.07 EUR, la care s-a adăugat valoarea terenului determinată prin comparație, respectiv 27664.00 EUR. Această indicație este utilă ca reper tehnic, însă poate reflecta mai degrabă costul de reproducere a utilității decât comportamentul efectiv al pieței în contextul curent.</w:t>
+        <w:t>Abordarea prin cost a condus la o valoare de 178735.07 EUR, determinată pe baza unui CIB de 182600.00 EUR, a unei vechimi constructive de 16.00 ani, a unei deprecieri fizice de 17.27% și a unui CIN de 151071.07 EUR. Această abordare oferă un reper util privind nivelul investiției necesare pentru recrearea sau înlocuirea bunului, însă în cazul de față poate avea o relevanță mai redusă în estimarea valorii de piață, deoarece nu surprinde direct condițiile tranzacțiilor comparabile și reacția pieței la caracteristicile specifice ale proprietății.</w:t>
         <w:br/>
         <w:br/>
-        <w:t>Abordarea prin piață a condus la o valoare de 135267.00 EUR, pe baza a 3 comparabile, cu comparabilul selectat de index 0 pentru valoarea totală și comparabilul de index 2 pentru teren, la un nivel al valorii terenului de 39.52 EUR/mp, aplicat la suprafața de 700 mp. În reconciliere, această abordare a fost considerată mai reprezentativă, întrucât reflectă mai direct condițiile de piață pentru un activ similar și rezultă din compararea cu tranzacții/comparabile relevante, ceea ce este adecvat pentru estimarea valorii de piață în scopul garantării creditului ipotecar.</w:t>
+        <w:t>Abordarea prin piață a condus la o valoare de 135267.00 EUR, pe baza a 3 comparabile, cu selectarea comparabilului index 0 pentru prețul total. Pentru teren, analiza comparativă a condus la un nivel de 39.52 EUR/mp, ceea ce pentru 700 mp conduce la o valoare de 27664.00 EUR pentru componenta de teren, iar valoarea alocată construcțiilor este de 107603.00 EUR. În contextul evaluării pentru garantarea creditului ipotecar, abordarea prin piață este considerată metoda cea mai adecvată pentru concluzie, deoarece reflectă cel mai direct prețurile observabile ale unor proprietăți comparabile și comportamentul pieței pentru un activ similar.</w:t>
         <w:br/>
         <w:br/>
-        <w:t>Prin urmare, după analiza comparativă a indicațiilor obținute, valoarea finală reconciliată a proprietății imobiliare este de 135267.00 EUR, valoare estimată prin abordarea prin piață, iar alocarea internă a acesteia este de 27664.00 EUR pentru teren și 107603.00 EUR pentru construcții. Această concluzie este formulată pentru beneficiar / finantator: Banca Comerciala Exemplu S.A. și trebuie utilizată exclusiv în contextul și pentru scopul evaluării menționate.</w:t>
+        <w:t>Prin urmare, după analiza și reconcilierea rezultatelor, valoarea finală reconciliată a proprietății evaluate, exprimată în condițiile valorii de piață la data evaluării, este de 135267.00 EUR, valoare obținută prin abordarea prin piață. Această concluzie este susținută de caracterul comparabil al datelor de piață utilizate și de adecvarea acestei abordări la scopul evaluării declarat de Banca Comerciala Exemplu S.A..</w:t>
       </w:r>
     </w:p>
     <w:p>
@@ -1256,13 +1247,13 @@
     </w:p>
     <w:p>
       <w:r>
-        <w:t>Conform GEV 520, evaluarea pentru garantarea creditului trebuie să includă comentarii asupra factorilor relevanți pentru estimarea performanței garanției pe perioada creditului, respectiv activitatea curentă și tendințele pieței, cererea anterioară, curentă și viitoare pentru tipul de proprietate și localizare, cererea pentru alte utilizări și impactul evenimentelor previzibile asupra valorii viitoare a garanției.</w:t>
+        <w:t>În raport cu cerințele GEV 520, garanția analizată prezintă un nivel de adecvare corespunzător pentru scopul garantării creditului ipotecar, având în vedere că valoarea de piață reconcilitată este de 135267.00 EUR, determinată prin abordarea prin piață, iar proprietatea are un teren de 700 mp în intravilan și o arie utilă de 180 mp. Pentru creditor, comportamentul garanției pe durata creditului trebuie apreciat prin raportare la evoluția pieței relevante, la caracteristicile proprietății și la posibilitatea de valorificare într-un interval rezonabil de timp, în condiții de piață obișnuite.</w:t>
         <w:br/>
         <w:br/>
-        <w:t>În cazul proprietății evaluate, compusă din teren intravilan de 700 mp și construcție cu arie utilă de 180 mp și arie construită desfășurată de 220 mp, analiza de piață utilizată la estimarea valorii de piață indică o valoare finală reconciliată de 135267,00 EUR, stabilită prin metoda pieței, cu suport din comparabile selectate și o alocare a valorii de 27664,00 EUR pentru teren și 107603,00 EUR pentru construcții. Raportat la utilizarea actuală și la configurația proprietății, aceste rezultate pot indica o adecvare rezonabilă ca garanție pentru scopul declarat, cu mențiunea că valoarea obținută prin alocare nu reprezintă, în sine, o valoare de piață individuală.</w:t>
+        <w:t>Din perspectiva factorilor menționați în Anexa A5, analiza sugerează că performanța garanției depinde de menținerea cererii pentru tipul de proprietate evaluat și pentru localizarea sa, precum și de nivelul de absorbție al pieței pentru active similare. Valoarea obținută prin piață, pe baza a 3 comparabile, indică existența unui reper de tranzacționare pentru bunuri comparabile, iar alocarea de 107603.00 EUR pentru construcții și 27664.00 EUR pentru teren susține o structură valorică recognoscibilă în piață. În același timp, cererea pentru alte utilizări poate influența pozitiv sau negativ lichiditatea, în funcție de compatibilitatea caracteristicilor tehnice și funcționale ale imobilului cu alternativele de utilizare disponibile.</w:t>
         <w:br/>
         <w:br/>
-        <w:t>Din perspectiva lichidității și vandabilității, valoarea de piață estimată pe baza comparabilelor sugerează existența unui interes de piață pentru proprietăți similare, însă realizarea unei tranzacții depinde de menținerea cererii pentru acest tip de bun și de localizarea sa, precum și de condițiile generale ale pieței pe durata creditului. Cererea pentru alte utilizări poate influența favorabil sau nefavorabil valorificarea, în funcție de flexibilitatea proprietății și de eventuale modificări ale regimului de utilizare, iar evenimentele previzibile relevante — precum evoluții ale pieței imobiliare, modificări ale mediului economic sau ale condițiilor de finanțare — pot afecta nivelul valorii viitoare și timpul necesar valorificării garanției. În aceste condiții, garanția poate fi apreciată ca având o lichiditate moderată, vandabilitate bună în condiții de piață normale și un grad de adecvare corespunzător pentru garantarea creditului ipotecar acordat de Banca Comerciala Exemplu S.A.</w:t>
+        <w:t>Evenimentele previzibile pe perioada creditului, precum modificări ale condițiilor economice generale, ale nivelului de finanțare sau ale preferințelor pieței, pot afecta valoarea viitoare a garanției prin impact asupra cererii și asupra duratei de expunere la vânzare. În raport de rezultatul evaluării și de comparația cu valoarea prin cost de 178735.07 EUR, valoarea de piață adoptată indică o abordare prudentă pentru garantare, iar lichiditatea și vandabilitatea pot fi apreciate ca *moderate*, în măsura în care proprietatea este o locuință obișnuită, cu dimensiuni și amplasare susceptibile de interes pe piața locală. Gradul de adecvare ca garanție este susținut de existența unei valori de piață determinabile și de posibilitatea de valorificare prin piața imobiliară, însă rămâne dependent de evoluția cererii și de menținerea condițiilor de piață favorabile pe durata creditului.</w:t>
       </w:r>
     </w:p>
     <w:p>
@@ -1310,6 +1301,164 @@
     <w:p>
       <w:r>
         <w:t>Inregistrare BIG: raportul, avand utilizarea desemnata de garantare a imprumutului, se inregistreaza in Baza Imobiliara de Garantii (BIG), conform reglementarilor ANEVAR.</w:t>
+      </w:r>
+    </w:p>
+    <w:p>
+      <w:r>
+        <w:rPr>
+          <w:b/>
+        </w:rPr>
+        <w:t xml:space="preserve">Valoarea de lichidare (vanzare fortata): </w:t>
+      </w:r>
+      <w:r>
+        <w:t xml:space="preserve">valoarea de piata (135.267 EUR) ajustata cu un factor care reflecta vanzarea intr-un termen limitat. Estimare orientativa la factor 0.85: 114.977 EUR. </w:t>
+      </w:r>
+      <w:r>
+        <w:rPr>
+          <w:i/>
+        </w:rPr>
+        <w:t>ATENTIE: factorul final se stabileste de evaluator in functie de lichiditatea pietei si perioada de expunere (tipic 0,80–0,90); valoarea de mai sus este doar orientativa.</w:t>
+      </w:r>
+    </w:p>
+    <w:p>
+      <w:pPr>
+        <w:pStyle w:val="Heading1"/>
+      </w:pPr>
+      <w:r>
+        <w:t>CERTIFICAREA CONFORMITATII RAPORTULUI (GEV 520)</w:t>
+      </w:r>
+    </w:p>
+    <w:p>
+      <w:r>
+        <w:t>Checklist de conformitate — de verificat si bifat de evaluator inainte de transmitere (de aliniat la Anexa 1 a GEV 520 in vigoare):</w:t>
+      </w:r>
+    </w:p>
+    <w:p>
+      <w:pPr>
+        <w:pStyle w:val="ListBullet"/>
+      </w:pPr>
+      <w:r>
+        <w:t>☐ Valoarea estimata este valoarea de piata (SEV 102 / IVS 104), exprimata fara TVA.</w:t>
+      </w:r>
+    </w:p>
+    <w:p>
+      <w:pPr>
+        <w:pStyle w:val="ListBullet"/>
+      </w:pPr>
+      <w:r>
+        <w:t>☐ Data evaluarii si data raportului sunt precizate.</w:t>
+      </w:r>
+    </w:p>
+    <w:p>
+      <w:pPr>
+        <w:pStyle w:val="ListBullet"/>
+      </w:pPr>
+      <w:r>
+        <w:t>☐ Scopul evaluarii (garantarea imprumutului) este declarat in termenii de referinta.</w:t>
+      </w:r>
+    </w:p>
+    <w:p>
+      <w:pPr>
+        <w:pStyle w:val="ListBullet"/>
+      </w:pPr>
+      <w:r>
+        <w:t>☐ Proprietatea a fost identificata (cadastral / CF) si inspectata.</w:t>
+      </w:r>
+    </w:p>
+    <w:p>
+      <w:pPr>
+        <w:pStyle w:val="ListBullet"/>
+      </w:pPr>
+      <w:r>
+        <w:t>☐ Au fost utilizate minim 3 comparabile relevante.</w:t>
+      </w:r>
+    </w:p>
+    <w:p>
+      <w:pPr>
+        <w:pStyle w:val="ListBullet"/>
+      </w:pPr>
+      <w:r>
+        <w:t>☐ Ajustarile sunt justificate; ajustarile totale se incadreaza in limite rezonabile.</w:t>
+      </w:r>
+    </w:p>
+    <w:p>
+      <w:pPr>
+        <w:pStyle w:val="ListBullet"/>
+      </w:pPr>
+      <w:r>
+        <w:t>☐ Costul de inlocuire (unde se aplica) exclude profitul dezvoltatorului.</w:t>
+      </w:r>
+    </w:p>
+    <w:p>
+      <w:pPr>
+        <w:pStyle w:val="ListBullet"/>
+      </w:pPr>
+      <w:r>
+        <w:t>☐ Ipoteza de utilizare continua si ipotezele/conditiile limitative sunt precizate.</w:t>
+      </w:r>
+    </w:p>
+    <w:p>
+      <w:pPr>
+        <w:pStyle w:val="ListBullet"/>
+      </w:pPr>
+      <w:r>
+        <w:t>☐ A fost analizata cea mai buna utilizare (CMBU).</w:t>
+      </w:r>
+    </w:p>
+    <w:p>
+      <w:pPr>
+        <w:pStyle w:val="ListBullet"/>
+      </w:pPr>
+      <w:r>
+        <w:t>☐ A fost analizat riscul de garantie (lichiditate, vandabilitate, perioada de expunere).</w:t>
+      </w:r>
+    </w:p>
+    <w:p>
+      <w:pPr>
+        <w:pStyle w:val="ListBullet"/>
+      </w:pPr>
+      <w:r>
+        <w:t>☐ Valoarea de lichidare / vanzare fortata a fost estimata.</w:t>
+      </w:r>
+    </w:p>
+    <w:p>
+      <w:pPr>
+        <w:pStyle w:val="ListBullet"/>
+      </w:pPr>
+      <w:r>
+        <w:t>☐ Comparabilele provenite din oferte au fost ajustate la nivel de tranzactie.</w:t>
+      </w:r>
+    </w:p>
+    <w:p>
+      <w:pPr>
+        <w:pStyle w:val="ListBullet"/>
+      </w:pPr>
+      <w:r>
+        <w:t>☐ Sursele de date sunt mentionate si verificabile.</w:t>
+      </w:r>
+    </w:p>
+    <w:p>
+      <w:pPr>
+        <w:pStyle w:val="ListBullet"/>
+      </w:pPr>
+      <w:r>
+        <w:t>☐ Raportul se inregistreaza in BIG.</w:t>
+      </w:r>
+    </w:p>
+    <w:p>
+      <w:pPr>
+        <w:pStyle w:val="ListBullet"/>
+      </w:pPr>
+      <w:r>
+        <w:t>☐ Evaluatorul este autorizat ANEVAR si detine asigurare de raspundere profesionala.</w:t>
+      </w:r>
+    </w:p>
+    <w:p>
+      <w:pPr>
+        <w:pStyle w:val="ListBullet"/>
+      </w:pPr>
+      <w:r>
+        <w:t>☐ Declaratia de conformitate si de independenta este semnata.</w:t>
       </w:r>
     </w:p>
     <w:p>

</xml_diff>

<commit_message>
docs: regenerare raport Breaza (lichidare+certificare+consistenta) + prezentare
</commit_message>
<xml_diff>
--- a/docs/exemplu-raport-breaza.docx
+++ b/docs/exemplu-raport-breaza.docx
@@ -361,13 +361,16 @@
     </w:p>
     <w:p>
       <w:r>
-        <w:t>Se presupune că dreptul de proprietate asupra imobilului evaluat este valabil, opozabil și liber de sarcini, cu excepția eventualelor înscrieri sau restricții care ar putea fi identificate în documentele puse la dispoziție de Client demonstrativ. De asemenea, se consideră că toate informațiile furnizate sunt complete, corecte și pot fi utilizate la realizarea evaluării, fără a fi necesare verificări suplimentare de natură juridică, fiscală sau tehnică. Evaluarea a fost întocmită în contextul garantării creditului ipotecar, pentru Client demonstrativ, iar rezultatele sunt valabile în raport cu scopul declarat al misiunii.</w:t>
+        <w:t>Se presupune că dreptul de proprietate asupra imobilului evaluat este valabil, opozabil și liber de sarcini, cu excepția situațiilor care ar putea rezulta din documentele puse la dispoziție evaluatorului și care nu pot fi verificate în mod independent în cadrul misiunii. Totodată, se consideră că informațiile privind identificarea bunului, caracteristicile sale fizice și juridice, precum și datele utilizate în evaluare sunt complete și corecte, în limitele documentației disponibile.</w:t>
         <w:br/>
         <w:br/>
-        <w:t>Se presupune că imobilul are o structură de rezistență corespunzătoare, că elementele constructive sunt realizate și exploatate în condiții normale și că nu există vicii ascunse, defecte structurale sau degradări care nu pot fi identificate prin inspecția vizuală obișnuită. Totodată, nu au fost efectuate investigații tehnice invazive, sondaje, desfaceri, expertize de laborator ori studii geotehnice, astfel încât eventualele condiții nefavorabile din subsol, teren sau din elementele ascunse ale construcției pot influența valoarea și nu pot fi cuantificate în mod direct în cadrul prezentei lucrări.</w:t>
+        <w:t>Evaluarea a fost efectuată având la bază ipoteza că structura de rezistență, elementele constructive și instalațiile aferente sunt corespunzătoare utilizării curente și nu prezintă deficiențe ascunse care ar putea influența semnificativ valoarea de piață. Nu au fost realizate investigații tehnice distructive, expertize structurale detaliate, studii geotehnice, verificări ale terenului de fundare sau alte cercetări care depășesc cadrul obișnuit al unei inspecții de evaluare; prin urmare, orice condiții ascunse, neobservabile la data inspecției, rămân în afara responsabilității evaluatorului.</w:t>
         <w:br/>
         <w:br/>
-        <w:t>Raportul se bazează pe ipoteza că situația juridică și tehnică a proprietății rămâne conformă cu cele observate și cu datele puse la dispoziție la data evaluării, iar concluzia asupra valorii este formulată pentru valoarea de piață (SEV 102), exprimată în EUR, conform scopului declarat. Prezentul raport nu poate fi utilizat decât pentru destinația stabilită și nu poate fi extrapolat la alte scopuri, tranzacții sau contexte fără acordul evaluatorului și fără o analiză de evaluare distinctă. În lipsa unor informații contrare, se consideră că terenul este intravilan, cu suprafața de 700 mp, iar aria utilă și aria construită desfășurată sunt cele comunicate, respectiv 180 mp și 220 mp.</w:t>
+        <w:t>Se presupune, de asemenea, că imobilul respectă cerințele urbanistice și de reglementare aplicabile la data evaluării, în măsura în care acestea influențează utilizarea curentă și transferabilitatea proprietății. Orice informație privind suprafețele de teren și construcție, categoria de folosință, precum și celelalte date numerice utilizate au fost preluate exclusiv din datele furnizate în cadrul misiunii și au fost utilizate fără modificare.</w:t>
+        <w:br/>
+        <w:br/>
+        <w:t>Raportul de evaluare a fost întocmit exclusiv pentru scopul declarat, respectiv garantarea creditului ipotecar, în beneficiul Banca Comerciala Exemplu S.A., și nu poate fi utilizat, integral sau parțial, pentru alte scopuri decât cele pentru care a fost elaborat, fără acordul evaluatorului și fără reanalizarea contextului, a datelor de intrare și a ipotezelor avute în vedere.</w:t>
       </w:r>
     </w:p>
     <w:p>
@@ -390,13 +393,13 @@
     </w:p>
     <w:p>
       <w:r>
-        <w:t>Piața imobiliară locală relevantă pentru proprietatea evaluată poate fi caracterizată, pe baza comparabilelor utilizate, ca o piață activă, dar selectivă, în care formarea valorii este influențată de raportul dintre cerere și ofertă și de gradul de potrivire între proprietățile disponibile și cerințele cumpărătorilor. În contextul scopului evaluării – garantarea creditului ipotecar – analiza sugerează existența unei cereri funcționale pentru proprietăți similare, însă cu un comportament prudent al cumpărătorilor, reflectat în necesitatea selectării unui număr limitat de comparabile relevante și a unui comparabil principal pentru reconcilierea prin piață.</w:t>
+        <w:t>Piața imobiliară locală relevantă pentru proprietatea evaluată se caracterizează printr-un nivel al cererii corelat cu oferta existentă pentru proprietăți similare din zonă, iar analiza comparabilelor utilizate sugerează o piață activă, dar selectivă, în care diferențele de amplasament, suprafață și caracteristici constructive influențează semnificativ prețurile de tranzacționare. În acest context, prețul de piață este determinat în principal de interacțiunea dintre cerere și ofertă, iar lichiditatea poate fi apreciată ca fiind moderată, în sensul în care proprietățile comparabile se tranzacționează, însă selecția cumpărătorilor rămâne atentă la raportul dintre preț și caracteristicile individuale ale activului.</w:t>
         <w:br/>
         <w:br/>
-        <w:t>Oferta locală pentru astfel de proprietăți pare relativ restrânsă la nivelul caracteristicilor comparabile analizate, iar diferențele dintre amplasament, teren și construcție pot conduce la variații semnificative ale prețurilor observate. Pentru teren, valoarea rezultată prin comparație de 39,52 EUR/mp, aplicată la suprafața de 700 mp, indică un nivel de piață utilizat în evaluare de 27.664,00 EUR, ceea ce poate sugera că tranzacțiile comparabile au fost suficiente pentru conturarea unui reper de piață, dar nu foarte numeroase.</w:t>
+        <w:t>Pe baza celor 3 comparabile utilizate în abordarea prin piață, nivelul rezultat al valorii de piață indică faptul că proprietățile din segmentul analizat se tranzacționează la valori care reflectă atât terenul, cât și construcția existentă, cu o contribuție estimată pentru teren de 27.664,00 EUR, rezultată din 39,52 EUR/mp aplicat la 700 mp. Valoarea alocată construcțiilor este de 107.603,00 EUR, iar valoarea finală reconciliată este de 135.267,00 EUR, ceea ce sugerează o piață în care componenta terenului are o pondere relevantă, dar construcția rămâne determinantă pentru nivelul total al prețului.</w:t>
         <w:br/>
         <w:br/>
-        <w:t>Lichiditatea pieței poate fi apreciată ca moderată, în sensul că proprietățile cu caracteristici apropiate pot fi valorificate într-un orizont rezonabil de timp, însă numai dacă sunt poziționate competitiv față de oferta existentă. Reconcilierea finală la o valoare de piață de 135.267,00 EUR, cu alocarea a 107.603,00 EUR pentru construcții, arată că piața a susținut mai degrabă abordarea prin comparații decât rezultatul obținut prin cost, ceea ce poate indica faptul că prețurile de piață observate au reflectat mai bine comportamentul actual al cumpărătorilor decât costul de înlocuire net al proprietății.</w:t>
+        <w:t>Din perspectiva tendințelor observabile în cadrul eșantionului analizat, analiza sugerează o stabilitate relativă a pieței locale pentru proprietăți similare, fără indicii furnizate de datele disponibile care să impună o ajustare severă a valorii față de comparabilele selectate. Diferența dintre valoarea rezultată prin piață și valoarea obținută prin abordarea prin cost confirmă faptul că nivelul de piață este influențat de condițiile curente de tranzacționare, iar pentru scopul garantării creditului ipotecar concluzia de piață trebuie interpretată prudent, în limita comparabilelor avute la dispoziție.</w:t>
       </w:r>
     </w:p>
     <w:p>
@@ -429,13 +432,16 @@
     </w:p>
     <w:p>
       <w:r>
-        <w:t>Imobilul evaluat este identificat juridic prin elementele cadastrale și de carte funciară puse la dispoziție în documentația de evaluare, respectiv 2xxxx (demo) și CF xxxxx Breaza (demo), acestea reprezentând referințele de individualizare ale proprietății în evidențele de specialitate. Evaluarea a fost întocmită pentru Client demonstrativ, în vederea garantării unui credit ipotecar acordat de Banca Comerciala Exemplu S.A., având ca obiect valoarea de piață, în sensul SEV 102.</w:t>
+        <w:t>Imobilul evaluat este identificat juridic prin datele cadastrale și de carte funciară puse la dispoziție, respectiv 2xxxx (demo) și CF xxxxx Breaza (demo), iar analiza de față se întemeiază pe această identificare pentru delimitarea proprietății supuse evaluării. Scopul evaluării este garantarea unui credit ipotecar acordat de Client demonstrativ, iar valoarea de piață a fost estimată în conformitate cu SEV 102.</w:t>
         <w:br/>
         <w:br/>
-        <w:t>Din punct de vedere fizic, proprietatea este compusă dintr-un teren în suprafață de 700 mp, încadrat la categoria de folosință intravilan, și o construcție edificată pe acesta. Construcția are o arie utilă de 180 mp și o arie construită desfășurată de 220 mp, iar anul de referință considerat în evaluare este 2026. Regimul de înălțime al construcției nu a fost indicat în datele furnizate.</w:t>
+        <w:t>Proprietatea are un teren intravilan cu suprafața de 700 mp. Din punct de vedere fizic, terenul reprezintă suportul construcției analizate și face obiectul alocării valorii în cadrul abordării prin piață, rezultând o valoare aferentă terenului de 27.664,00 EUR, determinată prin comparație la un nivel de 39,52 EUR/mp.</w:t>
         <w:br/>
         <w:br/>
-        <w:t>Din analiza valorii, terenul a fost estimat prin comparație la 39,52 EUR/mp, rezultând o valoare de 27.664,00 EUR pentru suprafața de 700 mp. Valoarea alocată construcției este de 107.603,00 EUR, iar valoarea finală reconciliată a proprietății este de 135.267,00 EUR, prin abordarea prin piață. Abordarea prin cost a condus la o valoare de 178.735,07 EUR, pe baza unui CIB de 182.600,00 EUR, a unui Vcp de 16,00 ani și a unei deprecieri fizice de 17,27%, însă reconcilierea finală a fost realizată în favoarea rezultatului de piață.</w:t>
+        <w:t>Pe amplasament se află o construcție cu arie utilă de 180 mp și arie construită desfășurată de 220 mp, având an de referință 2026. În cadrul evaluării, valoarea alocată construcțiilor este de 107.603,00 EUR, elementele dimensionale fiind utilizate ca bază pentru caracterizarea fizică a imobilului și pentru corelarea cu analiza de piață.</w:t>
+        <w:br/>
+        <w:br/>
+        <w:t>Din punct de vedere funcțional și al încadrării generale, proprietatea evaluată prezintă caracteristicile unui imobil rezidențial sau cu utilizare compatibilă cu datele constructive disponibile, însă descrierea de față se limitează strict la elementele numerice furnizate și la identificarea juridică indicată prin 2xxxx (demo) și CF xxxxx Breaza (demo).</w:t>
       </w:r>
     </w:p>
     <w:p>
@@ -458,16 +464,13 @@
     </w:p>
     <w:p>
       <w:r>
-        <w:t>Analiza celei mai bune utilizări a proprietății a fost realizată prin raportare la cele patru criterii specifice: permisibilitatea legală, posibilitatea fizică, fezabilitatea financiară și maximul de productivitate. În cazul de față, proprietatea este o locuință existentă amplasată pe un teren intravilan de 700 mp, cu arie utilă de 180 mp și arie construită desfășurată de 220 mp, iar ipoteza de lucru relevantă pentru evaluare este menținerea utilizării rezidențiale curente, aceasta fiind în mod obișnuit compatibilă cu caracteristicile unui astfel de activ și cu comportamentul pieței pentru proprietăți similare.</w:t>
+        <w:t>Analiza celei mai bune utilizări indică faptul că, pentru proprietatea evaluată, utilizarea care îndeplinește cumulativ criteriile de permisibilitate legală, posibilitate fizică, fezabilitate financiară și maximă productivitate este, în mod rezonabil, utilizarea rezidențială existentă. Această concluzie este susținută de caracteristicile proprietății, respectiv teren intravilan în suprafață de 700 mp, cu construcție având Arie utilă (Au) de 180 mp și Arie construită desfășurată (Acd) de 220 mp, configurate pentru exploatare curentă în regim rezidențial.</w:t>
         <w:br/>
         <w:br/>
-        <w:t>Din punct de vedere al criteriului de permisibilitate legală, utilizarea rezidențială existentă este, în mod rezonabil, acceptabilă pentru o proprietate de tip intravilan, în absența unor informații care să indice restricții speciale sau incompatibilități urbanistice. Din punct de vedere fizic, suprafața terenului și configurația construcției permit exploatarea în continuare ca locuință, fără să rezulte din datele furnizate necesitatea unei reorganizări majore a amplasamentului sau a structurii existente. În acest context, analiza sugerează că utilizarea actuală este și posibilă fizic, și compatibilă cu caracteristicile proprietății.</w:t>
+        <w:t>Din punct de vedere fizic, amplasamentul și parametrii construiți permit continuarea utilizării actuale, fără a rezulta, pe baza datelor disponibile, necesitatea unei restructurări care să modifice radical destinația proprietății. Din punct de vedere legal, utilizarea rezidențială apare ca fiind compatibilă cu natura proprietății prezentate în evaluare, în condițiile în care datele furnizate nu indică restricții care să impună o utilizare alternativă. Prin urmare, analiza sugerează că utilizarea curentă este o opțiune realistă și coerentă cu profilul activului.</w:t>
         <w:br/>
         <w:br/>
-        <w:t>Sub aspectul fezabilității financiare, rezultatele abordării prin piață indică o valoare de piață de 135267.00 EUR, în timp ce abordarea prin cost conduce la o valoare de 178735.07 EUR, cu o valoare alocată terenului de 27664.00 EUR și o valoare alocată construcțiilor de 107603.00 EUR. Diferența dintre rezultatele abordărilor reflectă specificul pieței și al proprietății analizate, însă, pentru scopul evaluării, nivelul valorii de piață obținut prin comparații este relevant pentru susținerea unei utilizări curente care poate fi comercializată în condițiile pieței. În lipsa unor date care să susțină o conversie mai profitabilă, utilizarea rezidențială existentă apare ca fiind fezabilă financiar și, totodată, consistentă cu comportamentul pieței pentru bunuri comparabile.</w:t>
-        <w:br/>
-        <w:br/>
-        <w:t>În consecință, cea mai bună utilizare a proprietății, în accepțiunea utilizării care maximizează valoarea în condițiile date, este menținerea utilizării rezidențiale existente. Această concluzie este susținută de faptul că utilizarea curentă îndeplinește, în mod rezonabil, testele de permisibilitate legală, posibilitate fizică și fezabilitate financiară, iar din datele disponibile nu rezultă o alternativă care să indice un potențial superior de valorificare în raport cu utilizarea actuală.</w:t>
+        <w:t>Sub aspect financiar, valoarea de piață reconcilată prin abordarea prin piață este de 135267.00 EUR, în timp ce abordarea prin cost conduce la o valoare de 178735.07 EUR; diferența dintre aceste rezultate poate indica faptul că piața atribuie proprietății o valoare mai degrabă aliniată utilizării existente decât unei ipoteze de dezvoltare alternativă. Totodată, alocarea valorii relevă o componentă de 107603.00 EUR pentru construcții și 27664.00 EUR pentru teren, ceea ce sprijină concluzia că ansamblul imobiliar este valorificat coerent în forma sa actuală. În contextul scopului evaluării, respectiv garantarea creditului ipotecar, utilizarea rezidențială existentă pare a fi cea mai bună utilizare, fiind și maxim productivă în condițiile informațiilor disponibile.</w:t>
       </w:r>
     </w:p>
     <w:p>
@@ -1054,10 +1057,13 @@
     </w:p>
     <w:p>
       <w:r>
-        <w:t>Justificarea ajustarilor aplicate se bazeaza pe analiza comparativa a caracteristicilor fizice, de amplasare si ale tranzactiei intre proprietatea subiect si comparabilele identificate, in conformitate cu principiile economice ale substitutiei si anticiparii beneficiilor. In etapa de tranzactie, ajustarile au fost aplicate pentru a corecta diferentele legate de conditiile de vanzare, motivatia partilor si contextul pietei, astfel incat preturile comparabile sa fie aduse la un nivel de comparabilitate cu o tranzactie ipotetica de tip pietei, in conditii normale, intre parti aflate in cunostinta de cauza si fara relatii de dependenta. In etapa proprietatii, ajustarile au vizat diferentele semnificative privind suprafata utila, suprafata construita desfasurata, anul de constructie, starea fizica, calitatea finisajelor, dotarile si alte caracteristici relevante care influenteaza direct pretul per unitate de suprafata sau per imobil.</w:t>
+        <w:t>Ajustările din grila de comparație au fost aplicate pentru a aduce prețurile comparabile la nivelul caracteristicilor proprietății subiect, în acord cu logica abordării prin piață, care pornește de la prețurile proprietăților similare și le ajustează în funcție de deosebirile față de activul evaluat. În etapa de tranzacție, ajustările reflectă diferențele de piață dintre comparabile și proprietatea subiect, iar în etapa de proprietate se corectează diferențele specifice ale imobilului, precum terenul, suprafața utilă, suprafața construită desfășurată, configurația și utilitatea economică, astfel încât comparația finală să fie realizată pe o bază cât mai omogenă.</w:t>
         <w:br/>
         <w:br/>
-        <w:t>Comparabilul selectat (index 0) a fost ales ca referinta principala deoarece prezinta cele mai mici diferente brute de caracteristici fata de proprietatea subiect, ceea ce se traduce printr-o suma de ajustari brute minima in raport cu celelalte comparabile. Aceasta situatie indica o similaritate sporita in ceea ce priveste amplasarea, tipul de constructie, suprafata utila, suprafata construita desfasurata, anul de constructie si conditiile de exploatare, fapt care reduce incertitudinea asociata ajustarilor si sporeste gradul de relevanta al indicatiei de valoare obtinuta prin metoda comparatiei directe. Ajustarile aplicate au fost cuantificate pe baza analizei pietei locale, a informatiilor disponibile privind tranzactiile recente si a rationamentului profesional al evaluatorului, asigurandu-se ca fiecare corectie reflecta o diferenta reala si cuantificabila intre proprietatea subiect si comparabil, fara a depasi limitele rezonabile ale influentei acelei caracteristici asupra pretului de piata.</w:t>
+        <w:t>Logica utilizată în selecția și ajustarea comparabilelor a urmărit identificarea celor mai apropiate tranzacții de proprietatea evaluată, cu accent pe similitudinea dintre caracteristicile relevante și pe reducerea distorsiunilor de preț prin ajustări prudente. Această abordare este compatibilă cu cerința ca evaluatorul să compare proprietăți reale și să explice raționamentul de selecție și ajustare pe baza datelor utilizate. În consecință, ajustările au rolul de a reflecta doar diferențele identificate și cuantificabile dintre comparabile și subiect, fără a altera baza de piață a analizei.</w:t>
+        <w:br/>
+        <w:br/>
+        <w:t>Comparabilul selectat a fost cel cu ajustarea brută minimă deoarece a prezentat, dintre cele 3 comparabile analizate, cel mai redus nivel de diferență cumulată față de proprietatea subiect, ceea ce indică o proximitate mai mare în raport cu caracteristicile esențiale ale evaluării. Din punct de vedere metodologic, un comparabil cu ajustări brute mai mici este, în general, preferabil deoarece necesită mai puține corecții și reduce riscul ca valoarea estimată să fie influențată semnificativ de diferențe structurale între proprietăți. În cazul de față, această selecție a susținut obținerea unei valori finale reconciliate de 135267.00 EUR, cu alocarea valorii în 107603.00 EUR pentru construcții și 27664.00 EUR pentru teren, în concordanță cu datele furnizate.</w:t>
       </w:r>
     </w:p>
     <w:p>
@@ -1080,16 +1086,13 @@
     </w:p>
     <w:p>
       <w:r>
-        <w:t>Reconcilierea rezultatelor a avut în vedere compararea celor două abordări aplicate, respectiv abordarea prin piață și abordarea prin cost, în raport cu scopul evaluării, acela de garantare a creditului ipotecar, și cu definiția valorii de piață. În fundamentarea concluziei asupra valorii, rezultatele obținute prin metode diferite se analizează comparativ, iar valoarea finală se selectează dintre valorile estimate ca fiind cea mai potrivită situației concrete a proprietății evaluate.</w:t>
+        <w:t>Abordarea prin piață a condus la o valoare de 135267.00 EUR, rezultat obținut pe baza comparabilelor disponibile, cu selectarea comparabilului index 0 din totalul de 3 comparabile analizate. Pentru teren, analiza prin comparație a indicat o valoare de 39.52 EUR/mp, ceea ce conduce la 27664.00 EUR pentru suprafața de 700 mp; diferența până la valoarea totală a fost alocată construcțiilor, respectiv 107603.00 EUR.</w:t>
         <w:br/>
         <w:br/>
-        <w:t>Abordarea prin cost a condus la o valoare de 178735.07 EUR, determinată pe baza unui CIB de 182600.00 EUR, a unei vechimi constructive de 16.00 ani, a unei deprecieri fizice de 17.27% și a unui CIN de 151071.07 EUR. Această abordare oferă un reper util privind nivelul investiției necesare pentru recrearea sau înlocuirea bunului, însă în cazul de față poate avea o relevanță mai redusă în estimarea valorii de piață, deoarece nu surprinde direct condițiile tranzacțiilor comparabile și reacția pieței la caracteristicile specifice ale proprietății.</w:t>
+        <w:t>Abordarea prin cost a condus la o valoare de 178735.07 EUR, determinată pe baza CIB = 182600.00 EUR, a unei durate economice de Vcp = 16.00 ani și a unei deprecieri fizice de 17.27%, cu rezultat intermediar CIN = 151071.07 EUR. Nivelul obținut prin cost este superior valorii rezultate prin piață, ceea ce poate indica influența condițiilor efective de tranzacționare și a preferințelor pieței asupra acestui tip de proprietate.</w:t>
         <w:br/>
         <w:br/>
-        <w:t>Abordarea prin piață a condus la o valoare de 135267.00 EUR, pe baza a 3 comparabile, cu selectarea comparabilului index 0 pentru prețul total. Pentru teren, analiza comparativă a condus la un nivel de 39.52 EUR/mp, ceea ce pentru 700 mp conduce la o valoare de 27664.00 EUR pentru componenta de teren, iar valoarea alocată construcțiilor este de 107603.00 EUR. În contextul evaluării pentru garantarea creditului ipotecar, abordarea prin piață este considerată metoda cea mai adecvată pentru concluzie, deoarece reflectă cel mai direct prețurile observabile ale unor proprietăți comparabile și comportamentul pieței pentru un activ similar.</w:t>
-        <w:br/>
-        <w:br/>
-        <w:t>Prin urmare, după analiza și reconcilierea rezultatelor, valoarea finală reconciliată a proprietății evaluate, exprimată în condițiile valorii de piață la data evaluării, este de 135267.00 EUR, valoare obținută prin abordarea prin piață. Această concluzie este susținută de caracterul comparabil al datelor de piață utilizate și de adecvarea acestei abordări la scopul evaluării declarat de Banca Comerciala Exemplu S.A..</w:t>
+        <w:t>În reconcilierea rezultatelor, s-a acordat pondere preponderentă abordării prin piață, având în vedere scopul evaluării, respectiv garantarea creditului ipotecar, precum și faptul că valoarea de piață trebuie să reflecte comportamentul participanților pe piață în condiții de tranzacționare comparabile. În consecință, valoarea finală reconciliată a proprietății este de 135267.00 EUR, aceasta reprezentând opinia evaluatorului asupra valorii de piață la data evaluării, în ipotezele și limitele prezentului raport.</w:t>
       </w:r>
     </w:p>
     <w:p>
@@ -1247,13 +1250,16 @@
     </w:p>
     <w:p>
       <w:r>
-        <w:t>În raport cu cerințele GEV 520, garanția analizată prezintă un nivel de adecvare corespunzător pentru scopul garantării creditului ipotecar, având în vedere că valoarea de piață reconcilitată este de 135267.00 EUR, determinată prin abordarea prin piață, iar proprietatea are un teren de 700 mp în intravilan și o arie utilă de 180 mp. Pentru creditor, comportamentul garanției pe durata creditului trebuie apreciat prin raportare la evoluția pieței relevante, la caracteristicile proprietății și la posibilitatea de valorificare într-un interval rezonabil de timp, în condiții de piață obișnuite.</w:t>
+        <w:t>Riscul asociat garanției este apreciat ca fiind moderat, în condițiile în care proprietatea evaluată are o valoare de piață estimată la 135267.00 EUR, determinată prin abordarea prin piață, iar ponderea principală în valoare revine construcției, respectiv 107603.00 EUR, în timp ce terenului îi este alocată o valoare de 27664.00 EUR. Pentru garanția destinată creditului ipotecar, aceste elemente sugerează că bunul prezintă un nivel rezonabil de adecvare ca garanție, însă performanța sa pe durata creditului depinde de evoluția condițiilor de piață și de menținerea caracteristicilor actuale ale imobilului.</w:t>
         <w:br/>
         <w:br/>
-        <w:t>Din perspectiva factorilor menționați în Anexa A5, analiza sugerează că performanța garanției depinde de menținerea cererii pentru tipul de proprietate evaluat și pentru localizarea sa, precum și de nivelul de absorbție al pieței pentru active similare. Valoarea obținută prin piață, pe baza a 3 comparabile, indică existența unui reper de tranzacționare pentru bunuri comparabile, iar alocarea de 107603.00 EUR pentru construcții și 27664.00 EUR pentru teren susține o structură valorică recognoscibilă în piață. În același timp, cererea pentru alte utilizări poate influența pozitiv sau negativ lichiditatea, în funcție de compatibilitatea caracteristicilor tehnice și funcționale ale imobilului cu alternativele de utilizare disponibile.</w:t>
+        <w:t>Din perspectiva factorilor relevanți pentru performanța garanției pe perioada creditului, activitatea curentă și tendințele pieței relevante pot influența direct nivelul de valorificare în eventualitatea executării silite, iar cererea pentru tipul de bun și pentru localizarea acestuia este esențială pentru aprecierea lichidității. În absența unor date suplimentare privind piața locală, analiza sugerează că existența a 3 comparabile utilizate în abordarea prin piață susține o bază de analiză pentru evaluare, dar nu permite o concluzie mai fermă asupra profunzimii pieței sau a vitezei de vânzare.</w:t>
         <w:br/>
         <w:br/>
-        <w:t>Evenimentele previzibile pe perioada creditului, precum modificări ale condițiilor economice generale, ale nivelului de finanțare sau ale preferințelor pieței, pot afecta valoarea viitoare a garanției prin impact asupra cererii și asupra duratei de expunere la vânzare. În raport de rezultatul evaluării și de comparația cu valoarea prin cost de 178735.07 EUR, valoarea de piață adoptată indică o abordare prudentă pentru garantare, iar lichiditatea și vandabilitatea pot fi apreciate ca *moderate*, în măsura în care proprietatea este o locuință obișnuită, cu dimensiuni și amplasare susceptibile de interes pe piața locală. Gradul de adecvare ca garanție este susținut de existența unei valori de piață determinabile și de posibilitatea de valorificare prin piața imobiliară, însă rămâne dependent de evoluția cererii și de menținerea condițiilor de piață favorabile pe durata creditului.</w:t>
+        <w:t>Cererea anterioară, curentă și viitoare pentru acest tip de proprietate, precum și posibilitatea utilizării alternative a terenului și a construcției, pot îmbunătăți sau diminua vandabilitatea garanției. De asemenea, evenimentele previzibile pe parcursul perioadei de credit — precum schimbări ale contextului economic, ale preferințelor cumpărătorilor sau ale condițiilor de utilizare — pot afecta valoarea viitoare a garanției; prin urmare, valoarea estimată trebuie privită ca fiind sensibilă la evoluțiile pieței și la starea fizică a imobilului.</w:t>
+        <w:br/>
+        <w:br/>
+        <w:t>În ansamblu, proprietatea poate fi considerată o garanție cu lichiditate medie și vandabilitate rezonabilă, cu condiția menținerii cererii pentru astfel de bunuri în zona analizată. Gradul de adecvare ca garanție este susținut de faptul că valoarea de piață a fost determinată prin metoda comparativă, însă riscul de garanție nu poate fi exclus, întrucât realizarea valorii estimate depinde de comportamentul viitor al pieței și de condițiile concrete de valorificare la momentul eventualei executări.</w:t>
       </w:r>
     </w:p>
     <w:p>

</xml_diff>

<commit_message>
Coadă de import persistentă (SQLite) + aliniere materiale extensie
- storage: migrare schema v2 (tabela import_anunturi, dedup pe sursa_url UNIQUE)
  + metode adauga/listeaza/sterge_anunturi_importate
- descoperire router folosește storage (persistent) în loc de coada in-memory
- Deps: scos câmpul import_coada (înlocuit de SQLite)
- +3 teste (persistență, dedup la nivel SQLite, migrare v1→v2)
- pptx: slide „Date externe" actualizat să reflecte importul prin extensie
- 387 passed, ruff clean

Co-Authored-By: Claude Opus 4.8 (1M context) <noreply@anthropic.com>
</commit_message>
<xml_diff>
--- a/docs/exemplu-raport-breaza.docx
+++ b/docs/exemplu-raport-breaza.docx
@@ -361,16 +361,13 @@
     </w:p>
     <w:p>
       <w:r>
-        <w:t>Se presupune că dreptul de proprietate asupra imobilului evaluat este valabil, opozabil și liber de sarcini, cu excepția situațiilor care ar putea rezulta din documentele puse la dispoziție evaluatorului și care nu pot fi verificate în mod independent în cadrul misiunii. Totodată, se consideră că informațiile privind identificarea bunului, caracteristicile sale fizice și juridice, precum și datele utilizate în evaluare sunt complete și corecte, în limitele documentației disponibile.</w:t>
+        <w:t>În elaborarea prezentei evaluări se presupune că dreptul de proprietate asupra imobilului evaluat este valabil, opozabil terților și transferabil, iar bunul este liber de sarcini, litigii, servituți ori alte limitări de natură juridică, cu excepția celor care ar putea fi menționate expres în documentele puse la dispoziție. Se mai presupune că informațiile furnizate de Client demonstrativ sunt complete, corecte și pot fi utilizate fără verificări suplimentare de natură juridică, tehnică sau fiscală, iar interpretarea acestora a fost realizată în limitele scopului evaluării.</w:t>
         <w:br/>
         <w:br/>
-        <w:t>Evaluarea a fost efectuată având la bază ipoteza că structura de rezistență, elementele constructive și instalațiile aferente sunt corespunzătoare utilizării curente și nu prezintă deficiențe ascunse care ar putea influența semnificativ valoarea de piață. Nu au fost realizate investigații tehnice distructive, expertize structurale detaliate, studii geotehnice, verificări ale terenului de fundare sau alte cercetări care depășesc cadrul obișnuit al unei inspecții de evaluare; prin urmare, orice condiții ascunse, neobservabile la data inspecției, rămân în afara responsabilității evaluatorului.</w:t>
+        <w:t>Se presupune, de asemenea, că imobilul are o structură de rezistență corespunzătoare și că nu există vicii ascunse, degradări structurale ori defecte de construcție care să nu poată fi identificate prin inspecția vizuală și prin documentele analizate. Nu au fost efectuate investigații distructive, sondaje, expertize tehnice detaliate, verificări geotehnice sau analize asupra elementelor ascunse, astfel încât orice aspect care ar putea fi relevat numai prin astfel de proceduri a fost exclus din aria de examinare a prezentei lucrări.</w:t>
         <w:br/>
         <w:br/>
-        <w:t>Se presupune, de asemenea, că imobilul respectă cerințele urbanistice și de reglementare aplicabile la data evaluării, în măsura în care acestea influențează utilizarea curentă și transferabilitatea proprietății. Orice informație privind suprafețele de teren și construcție, categoria de folosință, precum și celelalte date numerice utilizate au fost preluate exclusiv din datele furnizate în cadrul misiunii și au fost utilizate fără modificare.</w:t>
-        <w:br/>
-        <w:br/>
-        <w:t>Raportul de evaluare a fost întocmit exclusiv pentru scopul declarat, respectiv garantarea creditului ipotecar, în beneficiul Banca Comerciala Exemplu S.A., și nu poate fi utilizat, integral sau parțial, pentru alte scopuri decât cele pentru care a fost elaborat, fără acordul evaluatorului și fără reanalizarea contextului, a datelor de intrare și a ipotezelor avute în vedere.</w:t>
+        <w:t>Raportul a fost întocmit exclusiv pentru scopul declarat, respectiv garantarea creditului ipotecar în favoarea Băncii Comerciale Exemplu S.A., și numai pentru estimarea valorii de piață la data raportării, în condițiile și ipotezele expuse. Utilizarea raportului în alt scop, de către alt beneficiar sau pentru altă decizie decât cea pentru care a fost comandat, nu este permisă fără acordul evaluatorului și fără o eventuală actualizare a analizelor, datelor și concluziei de valoare.</w:t>
       </w:r>
     </w:p>
     <w:p>
@@ -393,13 +390,13 @@
     </w:p>
     <w:p>
       <w:r>
-        <w:t>Piața imobiliară locală relevantă pentru proprietatea evaluată se caracterizează printr-un nivel al cererii corelat cu oferta existentă pentru proprietăți similare din zonă, iar analiza comparabilelor utilizate sugerează o piață activă, dar selectivă, în care diferențele de amplasament, suprafață și caracteristici constructive influențează semnificativ prețurile de tranzacționare. În acest context, prețul de piață este determinat în principal de interacțiunea dintre cerere și ofertă, iar lichiditatea poate fi apreciată ca fiind moderată, în sensul în care proprietățile comparabile se tranzacționează, însă selecția cumpărătorilor rămâne atentă la raportul dintre preț și caracteristicile individuale ale activului.</w:t>
+        <w:t>Piața imobiliară locală relevantă pentru proprietatea evaluată poate fi caracterizată, pe baza comparabilelor utilizate, ca fiind o piață activă, dar selectivă, în care nivelul de preț este influențat de poziționare, caracteristicile terenului și ale construcției, precum și de ajustările specifice fiecărei oferte. În cadrul analizei prin piață au fost identificate 3 comparabile, iar selectarea comparabilului index 0 pentru valoarea totală sugerează existența unor bunuri similare disponibile, însă nu neapărat omogene din punctul de vedere al atributelor relevante de evaluare.</w:t>
         <w:br/>
         <w:br/>
-        <w:t>Pe baza celor 3 comparabile utilizate în abordarea prin piață, nivelul rezultat al valorii de piață indică faptul că proprietățile din segmentul analizat se tranzacționează la valori care reflectă atât terenul, cât și construcția existentă, cu o contribuție estimată pentru teren de 27.664,00 EUR, rezultată din 39,52 EUR/mp aplicat la 700 mp. Valoarea alocată construcțiilor este de 107.603,00 EUR, iar valoarea finală reconciliată este de 135.267,00 EUR, ceea ce sugerează o piață în care componenta terenului are o pondere relevantă, dar construcția rămâne determinantă pentru nivelul total al prețului.</w:t>
+        <w:t>Din perspectiva cererii și ofertei, analiza sugerează o piață cu cerere prezentă pentru proprietăți comparabile, dar cu ofertă suficientă pentru a impune prudență în estimarea valorii de piață. Pentru terenurile comparabile, prețul de referință utilizat de 39.52 EUR/mp indică un nivel de piață utilizabil pentru segmentul analizat, iar faptul că valoarea terenului a fost derivată prin comparație cu un comparabil selectat din 3 comparabile de teren confirmă că au existat repere suficiente pentru fundamentarea estimării.</w:t>
         <w:br/>
         <w:br/>
-        <w:t>Din perspectiva tendințelor observabile în cadrul eșantionului analizat, analiza sugerează o stabilitate relativă a pieței locale pentru proprietăți similare, fără indicii furnizate de datele disponibile care să impună o ajustare severă a valorii față de comparabilele selectate. Diferența dintre valoarea rezultată prin piață și valoarea obținută prin abordarea prin cost confirmă faptul că nivelul de piață este influențat de condițiile curente de tranzacționare, iar pentru scopul garantării creditului ipotecar concluzia de piață trebuie interpretată prudent, în limita comparabilelor avute la dispoziție.</w:t>
+        <w:t>Lichiditatea pieței poate fi apreciată ca moderată, întrucât evaluarea s-a putut baza pe comparabile de piață, dar a fost necesară selecția atentă a acestora și alocarea distinctă a valorii între teren și construcții. Valoarea finală reconciliată de 135267.00 EUR, obținută prin abordarea prin piață și susținută de alocarea de 27664.00 EUR pentru teren și 107603.00 EUR pentru construcții, indică o apreciere prudentă a nivelului de piață la data evaluării, în concordanță cu utilizarea proprietății pentru garantarea unui credit ipotecar.</w:t>
       </w:r>
     </w:p>
     <w:p>
@@ -432,16 +429,13 @@
     </w:p>
     <w:p>
       <w:r>
-        <w:t>Imobilul evaluat este identificat juridic prin datele cadastrale și de carte funciară puse la dispoziție, respectiv 2xxxx (demo) și CF xxxxx Breaza (demo), iar analiza de față se întemeiază pe această identificare pentru delimitarea proprietății supuse evaluării. Scopul evaluării este garantarea unui credit ipotecar acordat de Client demonstrativ, iar valoarea de piață a fost estimată în conformitate cu SEV 102.</w:t>
+        <w:t>Imobilul evaluat este identificat prin elementele cadastrale și de carte funciară puse la dispoziție în documentația de lucru, respectiv 2xxxx (demo) și CF xxxxx Breaza (demo). Descrierea juridică are în vedere individualizarea proprietății în sistemul de evidență cadastrală și funciară, fără a se formula alte precizări juridice care nu rezultă din datele furnizate.</w:t>
         <w:br/>
         <w:br/>
-        <w:t>Proprietatea are un teren intravilan cu suprafața de 700 mp. Din punct de vedere fizic, terenul reprezintă suportul construcției analizate și face obiectul alocării valorii în cadrul abordării prin piață, rezultând o valoare aferentă terenului de 27.664,00 EUR, determinată prin comparație la un nivel de 39,52 EUR/mp.</w:t>
+        <w:t>Din punct de vedere fizic, proprietatea este amplasată pe un teren intravilan cu suprafața de 700 mp. Terenul reprezintă suportul imobilului și constituie componenta funciară principală avută în vedere la evaluare.</w:t>
         <w:br/>
         <w:br/>
-        <w:t>Pe amplasament se află o construcție cu arie utilă de 180 mp și arie construită desfășurată de 220 mp, având an de referință 2026. În cadrul evaluării, valoarea alocată construcțiilor este de 107.603,00 EUR, elementele dimensionale fiind utilizate ca bază pentru caracterizarea fizică a imobilului și pentru corelarea cu analiza de piață.</w:t>
-        <w:br/>
-        <w:br/>
-        <w:t>Din punct de vedere funcțional și al încadrării generale, proprietatea evaluată prezintă caracteristicile unui imobil rezidențial sau cu utilizare compatibilă cu datele constructive disponibile, însă descrierea de față se limitează strict la elementele numerice furnizate și la identificarea juridică indicată prin 2xxxx (demo) și CF xxxxx Breaza (demo).</w:t>
+        <w:t>Pe amplasament se află o construcție cu arie utilă de 180 mp și arie construită desfășurată de 220 mp, având ca an de referință 2026. În ansamblu, proprietatea prezintă o configurație compatibilă cu utilizarea rezidențială sau mixtă doar în măsura în care aceasta rezultă din documentele tehnice și juridice ale imobilului, iar pentru scopul prezentului raport este tratată ca un bun imobiliar individualizat prin terenul intravilan și construcția existentă.</w:t>
       </w:r>
     </w:p>
     <w:p>
@@ -464,13 +458,16 @@
     </w:p>
     <w:p>
       <w:r>
-        <w:t>Analiza celei mai bune utilizări indică faptul că, pentru proprietatea evaluată, utilizarea care îndeplinește cumulativ criteriile de permisibilitate legală, posibilitate fizică, fezabilitate financiară și maximă productivitate este, în mod rezonabil, utilizarea rezidențială existentă. Această concluzie este susținută de caracteristicile proprietății, respectiv teren intravilan în suprafață de 700 mp, cu construcție având Arie utilă (Au) de 180 mp și Arie construită desfășurată (Acd) de 220 mp, configurate pentru exploatare curentă în regim rezidențial.</w:t>
+        <w:t>Analiza celei mai bune utilizări a proprietății a fost realizată în ipoteza menținerii destinației curente, având în vedere că, în contextul evaluării pentru garantarea creditului ipotecar, utilizarea rezidențială existentă este, în mod rezonabil, utilizarea care răspunde cel mai bine criteriilor de piață și caracteristicilor bunului. CMBU trebuie să fie permisă legal, posibilă fizic, fezabilă financiar și maxim productivă; în cazul de față, utilizarea rezidențială existentă îndeplinește în mod aparent aceste cerințe, fără a rezulta din datele disponibile elemente care să susțină o reconversie cu valoare superioară.</w:t>
         <w:br/>
         <w:br/>
-        <w:t>Din punct de vedere fizic, amplasamentul și parametrii construiți permit continuarea utilizării actuale, fără a rezulta, pe baza datelor disponibile, necesitatea unei restructurări care să modifice radical destinația proprietății. Din punct de vedere legal, utilizarea rezidențială apare ca fiind compatibilă cu natura proprietății prezentate în evaluare, în condițiile în care datele furnizate nu indică restricții care să impună o utilizare alternativă. Prin urmare, analiza sugerează că utilizarea curentă este o opțiune realistă și coerentă cu profilul activului.</w:t>
+        <w:t>Din punct de vedere legal, proprietatea este situată în intravilan, pe un teren de 700 mp, ceea ce susține încadrarea într-o utilizare urbană curentă, compatibilă cu funcțiunea rezidențială existentă. Din punct de vedere fizic, terenul și îmbunătățirile aferente permit exploatarea ca proprietate construită cu arie utilă de 180 mp și arie construită desfășurată de 220 mp, parametri care indică o utilizare rezidențială coerentă cu dimensiunea și structura amplasamentului. Nu au fost furnizate date care să indice constrângeri fizice sau juridice ce ar impune o altă destinație.</w:t>
         <w:br/>
         <w:br/>
-        <w:t>Sub aspect financiar, valoarea de piață reconcilată prin abordarea prin piață este de 135267.00 EUR, în timp ce abordarea prin cost conduce la o valoare de 178735.07 EUR; diferența dintre aceste rezultate poate indica faptul că piața atribuie proprietății o valoare mai degrabă aliniată utilizării existente decât unei ipoteze de dezvoltare alternativă. Totodată, alocarea valorii relevă o componentă de 107603.00 EUR pentru construcții și 27664.00 EUR pentru teren, ceea ce sprijină concluzia că ansamblul imobiliar este valorificat coerent în forma sa actuală. În contextul scopului evaluării, respectiv garantarea creditului ipotecar, utilizarea rezidențială existentă pare a fi cea mai bună utilizare, fiind și maxim productivă în condițiile informațiilor disponibile.</w:t>
+        <w:t>Sub aspectul fezabilității financiare, analiza de piață și rezultatele celorlalte abordări de evaluare susțin menținerea utilizării curente. Valoarea de piață reconciliată este de 135267.00 EUR, iar abordarea prin cost indică o valoare a construcțiilor alocată de 107603.00 EUR, la care se adaugă valoarea terenului determinată prin comparație de 27664.00 EUR. Această structură a valorii sugerează că utilizarea rezidențială existentă este susținută de piață și poate fi considerată fezabilă financiar în condițiile date, fără indicii privind o alternativă de utilizare care să genereze o valoare reziduală superioară.</w:t>
+        <w:br/>
+        <w:br/>
+        <w:t>Prin urmare, utilizarea rezidențială existentă este considerată cea mai bună utilizare a proprietății, întrucât este compatibilă cu regimul legal, este posibilă fizic, este susținută de rezultatele evaluării și pare să ofere cea mai bună valorificare în condițiile actuale ale pieței. În absența unor date suplimentare privind reglementări urbanistice mai favorabile sau oportunități de dezvoltare cu valoare mai mare, concluzia analizei este că menținerea destinației rezidențiale curente reprezintă opțiunea maxim productivă pentru proprietatea evaluată.</w:t>
       </w:r>
     </w:p>
     <w:p>
@@ -1057,13 +1054,13 @@
     </w:p>
     <w:p>
       <w:r>
-        <w:t>Ajustările din grila de comparație au fost aplicate pentru a aduce prețurile comparabile la nivelul caracteristicilor proprietății subiect, în acord cu logica abordării prin piață, care pornește de la prețurile proprietăților similare și le ajustează în funcție de deosebirile față de activul evaluat. În etapa de tranzacție, ajustările reflectă diferențele de piață dintre comparabile și proprietatea subiect, iar în etapa de proprietate se corectează diferențele specifice ale imobilului, precum terenul, suprafața utilă, suprafața construită desfășurată, configurația și utilitatea economică, astfel încât comparația finală să fie realizată pe o bază cât mai omogenă.</w:t>
+        <w:t>Ajustările aplicate în grila de comparație au urmărit aducerea prețurilor comparabile la nivelul proprietății subiect, astfel încât diferențele dintre proprietăți să fie reflectate în mod coerent și comparabil. În abordarea prin piață, prețurile proprietăților comparabile se ajustează în funcție de deosebirile existente între caracteristicile acestora și cele ale proprietății evaluate, pentru a obține o indicație cât mai apropiată de prețul probabil de tranzacționare al subiectului. În acest sens, ajustările de la etapa de tranzacție și cele de la etapa de proprietate au roluri distincte, dar complementare: primele normalizează diferențele aferente condițiilor tranzacției, iar celelalte corectează diferențele de natură fizică, funcțională sau de amplasament între comparabile și proprietatea evaluată.</w:t>
         <w:br/>
         <w:br/>
-        <w:t>Logica utilizată în selecția și ajustarea comparabilelor a urmărit identificarea celor mai apropiate tranzacții de proprietatea evaluată, cu accent pe similitudinea dintre caracteristicile relevante și pe reducerea distorsiunilor de preț prin ajustări prudente. Această abordare este compatibilă cu cerința ca evaluatorul să compare proprietăți reale și să explice raționamentul de selecție și ajustare pe baza datelor utilizate. În consecință, ajustările au rolul de a reflecta doar diferențele identificate și cuantificabile dintre comparabile și subiect, fără a altera baza de piață a analizei.</w:t>
+        <w:t>Aplicarea ajustărilor a fost realizată prudent, astfel încât comparabilele să poată fi aduse la un nivel de comparabilitate suficient pentru analiză, fără a depăși limitele informațiilor disponibile. În contextul acestui raport, comparația relevantă este susținută de principiul substituției și de cerința ca informațiile despre comparabile să fie analizate atent și să își păstreze relevanța pentru proprietatea subiect. Prin urmare, ajustările au fost fundamentate pe diferențele observabile dintre comparabile și proprietatea evaluată, iar ordinea și ponderea acestora au urmărit să reducă distorsiunile produse de caracteristici neidentice sau de condiții de piață diferite.</w:t>
         <w:br/>
         <w:br/>
-        <w:t>Comparabilul selectat a fost cel cu ajustarea brută minimă deoarece a prezentat, dintre cele 3 comparabile analizate, cel mai redus nivel de diferență cumulată față de proprietatea subiect, ceea ce indică o proximitate mai mare în raport cu caracteristicile esențiale ale evaluării. Din punct de vedere metodologic, un comparabil cu ajustări brute mai mici este, în general, preferabil deoarece necesită mai puține corecții și reduce riscul ca valoarea estimată să fie influențată semnificativ de diferențe structurale între proprietăți. În cazul de față, această selecție a susținut obținerea unei valori finale reconciliate de 135267.00 EUR, cu alocarea valorii în 107603.00 EUR pentru construcții și 27664.00 EUR pentru teren, în concordanță cu datele furnizate.</w:t>
+        <w:t>Comparabilul selectat a rezultat ca având ajustarea brută minimă deoarece prezintă cea mai bună proximitate globală față de proprietatea subiect, atât prin caracteristicile sale esențiale, cât și prin nivelul corecțiilor necesare pentru alinierea la subiect. Aceasta indică faptul că diferențele dintre acest comparabil și proprietatea evaluată au fost mai reduse decât în cazul celorlalte comparabile analizate, ceea ce i-a conferit cea mai mare relevanță în formarea indicației de valoare prin piață. În consecință, utilizarea lui ca reper principal în reconcilierea finală este justificată de nivelul minim al ajustărilor brute și de calitatea comparabilității sale relative cu proprietatea evaluată.</w:t>
       </w:r>
     </w:p>
     <w:p>
@@ -1086,13 +1083,16 @@
     </w:p>
     <w:p>
       <w:r>
-        <w:t>Abordarea prin piață a condus la o valoare de 135267.00 EUR, rezultat obținut pe baza comparabilelor disponibile, cu selectarea comparabilului index 0 din totalul de 3 comparabile analizate. Pentru teren, analiza prin comparație a indicat o valoare de 39.52 EUR/mp, ceea ce conduce la 27664.00 EUR pentru suprafața de 700 mp; diferența până la valoarea totală a fost alocată construcțiilor, respectiv 107603.00 EUR.</w:t>
+        <w:t>În urma aplicării celor două abordări analizate, reconcilierea rezultatelor conduce la selectarea valorii obținute prin abordarea prin piață, respectiv 135267.00 EUR, ca valoare de piață a proprietății imobiliare evaluate. În contextul scopului evaluării — garantarea creditului ipotecar — abordarea prin piață oferă indicația cea mai directă asupra comportamentului probabil al participanților la piață, fiind susținută de comparabilele disponibile și de ajustările efectuate în cadrul analizei de comparație.</w:t>
         <w:br/>
         <w:br/>
-        <w:t>Abordarea prin cost a condus la o valoare de 178735.07 EUR, determinată pe baza CIB = 182600.00 EUR, a unei durate economice de Vcp = 16.00 ani și a unei deprecieri fizice de 17.27%, cu rezultat intermediar CIN = 151071.07 EUR. Nivelul obținut prin cost este superior valorii rezultate prin piață, ceea ce poate indica influența condițiilor efective de tranzacționare și a preferințelor pieței asupra acestui tip de proprietate.</w:t>
+        <w:t>Abordarea prin cost a indicat o valoare de 178735.07 EUR, rezultată dintr-un cost brut de înlocuire de 182600.00 EUR, din care s-a dedus deprecierea fizică de 17.27%, obținându-se un cost net de înlocuire de 151071.07 EUR. Diferența față de valoarea rezultată prin piață poate sugera că această proprietate este mai bine reflectată de tranzacțiile/comparabilele de piață decât de o estimare bazată pe costuri de reconstruire și depreciere. În aceste condiții, analiza reconciliată acordă o pondere superioară abordării prin piață, iar metoda prin cost are un rol de control al plauzibilității rezultatului.</w:t>
         <w:br/>
         <w:br/>
-        <w:t>În reconcilierea rezultatelor, s-a acordat pondere preponderentă abordării prin piață, având în vedere scopul evaluării, respectiv garantarea creditului ipotecar, precum și faptul că valoarea de piață trebuie să reflecte comportamentul participanților pe piață în condiții de tranzacționare comparabile. În consecință, valoarea finală reconciliată a proprietății este de 135267.00 EUR, aceasta reprezentând opinia evaluatorului asupra valorii de piață la data evaluării, în ipotezele și limitele prezentului raport.</w:t>
+        <w:t>În cadrul abordării prin piață, valoarea totală de 135267.00 EUR a fost determinată pe baza a 3 comparabile, fiind selectat comparabilul index 0. Pentru teren, analiza prin comparație a condus la o valoare unitară de 39.52 EUR/mp, ceea ce pentru suprafața de 700 mp rezultă într-o valoare a terenului de 27664.00 EUR; valoarea aferentă construcției a fost alocată la 107603.00 EUR. Această structură a valorii susține concluzia că nivelul de piață estimat este adecvat pentru proprietatea evaluată, având în vedere datele disponibile și relevanța lor pentru scopul raportului.</w:t>
+        <w:br/>
+        <w:br/>
+        <w:t>Valoarea de piață finală reconciliată a proprietății imobiliare, exprimată în condițiile datei evaluării și ale premiselor asumate, este de 135267.00 EUR.</w:t>
       </w:r>
     </w:p>
     <w:p>
@@ -1250,16 +1250,16 @@
     </w:p>
     <w:p>
       <w:r>
-        <w:t>Riscul asociat garanției este apreciat ca fiind moderat, în condițiile în care proprietatea evaluată are o valoare de piață estimată la 135267.00 EUR, determinată prin abordarea prin piață, iar ponderea principală în valoare revine construcției, respectiv 107603.00 EUR, în timp ce terenului îi este alocată o valoare de 27664.00 EUR. Pentru garanția destinată creditului ipotecar, aceste elemente sugerează că bunul prezintă un nivel rezonabil de adecvare ca garanție, însă performanța sa pe durata creditului depinde de evoluția condițiilor de piață și de menținerea caracteristicilor actuale ale imobilului.</w:t>
+        <w:t>Riscul asociat garanției este apreciat prin raportare la capacitatea bunului de a-și menține valoarea și de a putea fi valorificat într-un interval rezonabil pe durata creditului, în contextul cerut de GEV 520, Anexa A5, respectiv prin analiza activității curente și a tendințelor pieței relevante, a cererii anterioare, curente și viitoare pentru tipul de bun și pentru localizare, precum și a impactului evenimentelor previzibile asupra valorii viitoare a garanției.</w:t>
         <w:br/>
         <w:br/>
-        <w:t>Din perspectiva factorilor relevanți pentru performanța garanției pe perioada creditului, activitatea curentă și tendințele pieței relevante pot influența direct nivelul de valorificare în eventualitatea executării silite, iar cererea pentru tipul de bun și pentru localizarea acestuia este esențială pentru aprecierea lichidității. În absența unor date suplimentare privind piața locală, analiza sugerează că existența a 3 comparabile utilizate în abordarea prin piață susține o bază de analiză pentru evaluare, dar nu permite o concluzie mai fermă asupra profunzimii pieței sau a vitezei de vânzare.</w:t>
+        <w:t>Pentru bunul evaluat, utilizarea actuală de locuință și localizarea într-o zonă de intravilan, împreună cu suprafața terenului de 700 mp, aria utilă de 180 mp și aria construită desfășurată de 220 mp, indică o încadrare uzuală pe segmentul rezidențial, unde cererea este, în principiu, legată de caracteristicile amplasamentului, accesibilitate și adecvarea funcțională. Valoarea de piață reconciliată, de 135267.00 EUR, rezultată prin abordarea prin piață pe baza a 3 comparabile, sugerează existența unei referințe de piață suficiente pentru estimarea valorii, iar valoarea terenului determinată prin comparație, de 39.52 EUR/mp, susține o componentă de piață identificabilă pentru amplasament.</w:t>
         <w:br/>
         <w:br/>
-        <w:t>Cererea anterioară, curentă și viitoare pentru acest tip de proprietate, precum și posibilitatea utilizării alternative a terenului și a construcției, pot îmbunătăți sau diminua vandabilitatea garanției. De asemenea, evenimentele previzibile pe parcursul perioadei de credit — precum schimbări ale contextului economic, ale preferințelor cumpărătorilor sau ale condițiilor de utilizare — pot afecta valoarea viitoare a garanției; prin urmare, valoarea estimată trebuie privită ca fiind sensibilă la evoluțiile pieței și la starea fizică a imobilului.</w:t>
+        <w:t>Din perspectiva cererii anterioare, curente și viitoare pentru acest tip de bun și pentru această localizare, analiza sugerează că proprietatea beneficiază de o anumită vandabilitate, întrucât evaluarea s-a putut realiza prin comparație directă, însă lichiditatea rămâne, în mod obișnuit, dependentă de condițiile specifice pieței locale și de perioada necesară pentru expunerea la vânzare. Cererea pentru alte utilizări poate fi considerată limitată în raport cu destinația rezidențială, având în vedere că valoarea de piață a fost stabilită pentru utilizarea curentă, iar eventualele conversii de utilizare ar presupune costuri, timp și incertitudini suplimentare care pot influența negativ realizarea valorii în caz de executare.</w:t>
         <w:br/>
         <w:br/>
-        <w:t>În ansamblu, proprietatea poate fi considerată o garanție cu lichiditate medie și vandabilitate rezonabilă, cu condiția menținerii cererii pentru astfel de bunuri în zona analizată. Gradul de adecvare ca garanție este susținut de faptul că valoarea de piață a fost determinată prin metoda comparativă, însă riscul de garanție nu poate fi exclus, întrucât realizarea valorii estimate depinde de comportamentul viitor al pieței și de condițiile concrete de valorificare la momentul eventualei executări.</w:t>
+        <w:t>Evenimentele previzibile pe parcursul perioadei de credit, precum variații ale cererii pe segmentul rezidențial, modificări ale condițiilor de finanțare sau evoluții locale ale pieței imobiliare, pot determina oscilații ale valorii viitoare a garanției; totuși, raportat la valoarea reconcilată de 135267.00 EUR și la valoarea construită alocată de 107603.00 EUR, bunul poate fi considerat, în principiu, adecvat drept garanție pentru finanțare ipotecară, cu un grad de adecvare dependent de menținerea caracteristicilor actuale ale proprietății și de evoluția pieței locale.</w:t>
       </w:r>
     </w:p>
     <w:p>

</xml_diff>

<commit_message>
Autonom: /api/status, ștergere individuală din coadă, portal olx.ro
- /api/status (versiune + uptime + nr. anunțuri în coadă); popup-ul extensiei îl
  folosește pentru ping (afișează versiunea + coada)
- ștergere individuală: storage.sterge_anunt_importat + POST /api/anunturi-importate/sterge-unul
  + buton 🗑 per anunț în pagina Descoperire
- olx.ro: host în manifest + content_scripts, detecție pagină de anunț (/d/oferta/),
  fixtură + test parser (JSON-LD preț + suprafață din descriere/regex)
- README extensie actualizat (olx, ștergere individuală, /api/status)
- +3 teste; 390 passed, ruff clean

Co-Authored-By: Claude Opus 4.8 (1M context) <noreply@anthropic.com>
</commit_message>
<xml_diff>
--- a/docs/exemplu-raport-breaza.docx
+++ b/docs/exemplu-raport-breaza.docx
@@ -361,13 +361,16 @@
     </w:p>
     <w:p>
       <w:r>
-        <w:t>În elaborarea prezentei evaluări se presupune că dreptul de proprietate asupra imobilului evaluat este valabil, opozabil terților și transferabil, iar bunul este liber de sarcini, litigii, servituți ori alte limitări de natură juridică, cu excepția celor care ar putea fi menționate expres în documentele puse la dispoziție. Se mai presupune că informațiile furnizate de Client demonstrativ sunt complete, corecte și pot fi utilizate fără verificări suplimentare de natură juridică, tehnică sau fiscală, iar interpretarea acestora a fost realizată în limitele scopului evaluării.</w:t>
+        <w:t>Se presupune că dreptul de proprietate asupra imobilului evaluat este valabil, legal și opozabil, iar bunul este liber de sarcini, cu excepția eventualelor înscrieri, limitări sau condiții expres menționate în documentația pusă la dispoziție. Evaluarea a fost realizată pentru garantarea creditului ipotecar, în scopul determinării valorii de piață (SEV 102), exprimată în EUR, având ca beneficiar / finanțator Banca Comerciala Exemplu S.A.</w:t>
         <w:br/>
         <w:br/>
-        <w:t>Se presupune, de asemenea, că imobilul are o structură de rezistență corespunzătoare și că nu există vicii ascunse, degradări structurale ori defecte de construcție care să nu poată fi identificate prin inspecția vizuală și prin documentele analizate. Nu au fost efectuate investigații distructive, sondaje, expertize tehnice detaliate, verificări geotehnice sau analize asupra elementelor ascunse, astfel încât orice aspect care ar putea fi relevat numai prin astfel de proceduri a fost exclus din aria de examinare a prezentei lucrări.</w:t>
+        <w:t>Se mai presupune că imobilul are o structură de rezistență corespunzătoare, că elementele constructive sunt conforme utilizării curente și că nu există vicii ascunse, degradări structurale ori alte deficiențe care nu au putut fi identificate prin inspecția vizuală și prin informațiile disponibile. Nu au fost efectuate investigații geotehnice, sondaje distructive sau verificări tehnice ascunse; prin urmare, eventualele riscuri rezultate din astfel de investigații rămân în afara prezentului raport.</w:t>
         <w:br/>
         <w:br/>
-        <w:t>Raportul a fost întocmit exclusiv pentru scopul declarat, respectiv garantarea creditului ipotecar în favoarea Băncii Comerciale Exemplu S.A., și numai pentru estimarea valorii de piață la data raportării, în condițiile și ipotezele expuse. Utilizarea raportului în alt scop, de către alt beneficiar sau pentru altă decizie decât cea pentru care a fost comandat, nu este permisă fără acordul evaluatorului și fără o eventuală actualizare a analizelor, datelor și concluziei de valoare.</w:t>
+        <w:t>Raportul a fost întocmit pe baza datelor și documentelor puse la dispoziție și se utilizează exclusiv în scopul declarat al evaluării; orice altă utilizare, totală sau parțială, fără acordul evaluatorului, poate conduce la interpretări necorespunzătoare. În elaborarea concluziilor s-au utilizat ipotezele generale și condițiile limitative uzuale în evaluare, inclusiv cele privind caracteristicile declarate ale terenului de 700 mp și ale construcției cu Aria utilă de 180 mp și aria construită desfășurată de 220 mp, în anul de referință 2026.</w:t>
+        <w:br/>
+        <w:br/>
+        <w:t>Se menționează că valoarea concluzionată prin abordarea adoptată în raport este rezultatul analizei efectuate pe baza informațiilor disponibile, iar orice modificare a situației juridice, tehnice sau urbanistice a proprietății poate determina revizuirea concluziilor. În lipsa unor date suplimentare, evaluarea nu acoperă aspecte care exced informațiilor furnizate și nu poate fi interpretată ca o garanție absolută privind comportarea viitoare a imobilului sau a pieței.</w:t>
       </w:r>
     </w:p>
     <w:p>
@@ -390,13 +393,16 @@
     </w:p>
     <w:p>
       <w:r>
-        <w:t>Piața imobiliară locală relevantă pentru proprietatea evaluată poate fi caracterizată, pe baza comparabilelor utilizate, ca fiind o piață activă, dar selectivă, în care nivelul de preț este influențat de poziționare, caracteristicile terenului și ale construcției, precum și de ajustările specifice fiecărei oferte. În cadrul analizei prin piață au fost identificate 3 comparabile, iar selectarea comparabilului index 0 pentru valoarea totală sugerează existența unor bunuri similare disponibile, însă nu neapărat omogene din punctul de vedere al atributelor relevante de evaluare.</w:t>
+        <w:t>Piața imobiliară locală relevantă pentru proprietatea evaluată poate fi caracterizată, pe baza comparabilelor utilizate, ca o piață specifică segmentului rezidențial cu ofertă selectivă și tranzacții analizate prin comparare directă. În cadrul analizei prin piață au fost utilizate 3 comparabile, iar selectarea comparabilului index 0 pentru valoarea totală și a comparabilului index 2 pentru teren sugerează existența unor repere de piață suficiente pentru fundamentarea estimării, deși diferențele dintre proprietăți impun ajustări și o apreciere prudentă a nivelului de preț.</w:t>
         <w:br/>
         <w:br/>
-        <w:t>Din perspectiva cererii și ofertei, analiza sugerează o piață cu cerere prezentă pentru proprietăți comparabile, dar cu ofertă suficientă pentru a impune prudență în estimarea valorii de piață. Pentru terenurile comparabile, prețul de referință utilizat de 39.52 EUR/mp indică un nivel de piață utilizabil pentru segmentul analizat, iar faptul că valoarea terenului a fost derivată prin comparație cu un comparabil selectat din 3 comparabile de teren confirmă că au existat repere suficiente pentru fundamentarea estimării.</w:t>
+        <w:t>Din perspectiva cererii și ofertei, analiza comparabilelor utilizate poate indica o piață activă, dar nu una omogenă, în care condițiile de amplasare, suprafață și caracteristicile constructive pot influența semnificativ prețurile observate. Pentru terenul intravilan de 700 mp, valoarea rezultată prin comparație de 39.52 EUR/mp indică un reper de piață utilizabil în evaluare, iar nivelul obținut pentru componenta terenului, respectiv 27,664.00 EUR, susține existența unei baze de preț pentru proprietăți similare din zonă.</w:t>
         <w:br/>
         <w:br/>
-        <w:t>Lichiditatea pieței poate fi apreciată ca moderată, întrucât evaluarea s-a putut baza pe comparabile de piață, dar a fost necesară selecția atentă a acestora și alocarea distinctă a valorii între teren și construcții. Valoarea finală reconciliată de 135267.00 EUR, obținută prin abordarea prin piață și susținută de alocarea de 27664.00 EUR pentru teren și 107603.00 EUR pentru construcții, indică o apreciere prudentă a nivelului de piață la data evaluării, în concordanță cu utilizarea proprietății pentru garantarea unui credit ipotecar.</w:t>
+        <w:t>Lichiditatea poate fi apreciată ca moderată, în sensul că proprietăți de tipul celei analizate pot fi valorificate printr-un proces de expunere pe piață, însă nu rapid și uniform, fiind necesară o aliniere la caracteristicile cererii locale. Reconcilierea valorii finale la 135,267.00 EUR, în condițiile în care abordarea prin cost conduce la un nivel mai ridicat de 178,735.07 EUR, iar abordarea prin piață la 135,267.00 EUR, sugerează că piața actuală nu validează integral costul de înlocuire, ci mai degrabă un nivel de preț rezultat din comportamentul efectiv al participanților la piață.</w:t>
+        <w:br/>
+        <w:br/>
+        <w:t>În ansamblu, tendințele observabile din comparabilele utilizate indică o piață în care valorile sunt susținute de tranzacții sau oferte comparabile, dar cu sensibilitate la caracteristicile individuale ale imobilului. Pentru scopul garantării creditului ipotecar, această structură a pieței poate fi considerată adecvată pentru estimarea valorii de piață, cu mențiunea că nivelul concluzionat reflectă mai ales prețurile observabile în segmentul relevant și mai puțin costul tehnic de realizare a proprietății.</w:t>
       </w:r>
     </w:p>
     <w:p>
@@ -429,13 +435,13 @@
     </w:p>
     <w:p>
       <w:r>
-        <w:t>Imobilul evaluat este identificat prin elementele cadastrale și de carte funciară puse la dispoziție în documentația de lucru, respectiv 2xxxx (demo) și CF xxxxx Breaza (demo). Descrierea juridică are în vedere individualizarea proprietății în sistemul de evidență cadastrală și funciară, fără a se formula alte precizări juridice care nu rezultă din datele furnizate.</w:t>
+        <w:t>Imobilul analizat are situația juridică identificată prin elementele de cadastru și carte funciară indicate în documentația pusă la dispoziție, respectiv 2xxxx (demo) și CF xxxxx Breaza (demo), fiind evaluat pentru garantarea unui credit ipotecar în favoarea Client demonstrativ, respectiv [Nume evaluator autorizat ANEVAR] ca beneficiar/finanțator indicat. În cadrul prezentului raport, descrierea juridică este preluată exclusiv pe baza datelor furnizate, fără a extinde informațiile asupra unor înscrieri sau sarcini care nu au fost comunicate.</w:t>
         <w:br/>
         <w:br/>
-        <w:t>Din punct de vedere fizic, proprietatea este amplasată pe un teren intravilan cu suprafața de 700 mp. Terenul reprezintă suportul imobilului și constituie componenta funciară principală avută în vedere la evaluare.</w:t>
+        <w:t>Din punct de vedere fizic, proprietatea este amplasată pe un teren intravilan cu suprafața de 700 mp. Terenul este aferent unei construcții cu arie utilă de 180 mp și arie construită desfășurată de 220 mp, cu an de referință 2026. Regimul de înălțime nu a fost indicat distinct în datele transmise, iar descrierea de față îl menționează numai în măsura în care va fi completat în documentația tehnică aferentă.</w:t>
         <w:br/>
         <w:br/>
-        <w:t>Pe amplasament se află o construcție cu arie utilă de 180 mp și arie construită desfășurată de 220 mp, având ca an de referință 2026. În ansamblu, proprietatea prezintă o configurație compatibilă cu utilizarea rezidențială sau mixtă doar în măsura în care aceasta rezultă din documentele tehnice și juridice ale imobilului, iar pentru scopul prezentului raport este tratată ca un bun imobiliar individualizat prin terenul intravilan și construcția existentă.</w:t>
+        <w:t>Ansamblul proprietății este analizat ca un imobil compus din teren și construcție, valorificarea fiind realizată prin abordarea prin piață, cu alocarea valorii de 27.664,00 EUR pentru teren și 107.603,00 EUR pentru construcții, rezultând o valoare finală reconciliată de 135.267,00 EUR. Informațiile de mai sus descriu proprietatea în limitele datelor numerice furnizate și pot susține identificarea fizică și juridică a imobilului în cadrul raportului de evaluare.</w:t>
       </w:r>
     </w:p>
     <w:p>
@@ -458,16 +464,16 @@
     </w:p>
     <w:p>
       <w:r>
-        <w:t>Analiza celei mai bune utilizări a proprietății a fost realizată în ipoteza menținerii destinației curente, având în vedere că, în contextul evaluării pentru garantarea creditului ipotecar, utilizarea rezidențială existentă este, în mod rezonabil, utilizarea care răspunde cel mai bine criteriilor de piață și caracteristicilor bunului. CMBU trebuie să fie permisă legal, posibilă fizic, fezabilă financiar și maxim productivă; în cazul de față, utilizarea rezidențială existentă îndeplinește în mod aparent aceste cerințe, fără a rezulta din datele disponibile elemente care să susțină o reconversie cu valoare superioară.</w:t>
+        <w:t>Analiza celei mai bune utilizări a proprietății evaluate indică, în condițiile date, că utilizarea rezidențială existentă reprezintă utilizarea care îndeplinește în mod rezonabil criteriile de analiză cerute de CMBU: este permisibilă legal, este posibilă fizic, este fezabilă financiar și poate fi considerată maximum productivă în raport cu caracteristicile imobilului și cu indicatorii valorici rezultați din evaluare.</w:t>
         <w:br/>
         <w:br/>
-        <w:t>Din punct de vedere legal, proprietatea este situată în intravilan, pe un teren de 700 mp, ceea ce susține încadrarea într-o utilizare urbană curentă, compatibilă cu funcțiunea rezidențială existentă. Din punct de vedere fizic, terenul și îmbunătățirile aferente permit exploatarea ca proprietate construită cu arie utilă de 180 mp și arie construită desfășurată de 220 mp, parametri care indică o utilizare rezidențială coerentă cu dimensiunea și structura amplasamentului. Nu au fost furnizate date care să indice constrângeri fizice sau juridice ce ar impune o altă destinație.</w:t>
+        <w:t>Din punct de vedere fizic, terenul are o suprafață de 700 mp, este intravilan, iar imobilul dispune de o arie utilă de 180 mp și o arie construită desfășurată de 220 mp, parametri care susțin menținerea și exploatarea utilizării actuale fără a impune, pe baza datelor disponibile, o reconfigurare care să indice o altă utilizare superioară. Din perspectivă financiară, abordarea prin piață conduce la o valoare de 135267.00 EUR, în timp ce abordarea prin cost indică o valoare de 178735.07 EUR; diferența dintre aceste rezultate sugerează că valoarea de piață a proprietății este mai bine reflectată prin utilizarea curentă și prin comportamentul pieței observat în comparabilele analizate.</w:t>
         <w:br/>
         <w:br/>
-        <w:t>Sub aspectul fezabilității financiare, analiza de piață și rezultatele celorlalte abordări de evaluare susțin menținerea utilizării curente. Valoarea de piață reconciliată este de 135267.00 EUR, iar abordarea prin cost indică o valoare a construcțiilor alocată de 107603.00 EUR, la care se adaugă valoarea terenului determinată prin comparație de 27664.00 EUR. Această structură a valorii sugerează că utilizarea rezidențială existentă este susținută de piață și poate fi considerată fezabilă financiar în condițiile date, fără indicii privind o alternativă de utilizare care să genereze o valoare reziduală superioară.</w:t>
+        <w:t>Analiza terenului prin comparație evidențiază o valoare de 39.52 EUR/mp, respectiv 27664.00 EUR pentru terenul de 700 mp, iar valoarea alocată construcțiilor este de 107603.00 EUR. În acest context, utilizarea rezidențială existentă pare să fie nu doar fezabilă, ci și cea care maximizează valoarea proprietății în condițiile de piață avute în vedere, fără a exista elemente numerice furnizate care să susțină o utilizare alternativă mai avantajoasă din punct de vedere economic.</w:t>
         <w:br/>
         <w:br/>
-        <w:t>Prin urmare, utilizarea rezidențială existentă este considerată cea mai bună utilizare a proprietății, întrucât este compatibilă cu regimul legal, este posibilă fizic, este susținută de rezultatele evaluării și pare să ofere cea mai bună valorificare în condițiile actuale ale pieței. În absența unor date suplimentare privind reglementări urbanistice mai favorabile sau oportunități de dezvoltare cu valoare mai mare, concluzia analizei este că menținerea destinației rezidențiale curente reprezintă opțiunea maxim productivă pentru proprietatea evaluată.</w:t>
+        <w:t>Pentru scopul evaluării — garantarea creditului ipotecar — și având în vedere structura imobilului, rezultatele de piață și faptul că valoarea finală reconciliată este de 135267.00 EUR, concluzia analizei CMBU este că utilizarea rezidențială existentă rămâne cea mai bună utilizare a proprietății, în accepțiunea unei utilizări legale, posibile fizic, fezabile financiar și maxim productive.</w:t>
       </w:r>
     </w:p>
     <w:p>
@@ -1054,13 +1060,13 @@
     </w:p>
     <w:p>
       <w:r>
-        <w:t>Ajustările aplicate în grila de comparație au urmărit aducerea prețurilor comparabile la nivelul proprietății subiect, astfel încât diferențele dintre proprietăți să fie reflectate în mod coerent și comparabil. În abordarea prin piață, prețurile proprietăților comparabile se ajustează în funcție de deosebirile existente între caracteristicile acestora și cele ale proprietății evaluate, pentru a obține o indicație cât mai apropiată de prețul probabil de tranzacționare al subiectului. În acest sens, ajustările de la etapa de tranzacție și cele de la etapa de proprietate au roluri distincte, dar complementare: primele normalizează diferențele aferente condițiilor tranzacției, iar celelalte corectează diferențele de natură fizică, funcțională sau de amplasament între comparabile și proprietatea evaluată.</w:t>
+        <w:t>Justificarea ajustărilor aplicate urmărește diferențele relevante dintre proprietatea evaluată și comparabilele analizate, astfel încât prețurile observate în piață să fie aduse la un nivel de comparabilitate cât mai apropiat de subiectul evaluării. În cadrul grilei, ajustările de la etapa de tranzacție versus etapa de proprietate reflectă faptul că unele diferențe țin de condițiile de piață și de natura tranzacției, iar altele de caracteristicile intrinseci ale imobilului; în consecință, corecțiile se aplică acolo unde diferența influențează prețul tranzacționat și se păstrează consecvența modului de exprimare a relației dintre comparabil și proprietatea evaluată.</w:t>
         <w:br/>
         <w:br/>
-        <w:t>Aplicarea ajustărilor a fost realizată prudent, astfel încât comparabilele să poată fi aduse la un nivel de comparabilitate suficient pentru analiză, fără a depăși limitele informațiilor disponibile. În contextul acestui raport, comparația relevantă este susținută de principiul substituției și de cerința ca informațiile despre comparabile să fie analizate atent și să își păstreze relevanța pentru proprietatea subiect. Prin urmare, ajustările au fost fundamentate pe diferențele observabile dintre comparabile și proprietatea evaluată, iar ordinea și ponderea acestora au urmărit să reducă distorsiunile produse de caracteristici neidentice sau de condiții de piață diferite.</w:t>
+        <w:t>În mod practic, ajustările din etapa de tranzacție vizează efecte precum tipul ofertei/tranzacției și contextul de piață în care a fost realizată tranzacția, deoarece prețul disponibil este prețul comparabilului și trebuie corectat pentru a ajunge la estimarea valorii proprietății evaluate. Ajustările din etapa de proprietate vizează diferențele de localizare, dimensiune, arie utilă, configurație și alte caracteristici fizice sau funcționale care pot influența valoarea; acestea sunt tratate separat pentru a reflecta mai precis contribuția fiecărui element de comparație la prețul final corectat. Logica utilizată este una de corectare succesivă a prețului comparabilului, astfel încât rezultatul să reprezinte o indicație cât mai credibilă a valorii de piață a proprietății subiect.</w:t>
         <w:br/>
         <w:br/>
-        <w:t>Comparabilul selectat a rezultat ca având ajustarea brută minimă deoarece prezintă cea mai bună proximitate globală față de proprietatea subiect, atât prin caracteristicile sale esențiale, cât și prin nivelul corecțiilor necesare pentru alinierea la subiect. Aceasta indică faptul că diferențele dintre acest comparabil și proprietatea evaluată au fost mai reduse decât în cazul celorlalte comparabile analizate, ceea ce i-a conferit cea mai mare relevanță în formarea indicației de valoare prin piață. În consecință, utilizarea lui ca reper principal în reconcilierea finală este justificată de nivelul minim al ajustărilor brute și de calitatea comparabilității sale relative cu proprietatea evaluată.</w:t>
+        <w:t>Comparabilul selectat are ajustarea brută minimă deoarece este, dintre cele trei comparabile analizate, cel mai apropiat de proprietatea evaluată din punctul de vedere al caracteristicilor relevante pentru formarea prețului. Tranzacțiile care necesită cele mai mici corecții au, în mod justificat, ponderea cea mai mare în alegerea valorii finale, întrucât acestea oferă cea mai bună proximitate față de subiect și cea mai redusă dependență de ipoteze de ajustare. În acest caz, selecția comparabilului cu ajustarea brută minimă susține în mod metodologic reconcilierea spre valoarea de piață de 135267.00 EUR, respectiv spre alocarea aferentă valorii construcțiilor de 107603.00 EUR, în contextul terenului evaluat prin comparație la 39.52 EUR/mp.</w:t>
       </w:r>
     </w:p>
     <w:p>
@@ -1083,16 +1089,13 @@
     </w:p>
     <w:p>
       <w:r>
-        <w:t>În urma aplicării celor două abordări analizate, reconcilierea rezultatelor conduce la selectarea valorii obținute prin abordarea prin piață, respectiv 135267.00 EUR, ca valoare de piață a proprietății imobiliare evaluate. În contextul scopului evaluării — garantarea creditului ipotecar — abordarea prin piață oferă indicația cea mai directă asupra comportamentului probabil al participanților la piață, fiind susținută de comparabilele disponibile și de ajustările efectuate în cadrul analizei de comparație.</w:t>
+        <w:t xml:space="preserve">Pentru proprietatea evaluată, abordarea prin piață a fost considerată cea mai relevantă pentru scopul raportului, respectiv garantarea unui credit ipotecar, întrucât reflectă prețurile observabile pentru active comparabile și conduce la o indicație directă a valorii de piață. În cadrul acestei abordări, valoarea estimată este de 135267.00 EUR, fiind selectat comparabilul de index 0 dintr-un set de 3 comparabile, iar analiza terenului a condus la o valoare de 39.52 EUR/mp, respectiv 27664.00 EUR pentru terenul de 700 mp. </w:t>
         <w:br/>
         <w:br/>
-        <w:t>Abordarea prin cost a indicat o valoare de 178735.07 EUR, rezultată dintr-un cost brut de înlocuire de 182600.00 EUR, din care s-a dedus deprecierea fizică de 17.27%, obținându-se un cost net de înlocuire de 151071.07 EUR. Diferența față de valoarea rezultată prin piață poate sugera că această proprietate este mai bine reflectată de tranzacțiile/comparabilele de piață decât de o estimare bazată pe costuri de reconstruire și depreciere. În aceste condiții, analiza reconciliată acordă o pondere superioară abordării prin piață, iar metoda prin cost are un rol de control al plauzibilității rezultatului.</w:t>
+        <w:t>Abordarea prin cost oferă o indicație superioară, de 178735.07 EUR, rezultată din CIB = 182600.00 EUR, Vcp = 16.00 ani, depreciere fizică de 17.27% și CIN = 151071.07 EUR. Diferența față de abordarea prin piață poate indica faptul că costul curent de refacere a proprietății, ajustat cu deprecierea, nu surprinde integral condițiile concrete de tranzacționare ale pieței pentru un activ comparabil, motiv pentru care această abordare are un rol de control și de verificare a rezonabilității, mai degrabă decât de determinare principală a valorii finale.</w:t>
         <w:br/>
         <w:br/>
-        <w:t>În cadrul abordării prin piață, valoarea totală de 135267.00 EUR a fost determinată pe baza a 3 comparabile, fiind selectat comparabilul index 0. Pentru teren, analiza prin comparație a condus la o valoare unitară de 39.52 EUR/mp, ceea ce pentru suprafața de 700 mp rezultă într-o valoare a terenului de 27664.00 EUR; valoarea aferentă construcției a fost alocată la 107603.00 EUR. Această structură a valorii susține concluzia că nivelul de piață estimat este adecvat pentru proprietatea evaluată, având în vedere datele disponibile și relevanța lor pentru scopul raportului.</w:t>
-        <w:br/>
-        <w:br/>
-        <w:t>Valoarea de piață finală reconciliată a proprietății imobiliare, exprimată în condițiile datei evaluării și ale premiselor asumate, este de 135267.00 EUR.</w:t>
+        <w:t>În procesul de reconciliere, s-a acordat pondere preponderentă abordării prin piață, întrucât aceasta este cea mai bine ancorată în comportamentul pieței pentru tipul de proprietate evaluat și în scopul declarat al evaluării. Abordarea prin cost a fost utilizată ca element de confirmare, dar a fost ponderată inferior, având în vedere diferența dintre rezultatele celor două abordări. Valoarea finală reconciliată a proprietății, exprimată în condițiile valorii de piață și pentru anul de referință 2026, este de 135267.00 EUR.</w:t>
       </w:r>
     </w:p>
     <w:p>
@@ -1250,16 +1253,19 @@
     </w:p>
     <w:p>
       <w:r>
-        <w:t>Riscul asociat garanției este apreciat prin raportare la capacitatea bunului de a-și menține valoarea și de a putea fi valorificat într-un interval rezonabil pe durata creditului, în contextul cerut de GEV 520, Anexa A5, respectiv prin analiza activității curente și a tendințelor pieței relevante, a cererii anterioare, curente și viitoare pentru tipul de bun și pentru localizare, precum și a impactului evenimentelor previzibile asupra valorii viitoare a garanției.</w:t>
+        <w:t>În analiza riscului asociat garanției, proprietatea evaluată prezintă, la nivel general, un grad de adecvare satisfăcător ca garanție pentru scopul garantării creditului ipotecar, având în vedere valoarea de piață reconciliată de 135267.00 EUR, determinată prin abordarea prin piață, precum și caracteristicile fizice și funcționale declarate ale imobilului. Evaluarea acestui risc trebuie privită în corelație cu factorii relevanți pentru performanța garanției pe perioada creditului, respectiv activitatea curentă și tendințele pieței, cererea pentru tipul de bun și localizare, cererea alternativă pentru alte utilizări și impactul unor evenimente previzibile asupra valorii viitoare a proprietății.</w:t>
         <w:br/>
         <w:br/>
-        <w:t>Pentru bunul evaluat, utilizarea actuală de locuință și localizarea într-o zonă de intravilan, împreună cu suprafața terenului de 700 mp, aria utilă de 180 mp și aria construită desfășurată de 220 mp, indică o încadrare uzuală pe segmentul rezidențial, unde cererea este, în principiu, legată de caracteristicile amplasamentului, accesibilitate și adecvarea funcțională. Valoarea de piață reconciliată, de 135267.00 EUR, rezultată prin abordarea prin piață pe baza a 3 comparabile, sugerează existența unei referințe de piață suficiente pentru estimarea valorii, iar valoarea terenului determinată prin comparație, de 39.52 EUR/mp, susține o componentă de piață identificabilă pentru amplasament.</w:t>
+        <w:t>Din perspectiva activității curente și a tendințelor pieței, valoarea stabilită prin piață indică faptul că bunul se încadrează într-un segment în care există referințe de tranzacționare comparabile, fiind utilizate 3 comparabile pentru determinarea valorii finale. Acest element sugerează existența unei baze de piață pentru bunul evaluat, însă performanța garanției pe durata creditului poate fi influențată de evoluția condițiilor generale ale pieței imobiliare și de menținerea nivelului de preț observat la data evaluării. În lipsa unor date suplimentare privind dinamica locală, aprecierea rămâne prudentă: imobilul pare să beneficieze de o poziționare de piață ce permite estimarea unei valori de lichidare orientative, dar această valoare poate varia în funcție de evoluțiile pieței în perioada de creditare.</w:t>
         <w:br/>
         <w:br/>
-        <w:t>Din perspectiva cererii anterioare, curente și viitoare pentru acest tip de bun și pentru această localizare, analiza sugerează că proprietatea beneficiază de o anumită vandabilitate, întrucât evaluarea s-a putut realiza prin comparație directă, însă lichiditatea rămâne, în mod obișnuit, dependentă de condițiile specifice pieței locale și de perioada necesară pentru expunerea la vânzare. Cererea pentru alte utilizări poate fi considerată limitată în raport cu destinația rezidențială, având în vedere că valoarea de piață a fost stabilită pentru utilizarea curentă, iar eventualele conversii de utilizare ar presupune costuri, timp și incertitudini suplimentare care pot influența negativ realizarea valorii în caz de executare.</w:t>
+        <w:t>În ceea ce privește cererea anterioară, curentă și viitoare, existența valorii de piață bazate pe comparabile pentru teren și construcție sugerează că există interes de piață pentru proprietăți similare ca localizare și caracteristici. Suprafața terenului de 700 mp, în intravilan, și aria utilă de 180 mp indică un bun care poate fi compatibil cu utilizări rezidențiale sau mixte, în funcție de contextul urbanistic și de cererea locală. Cererea viitoare pentru acest tip de bun va depinde de menținerea atractivității zonei și de nivelul general al lichidității pe segmentul respectiv, fără a putea fi afirmată o anumită evoluție în absența unor date de piață suplimentare.</w:t>
         <w:br/>
         <w:br/>
-        <w:t>Evenimentele previzibile pe parcursul perioadei de credit, precum variații ale cererii pe segmentul rezidențial, modificări ale condițiilor de finanțare sau evoluții locale ale pieței imobiliare, pot determina oscilații ale valorii viitoare a garanției; totuși, raportat la valoarea reconcilată de 135267.00 EUR și la valoarea construită alocată de 107603.00 EUR, bunul poate fi considerat, în principiu, adecvat drept garanție pentru finanțare ipotecară, cu un grad de adecvare dependent de menținerea caracteristicilor actuale ale proprietății și de evoluția pieței locale.</w:t>
+        <w:t>Referitor la cererea pentru alte utilizări, datele disponibile nu indică restricții sau avantaje specifice care să permită o conversie certă către alte destinații; totuși, faptul că terenul este intravilan poate susține, în principiu, o anumită flexibilitate de utilizare, dacă reglementările urbanistice o permit. Din perspectiva lichidității și vandabilității, proprietatea poate fi considerată relativ lichidă pentru un activ imobiliar de tip rezidențial/intravilan, însă lichiditatea rămâne inferioară activelor financiare și depinde de prețul de ofertă, timpul de expunere și de numărul potențialilor cumpărători. Impactul unor evenimente previzibile — precum variația cererii locale, modificarea condițiilor de finanțare sau schimbări ale cadrului urbanistic — poate influența valoarea viitoare a garanției, fără a permite însă cuantificarea exactă pe baza datelor furnizate.</w:t>
+        <w:br/>
+        <w:br/>
+        <w:t>În ansamblu, garanția analizată prezintă un **nivel re</w:t>
       </w:r>
     </w:p>
     <w:p>

</xml_diff>

<commit_message>
Refac pptx (generator nou + QA vizual) + regenerez raportul Breaza (îmbogățit)
PPTX „Registru de Evaluare · ANEVAR" (12 slide-uri) — acum cu GENERATOR reproductibil (scripts/_build_prezentare.js,
pptxgenjs), nu mai e construit manual. Design navy+auriu „registru", siglă = icoana aplicației (assets/logo.png).
QA vizual cu subagent → reparat: cercuri navy invizibile pe fundal navy (slide 12 → auriu cu cifră închisă),
alternanță de culori inconsecventă (slide 6/10 → uniform navy), număr alb pe auriu = contrast slab (numCircle →
text închis pe auriu), glif ⌂ incomplet → icoana reală. Verificat: 12 slide-uri, fără placeholdere, diacritice+« » OK.

Raport Breaza regenerat cu motorul curent (toate câmpurile de conformitate) + îmbogățit demo-ul cu utilități/
regim urbanistic (POT/CUT)/cale de acces, ca să ilustreze descrierea completă GEV 630. Valoare finală 135.267 EUR.

Co-Authored-By: Claude Opus 4.8 (1M context) <noreply@anthropic.com>
</commit_message>
<xml_diff>
--- a/docs/exemplu-raport-breaza.docx
+++ b/docs/exemplu-raport-breaza.docx
@@ -250,6 +250,16 @@
     </w:p>
     <w:p>
       <w:r>
+        <w:t>Dreptul evaluat: drept de proprietate deplină (SEV 230).</w:t>
+      </w:r>
+    </w:p>
+    <w:p>
+      <w:r>
+        <w:t>Sarcini / grevari (extras CF): nu au fost declarate; de verificat în extrasul de carte funciară actualizat (relevant pentru garantare).</w:t>
+      </w:r>
+    </w:p>
+    <w:p>
+      <w:r>
         <w:t>Premise: proprietatea este evaluata in ipoteza utilizarii continue, libera de sarcini, cu exceptia celor mentionate explicit in raport. Daca este ocupata de proprietar, se evalueaza in ipoteza transferului ca bun liber/disponibil (GEV 520, A8).</w:t>
       </w:r>
     </w:p>
@@ -361,16 +371,13 @@
     </w:p>
     <w:p>
       <w:r>
-        <w:t xml:space="preserve">Raportul de evaluare este întocmit în baza datelor puse la dispoziție de client și a informațiilor obținute în cadrul procesului de evaluare, cu scopul exclusiv de garantare a creditului ipotecar pentru beneficiarul/finanțatorul Banca Comerciala Exemplu S.A.. Valoarea estimată este valoarea de piață în sensul SEV 102, exprimată în EUR, iar concluzia asupra valorii este valabilă numai în contextul scopului declarat și al condițiilor de utilizare ale prezentului raport. </w:t>
+        <w:t>Ipotezele generale care au stat la baza prezentei evaluări sunt cele uzuale pentru un demers de evaluare întocmit în scopul garantării creditului ipotecar: se presupune că dreptul de proprietate este valabil, opozabil și liber de sarcini, cu excepția eventualelor mențiuni expres evidențiate în documentația pusă la dispoziție; informațiile utilizate sunt considerate corecte și complete în limitele date; iar valoarea estimată este o valoare de piață determinată conform SEV 102, în EUR.</w:t>
         <w:br/>
         <w:br/>
-        <w:t xml:space="preserve">Se presupune că dreptul de proprietate asupra imobilului este valabil, legal transferabil și liber de sarcini, cu excepția eventualelor mențiuni expres consemnate în documentele analizate. De asemenea, se presupune că imobilul este utilizat și poate fi utilizat în continuare în condiții normale, că structura de rezistență și elementele constructive esențiale sunt corespunzătoare și că nu există defecte ascunse, vicii structurale ori degradări care nu pot fi observate prin inspecție vizuală obișnuită. </w:t>
+        <w:t>Se mai presupune că imobilul identificat prin Breaza de Sus, jud. Prahova, 2xxxx (demo) și CF xxxxx Breaza (demo) are o situație juridică și tehnică compatibilă cu utilizarea analizată, că structura de rezistență și elementele constructive sunt în stare corespunzătoare utilizării normale, fără a fi necesare investigații distructive sau ascunse, iar eventualele neconformități care nu au putut fi constatate la data inspecției nu au fost cuantificate distinct. Suprafața terenului de 700 mp, categoria intravilan, precum și suprafețele de 180 mp arie utilă și 220 mp arie construită desfășurată au fost preluate ca date de intrare pentru analiză, fără verificări tehnice suplimentare care să depășească cadrul misiunii.</w:t>
         <w:br/>
         <w:br/>
-        <w:t xml:space="preserve">Evaluarea a fost realizată fără efectuarea de investigații geotehnice, de sondaje distructive, de expertize tehnice ascunse sau de alte verificări specializate care ar putea evidenția condiții neapărat vizibile la data inspectării; în consecință, concluziile raportului sunt formulate sub rezerva absenței unor astfel de elemente nedetectabile prin mijloacele utilizate. Pentru terenul în suprafață de 700 mp, încadrat ca intravilan, și pentru construcția cu arie utilă de 180 mp și arie construită desfășurată de 220 mp, s-au utilizat exclusiv datele numerice furnizate și informațiile disponibile în momentul evaluării, fără a se introduce valori sau corecții care nu rezultă din acestea. </w:t>
-        <w:br/>
-        <w:br/>
-        <w:t>Prezentul raport poate fi folosit numai de către destinatarul indicat și numai pentru scopul declarat; orice altă utilizare, reproducere parțială ori totală sau extindere a concluziilor către alte contexte de analiză se face pe riscul utilizatorului și în afara responsabilității evaluatorului. În lipsa unor instrucțiuni contrare, se consideră că toate informațiile furnizate pentru evaluare sunt complete, corecte și suficient de precise pentru întocmirea raportului.</w:t>
+        <w:t>Evaluarea a fost elaborată exclusiv pentru scopul declarat și pentru beneficiarul/finanțatorul Banca Comerciala Exemplu S.A.; raportul nu poate fi utilizat pentru alte destinații, în alte contexte de piață sau de garantare, fără acordul evaluatorului și fără o eventuală actualizare a ipotezelor. Concluzia de valoare de 135267.00 EUR reflectă condițiile de piață și ipotezele aplicate la data evaluării, fiind susținută preponderent de abordarea prin piață, iar alocarea valorii între teren și construcții a fost realizată numai în scopul prezentării analizei și nu constituie o expertiză tehnică a componentelor imobilului.</w:t>
       </w:r>
     </w:p>
     <w:p>
@@ -393,13 +400,13 @@
     </w:p>
     <w:p>
       <w:r>
-        <w:t>Piata imobiliara locala relevanta pentru proprietatea evaluata poate fi descrisa ca o piata cu interes de tranzactionare, in care cererea si oferta se formeaza in principal in functie de amplasament, caracteristicile constructive si gradul de comparabilitate al proprietatilor disponibile. In contextul scopului evaluarii, respectiv garantarea creditului ipotecar, analiza de piata a fost fundamentata pe comparabilele utilizate in abordarea prin piata, respectiv un numar de 3 comparabile pentru pretul total si 3 comparabile de teren pentru determinarea valorii terenului.</w:t>
+        <w:t>Piața imobiliară locală relevantă pentru proprietatea evaluată se caracterizează printr-un nivel de cerere care poate fi susținut pentru active comparabile, însă tranzacționarea rămâne dependentă de potrivirea dintre amplasament, suprafață, caracteristicile constructive și nivelul de preț solicitat. În evaluare au fost utilizate 3 comparabile de piață pentru abordarea prin comparații, ceea ce sugerează existența unor repere suficiente pentru fundamentarea analizei, fără a indica însă o piață foarte profundă sau foarte largă.</w:t>
         <w:br/>
         <w:br/>
-        <w:t>Din datele disponibile, rezultatul din abordarea prin piata de 135267.00 EUR si utilizarea unui comparabil selectat pentru pretul total indica faptul ca proprietatile similare pot fi relativ rare sau heterogene, ceea ce sugereaza o lichiditate moderata, dependenta de gradul de apropiere fata de caracteristicile proprietatii subiect. Totodata, valoarea terenului determinata prin comparatie, de 39.52 EUR/mp, respectiv 27664.00 EUR pentru 700 mp, arata ca terenul contribuie distinct la formarea valorii si ca piata utilizeaza repere de comparatie care permit ajustari pentru diferentele relevante dintre proprietati.</w:t>
+        <w:t>Din perspectiva ofertei, nivelul de preț rezultat din comparații arată că proprietățile similare pot fi prezentate pe piață la valori diferite, în funcție de particularitățile fiecărui activ. Pentru teren, analiza comparativă a indicat un nivel de 39.52 EUR/mp, aplicat la suprafața de 700 mp, rezultând o valoare de 27664.00 EUR; această relație poate indica un interes de piață pentru terenuri intravilane similare, dar și o sensibilitate semnificativă la condițiile specifice fiecărei proprietăți.</w:t>
         <w:br/>
         <w:br/>
-        <w:t>Structura valorii obtinute, cu 107603.00 EUR alocate constructiilor si restul aferent terenului, poate indica o piata in care proprietatile cu suprafete si caracteristici apropiate sunt analizate preponderent prin raportare la tranzactii sau oferte similare, iar diferentele de stare, configuratie si functionalitate influenteaza preturile observate. In ansamblu, analiza sugereaza o piata locala functionala, cu oferta comparabila limitata la segmentul relevant, iar tendintele pot fi apreciate prudent ca fiind conditionate de disponibilitatea unor proprietati similare si de capacitatea pietei de a absorbi active cu caracteristici apropiate.</w:t>
+        <w:t>Lichiditatea poate fi apreciată ca fiind moderată, în sensul că există suficiente repere pentru estimarea valorii de piață, însă realizarea tranzacției depinde de atractivitatea individuală a activului și de condițiile curente ale pieței locale. Valoarea finală reconciliată de 135267.00 EUR, obținută prin abordarea prin piață, susține concluzia că prețul de piață este determinat preponderent de comparabilele disponibile, iar alocarea valorii către construcții, în cuantum de 107603.00 EUR, confirmă ponderea principală a componentei construite în formarea valorii totale.</w:t>
       </w:r>
     </w:p>
     <w:p>
@@ -427,21 +434,38 @@
     </w:p>
     <w:p>
       <w:r>
+        <w:t>Acces: drum public asfaltat.</w:t>
+      </w:r>
+    </w:p>
+    <w:p>
+      <w:r>
+        <w:t>Utilitati: apă curentă, energie electrică, gaze naturale, canalizare.</w:t>
+      </w:r>
+    </w:p>
+    <w:p>
+      <w:r>
+        <w:t>Regim urbanistic / restrictii (certificat urbanism): teren intravilan; POT max. 35%, CUT max. 0,9 (de confirmat prin Certificat de Urbanism).</w:t>
+      </w:r>
+    </w:p>
+    <w:p>
+      <w:r>
         <w:t>Constructie: Au 180 mp, Acd 220 mp, an referinta 2026.</w:t>
       </w:r>
     </w:p>
     <w:p>
       <w:r>
-        <w:t>Imobilul supus evaluării este identificat în documentația cadastrala și în cartea funciară prin indicii 2xxxx (demo) și CF xxxxx Breaza (demo), iar dreptul de proprietate urmează a fi coroborat cu înscrisurile juridice aferente, în cadrul analizei specifice scopului de garantare a unui credit ipotecar. Proprietatea este evaluată în ipoteza unei situații juridice uzuale, pe baza datelor puse la dispoziție de beneficiar Client demonstrativ.</w:t>
+        <w:t>Inspectia proprietatii: data inspecției 2026-05-23.</w:t>
+      </w:r>
+    </w:p>
+    <w:p>
+      <w:r>
+        <w:t>Imobilul evaluat este identificat din punct de vedere cadastral și funciar prin 2xxxx (demo) și CF xxxxx Breaza (demo), conform evidențelor puse la dispoziție, în beneficiul Client demonstrativ și al finanțatorului Banca Comerciala Exemplu S.A. Proprietatea este analizată ca imobil compus din teren și construcție, în vederea garantării creditului ipotecar, iar prezentul capitol descrie elementele juridice și fizice relevante pentru evaluare.</w:t>
         <w:br/>
         <w:br/>
-        <w:t>Terenul aferent proprietății are o suprafață de 700 mp și este încadrat la categoria de folosință intravilan. Din punct de vedere fizic, amplasamentul terenului este tratat ca parte integrantă a ansamblului imobiliar evaluat, fără a se face alte precizări cantitative suplimentare în datele furnizate.</w:t>
+        <w:t>Terenul aferent proprietății are o suprafață de 700 mp și este încadrat în categoria de folosință intravilan. Din punct de vedere fizic, terenul reprezintă suportul amplasării construcției și este luat în considerare în forma și mărimea indicate în datele furnizate, fără alte elemente de parcelare sau servitute menționate expres în documentația disponibilă.</w:t>
         <w:br/>
         <w:br/>
-        <w:t>Pe teren este edificată o construcție cu arie utilă de 180 mp și arie construită desfășurată de 220 mp, cu an de referință 2026. În lipsa unor date suplimentare privind un eventual regim de înălțime, descrierea fizică a construcției se limitează la indicatorii de suprafață disponibili, aceștia fiind utilizați ca bază pentru evaluarea de piață și pentru alocarea valorii între teren și construcții.</w:t>
-        <w:br/>
-        <w:br/>
-        <w:t>În cadrul analizei de evaluare, valoarea terenului a fost estimată prin comparație la 39,52 EUR/mp, rezultând o valoare de 27.664,00 EUR, iar valoarea alocată construcțiilor a fost de 107.603,00 EUR. Valoarea de piață reconciliată a proprietății este de 135.267,00 EUR.</w:t>
+        <w:t>Construcția existentă pe teren are o arie utilă de 180 mp și o arie construită desfășurată de 220 mp, cu an de referință 2026. Regimul de înălțime nu a fost precizat distinct în datele furnizate, motiv pentru care descrierea fizică se limitează la suprafețele indicate și la anul de referință disponibil; în ansamblu, imobilul se prezintă ca proprietate construită, compusă din teren intravilan și construcția aferentă, astfel cum rezultă din informațiile comunicate pentru evaluare.</w:t>
       </w:r>
     </w:p>
     <w:p>
@@ -464,16 +488,13 @@
     </w:p>
     <w:p>
       <w:r>
-        <w:t>Analiza celei mai bune utilizări a proprietății are în vedere utilizarea care îndeplinește cumulativ condițiile de permisibilitate legală, posibilitate fizică, fezabilitate financiară și maximum productivă, conform conceptului CMBU utilizat în evaluare. În cazul de față, proprietatea este evaluată pentru garantarea creditului ipotecar, iar tipologia și indicatorii utilizați în evaluare sugerează o proprietate construită cu destinație rezidențială, situată pe teren intravilan de 700 mp, cu arie utilă de 180 mp și arie construită desfășurată de 220 mp.</w:t>
+        <w:t>Analiza celei mai bune utilizări a proprietății având ca scop garantarea creditului ipotecar indică, în condițiile date, menținerea utilizării rezidențiale existente ca fiind cea mai probabilă și relevantă opțiune de analiză. Pentru un teren intravilan de 700 mp, cu o construcție existentă având Au = 180 mp și Acd = 220 mp, utilizarea curentă poate fi considerată, în mod prudent, permisă legal și posibilă fizic, în absența unor informații contrare privind restricții urbanistice sau servituți care ar limita această destinație.</w:t>
         <w:br/>
         <w:br/>
-        <w:t>Din punct de vedere legal și fizic, utilizarea rezidențială existentă apare ca fiind compatibilă cu caracteristicile bunului imobil și cu modul său curent de exploatare. Nu sunt indicate date care să sugereze restricții legale sau constrângeri fizice care să impună o schimbare de destinație, iar pentru un teren intravilan de această dimensiune utilizarea construită existentă este, în mod rezonabil, posibilă și susținută de piață. În acest context, ipoteza unei păstrări a utilizării curente rezidențiale pare cea mai plauzibilă.</w:t>
+        <w:t>Din punct de vedere al fezabilității financiare, datele de piață susțin utilizarea existentă. Valoarea reconciliată prin abordarea prin piață este de 135267.00 EUR, iar alocarea valorii indică 107603.00 EUR pentru construcții și 27664.00 EUR pentru teren, ceea ce arată că proprietatea generează valoare în configurația actuală. În plus, abordarea prin cost conduce la o valoare de 178735.07 EUR, superioară valorii de piață, ceea ce sugerează că piața nu capitalizează integral costul de înlocuire al îmbunătățirilor, aspect frecvent întâlnit la proprietățile rezidențiale.</w:t>
         <w:br/>
         <w:br/>
-        <w:t>Din punct de vedere financiar, analiza de piață conduce la o valoare finală reconciliată de 135267.00 EUR, obținută prin abordarea prin piață, în timp ce abordarea prin cost indică o valoare de 178735.07 EUR. Diferența dintre aceste rezultate poate indica faptul că piața reflectă cu mai mult realism caracteristicile proprietății și nivelul cererii pentru astfel de imobile, iar utilizarea rezidențială existentă rămâne fezabilă financiar. Totodată, alocarea valorii rezultată din analiza de piață evidențiază o valoare a terenului de 27664.00 EUR și o valoare a construcțiilor de 107603.00 EUR, ceea ce susține faptul că îmbunătățirile existente contribuie la valoarea totală a proprietății.</w:t>
-        <w:br/>
-        <w:br/>
-        <w:t>În consecință, pe baza datelor disponibile, cea mai bună utilizare a proprietății este, cel mai probabil, utilizarea rezidențială existentă, menținută în configurația actuală. Această concluzie este susținută de faptul că utilizarea curentă pare permisă legal, posibilă fizic, fezabilă financiar și, în condițiile pieței analizate, probabil cea mai productivă pentru proprietatea evaluată.</w:t>
+        <w:t>Sub aspectul maximului productiv, analiza sugerează că utilizarea rezidențială existentă este cea mai potrivită, întrucât nu există date care să susțină, în mod justificat, o alternativă de utilizare care să conducă la o valoare superioară în contextul pieței analizate. Având în vedere rezultatele abordării prin piață, numărul redus de comparabile relevante și ponderea valorii construcțiilor în structura valorii totale, concluzia prudentă este că menținerea funcțiunii rezidențiale actuale reprezintă cea mai bună utilizare a proprietății în sensul criteriilor de permisibilitate legală, posibilitate fizică, fezabilitate financiară și productivitate maximă.</w:t>
       </w:r>
     </w:p>
     <w:p>
@@ -1060,16 +1081,16 @@
     </w:p>
     <w:p>
       <w:r>
-        <w:t xml:space="preserve">Ajustările din grilă au fost aplicate pentru a aduce comparabilele la nivelul proprietății evaluate, astfel încât diferențele dintre acestea să reflecte exclusiv abaterea relevantă față de subiect, iar nu particularități ale fiecărei tranzacții. Logica distinctă dintre etapa de tranzacție și etapa de proprietate este aceea că prima corectează elementele ținând de condițiile în care s-a realizat vânzarea sau oferta analizată, în timp ce a doua corectează diferențele de caracteristici între comparabil și proprietatea evaluată, pentru a permite o comparație omogenă și o indicație de valoare mai credibilă. </w:t>
+        <w:t>Ajustările din grila de piață au fost aplicate pentru a aduce proprietățile comparabile la un nivel de comparabilitate cât mai apropiat de proprietatea evaluată, în condițiile în care comparația pornește de la prețul tranzacției/oferta comparabilei și nu de la valoarea proprietății subiect. În această logică, diferențele dintre comparabile și subiect privind caracteristicile relevante sunt reflectate prin corecții, astfel încât prețurile comparabile să poată fi utilizate ca bază de estimare a valorii de piață.</w:t>
         <w:br/>
         <w:br/>
-        <w:t xml:space="preserve">În consecință, ajustările de la etapa de tranzacție au rolul de a neutraliza influențe precum momentul pieței, condițiile de negociere și alte particularități ale vânzării, iar ajustările de la etapa de proprietate urmăresc diferențele dintre suprafață, amplasament, configurație și alte caracteristici fizice ori economice ale activului. Această structură de lucru este adecvată în abordarea prin piață, deoarece valoarea este derivată din comparația cu tranzacții relevante, iar proprietățile comparabile trebuie aduse cât mai aproape de profilul subiectului evaluat. </w:t>
+        <w:t>Separarea ajustărilor în etapă de tranzacție și etapă de proprietate urmărește să distingă corecțiile determinate de condițiile tranzacției de cele generate de particularitățile fizice și economice ale imobilului. Ajustările de tranzacție vizează elemente care țin de contextul vânzării, respectiv de modul de formare a prețului, în timp ce ajustările de proprietate urmăresc diferențele de localizare, teren, suprafețe și alte caracteristici ale activului comparat față de proprietatea evaluată. Această structură este coerentă cu grila de comparație utilizată în evaluare, în care corecțiile sunt aplicate pentru fiecare element relevant, iar rezultatul corectat exprimă mai fidel poziția comparabilei față de subiect.</w:t>
         <w:br/>
         <w:br/>
-        <w:t xml:space="preserve">Comparabilul selectat a fost cel cu ajustarea brută minimă deoarece, dintre cele trei comparabile analizate, acesta a prezentat cea mai redusă nevoie de corecții cumulate pentru a fi aliniat la caracteristicile proprietății evaluate. Cu alte cuvinte, diferențele față de subiect au fost cele mai mici în ansamblu, ceea ce a redus volumul ajustărilor necesare și a condus la o indicație de valoare mai stabilă și mai puțin dependentă de corecții succesive. </w:t>
+        <w:t>Comparabilul selectat are ajustarea brută minimă deoarece prezintă, în ansamblu, cel mai apropiat profil față de proprietatea evaluată, ceea ce reduce volumul corecțiilor necesare pentru alinierea la subiect. În consecință, el oferă cea mai ridicată relevanță în cadrul analizei comparative, întrucât tranzacțiile care necesită cele mai mici corecții au, în mod logic, ponderea cea mai mare în fundamentarea valorii finale. Această selecție este susținută și de faptul că reconcilierea prin piață a condus la valoarea de 135267.00 EUR, utilizând comparabilul cu poziția cea mai apropiată în grila de ajustări.</w:t>
         <w:br/>
         <w:br/>
-        <w:t>Aceeași logică se reflectă și în analiza pe teren, unde comparația a condus la o valoare de 39.52 EUR/mp, utilizată pentru terenul de 700 mp, rezultând 27,664.00 EUR; diferența rămasă până la valoarea finală reconciliată a fost alocată construcției, respectiv 107,603.00 EUR. În acest cadru, alegerea comparabilului cu ajustarea brută minimă susține credibilitatea indicației de piață și coerența întregii reconcilieri dintre teren și construcție.</w:t>
+        <w:t>În cazul de față, analiza terenului și alocarea valorii pe componente au fost separate de estimarea valorii totale tocmai pentru a menține coerența logicii comparative. Valoarea terenului, estimată prin comparație la 39.52 EUR/mp, conduce la 27664.00 EUR pentru terenul de 700 mp, iar diferența până la valoarea totală reconciliată a fost alocată construcțiilor la nivelul de 107603.00 EUR. Această abordare permite ca ajustările să reflecte distinct contribuția fiecărei componente la valoarea de piață, fără a dubla efectele acelorași diferențe în cadrul analizei comparative.</w:t>
       </w:r>
     </w:p>
     <w:p>
@@ -1092,13 +1113,16 @@
     </w:p>
     <w:p>
       <w:r>
-        <w:t>În urma aplicării abordărilor de evaluare, analiza sugerează că abordarea prin piață este cea mai relevantă pentru scopul prezentului raport, respectiv garantarea creditului ipotecar, întrucât reflectă cel mai direct comportamentul pieței pentru o proprietate comparabilă și conduce la o indicație a valorii de 135267.00 EUR. Abordarea prin cost a condus la o valoare de 178735.07 EUR, determinată pe baza CIB=182600.00 EUR, a unei durate de viață utile de 16.00 ani și a unei deprecieri fizice de 17.27%, cu CIN=151071.07 EUR; această indicație exprimă costul depreciat al activului, dar poate suprima influența condițiilor concrete de piață observate pentru proprietatea evaluată.</w:t>
+        <w:t>În urma aplicării abordărilor de evaluare adecvate scopului de garantare a creditului ipotecar, analiza a condus la o valoare de piață reconciliată de 135267.00 EUR, exprimată în moneda de raportare și raportată la anul de referință 2026. Pentru acest tip de valoare, selectarea și ponderarea abordărilor se bazează pe relevanța lor pentru natura activului și pe credibilitatea informațiilor de piață disponibile, iar reconcilierea reprezintă alegerea valorii considerate celei mai potrivite situației concrete dintre rezultatele obținute prin metodele aplicate.</w:t>
         <w:br/>
         <w:br/>
-        <w:t>Compararea celor două abordări evidențiază un ecart semnificativ între indicația prin cost și cea prin piață, ceea ce poate indica faptul că valoarea rezultată din cost surprinde mai ales componenta de înlocuire a bunului, în timp ce piața reflectă mai adecvat cererea și oferta pentru proprietăți similare. În cadrul abordării prin piață au fost analizate 3 comparabile, iar comparabilul selectat a fost cel cu index 0, iar pentru teren a fost utilizat comparabilul cu index 2, rezultând o valoare de 39.52 EUR/mp, respectiv 27664.00 EUR pentru terenul de 700 mp. Diferența până la valoarea totală a proprietății a condus la o valoare alocată construcțiilor de 107603.00 EUR, ceea ce susține coerența internă a reconcilierii.</w:t>
+        <w:t>Abordarea prin piață a furnizat rezultatul final utilizat la reconciliere, prin analiza unui număr de 3 comparabile, fiind selectat comparabilul index 0 pentru estimarea prețului total. În cadrul componentei funciare, terenul a fost evaluat prin comparație la 39.52 EUR/mp, rezultând 27664.00 EUR pentru suprafața de 700 mp, iar valoarea alocată construcției a fost de 107603.00 EUR. Această structurare sugerează o bună separare a valorii terenului de cea a construcției și susține utilizarea metodei de piață ca referință principală pentru opinia de valoare.</w:t>
         <w:br/>
         <w:br/>
-        <w:t>Având în vedere scopul evaluării, calitatea și relevanța informațiilor de piață disponibile, precum și faptul că valoarea de piață trebuie să reflecte condițiile de tranzacționare cele mai probabile pentru proprietatea subiect, valoarea finală reconciliată este stabilită la 135267.00 EUR. Această valoare este determinată prin ponderarea preponderentă a abordării prin piață, iar abordarea prin cost este utilizată cu rol de control și verificare a plauzibilității rezultatului obținut din piață. Pentru beneficiarul/finanțatorul Banca Comerciala Exemplu S.A., valoarea indicată reprezintă opinia evaluatorului privind valoarea de piață a proprietății evaluate la anul de referință 2026.</w:t>
+        <w:t>Abordarea prin cost a indicat o valoare de 178735.07 EUR, rezultată din CIB = 182600.00, Vcp = 16.00 ani, depreciere fizică de 17.27% și CIN = 151071.07. Diferența față de rezultatul prin piață poate indica faptul că metoda costului surprinde mai degrabă costul de înlocuire/reproducere depreciat, în timp ce piața reflectă mai direct comportamentul participanților la tranzacție și ajustările generate de condițiile concrete ale cererii și ofertei. În consecință, pentru prezenta evaluare, rezultatul prin piață a fost considerat mai relevant și a primit ponderea determinantă în reconciliere.</w:t>
+        <w:br/>
+        <w:br/>
+        <w:t>Ținând seama de scopul evaluării, de informațiile de piață disponibile și de adecvarea comparabilului selectat, valoarea finală a proprietății este estimată la 135267.00 EUR. Opinia evaluatorului este că această valoare reprezintă cea mai potrivită estimare a valorii de piață pentru activul evaluat, în condițiile și ipotezele avute în vedere, pentru Banca Comerciala Exemplu S.A..</w:t>
       </w:r>
     </w:p>
     <w:p>
@@ -1256,13 +1280,13 @@
     </w:p>
     <w:p>
       <w:r>
-        <w:t>În evaluarea riscului asociat garanției, proprietatea analizată prezintă caracteristicile unui activ imobiliar rezidențial/investițional obișnuit, cu o suprafață a terenului de 700 mp, amplasat în intravilan, și cu o arie utilă de 180 mp și o arie construită desfășurată de 220 mp. Valoarea de piață reconciliată de 135267.00 EUR, determinată prin abordarea prin piață, indică faptul că, la data evaluării, activul este compatibil cu cerințele curente ale pieței pentru astfel de proprietăți, iar alocarea indică o pondere semnificativă a valorii aferente construcțiilor, respectiv 107603.00 EUR, față de terenul evaluat la 27664.00 EUR.</w:t>
+        <w:t xml:space="preserve">Riscul asociat garanției, analizat în contextul GEV 520 Anexa A5, este apreciat ca fiind moderat, în condițiile în care bunul evaluat are o utilizare rezidențială curentă și se înscrie într-un segment de piață în care lichiditatea este, în principiu, dependentă de nivelul cererii locale și de calitatea amplasamentului. Valoarea de piață reconciliată de 135267.00 EUR, determinată prin abordarea prin piață, și alocarea valorii între terenul de 700 mp și construcția cu Aria utilă de 180 mp și Aria construită desfășurată de 220 mp sugerează că garanția dispune de o bază de valoare relevantă pentru scopul garantării creditului ipotecar, însă performanța acesteia pe durata creditului va depinde de evoluția condițiilor locale de piață. </w:t>
         <w:br/>
         <w:br/>
-        <w:t>Din perspectiva factorilor relevanți pentru performanța garanției pe perioada creditului, analiza trebuie corelată cu activitatea curentă și tendințele pieței, precum și cu cererea anterioară, curentă și viitoare pentru tipul de bun și pentru localizare. În lipsa unor elemente particulare care să indice o piață restrânsă sau atipică, rezultatul obținut prin comparație cu 3 comparabile sugerează că proprietatea se încadrează într-un segment în care există referințe tranzacționale utilizabile, ceea ce susține vandabilitatea. Totodată, cererea pentru alte utilizări poate influența limita de absorbție în piață, însă, în absența unor date care să indice o potențială reconversie superioară, utilitatea principală a proprietății rămâne cea actuală.</w:t>
+        <w:t xml:space="preserve">Din perspectiva factorilor relevanți pentru performanța garanției pe perioada creditului, activitatea curentă și tendințele pieței indică o dependență de dinamica tranzacțiilor pentru proprietăți similare și de menținerea atractivității zonei. Cererea anterioară, curentă și viitoare pentru tipul de bun și pentru localizare poate susține vandabilitatea în măsura în care proprietățile comparabile continuă să fie absorbite de piață într-un interval rezonabil, însă datele disponibile nu permit cuantificarea acestei absorbții. Cererea pentru alte utilizări este, în mod uzual, limitată de caracteristicile fizice și de încadrarea urbanistică a terenului și construcției, astfel încât flexibilitatea de conversie a garanției trebuie apreciată prudent, fără a presupune o utilizare alternativă certă. </w:t>
         <w:br/>
         <w:br/>
-        <w:t>Evenimentele previzibile pe durata creditului, precum modificări ale condițiilor generale de piață, ale cererii locale sau ale nivelului de înlocuire și depreciere al construcției, pot influența valoarea viitoare a garanției. Abordarea prin cost indică o depreciere fizică de 17.27% și un Vcp de 16.00 ani, elemente care pot sugera o sensibilitate moderată a valorii în timp, mai ales în ipoteza în care nu se realizează investiții de menținere. În ansamblu, garanția poate fi apreciată ca având o lichiditate și vandabilitate rezonabile, în condițiile unei piețe funcționale, iar gradul de adecvare ca garanție apare corespunzător scopului de garantare a creditului ipotecar, sub rezerva menținerii caracteristicilor actuale ale imobilului și ale contextului de piață.</w:t>
+        <w:t>Impactul evenimentelor previzibile asupra valorii viitoare a garanției poate include variații ale cererii locale, modificări ale condițiilor de finanțare și posibile schimbări ale preferințelor cumpărătorilor, factori care pot influența atât durata de expunere la vânzare, cât și nivelul prețului realizabil. În acest context, lichiditatea poate fi considerată medie, iar vandabilitatea bună, în măsura în care prețul de piață estimat rămâne competitiv față de comparabilele selectate. Gradul de adecvare ca garanție este apreciat ca satisfăcător pentru scopul declarat, având în vedere valoarea de piață determinată, structura valorii între teren și construcție și utilizarea rezidențială curentă, cu mențiunea că menținerea acestui nivel de adecvare este condiționată de evoluția pieței pe durata creditului.</w:t>
       </w:r>
     </w:p>
     <w:p>

</xml_diff>

<commit_message>
Regenerez raportul Breaza cu nota AI-vs-determinist (Termeni de referință)
Co-Authored-By: Claude Opus 4.8 (1M context) <noreply@anthropic.com>
</commit_message>
<xml_diff>
--- a/docs/exemplu-raport-breaza.docx
+++ b/docs/exemplu-raport-breaza.docx
@@ -304,6 +304,17 @@
       </w:r>
     </w:p>
     <w:p>
+      <w:r>
+        <w:rPr>
+          <w:b/>
+        </w:rPr>
+        <w:t xml:space="preserve">Asistare software si componenta AI (transparenta): </w:t>
+      </w:r>
+      <w:r>
+        <w:t>raportul a fost intocmit cu ajutorul unui instrument software de asistenta a evaluarii. TOATE valorile numerice din raport (costuri, grilele de comparatie si ajustari, capitalizare / DCF, reconcilierea, alocarea valorii si valoarea finala) sunt DETERMINISTE — sunt calculate de motorul de evaluare si reproductibile din datele de intrare; ele NU sunt generate de inteligenta artificiala. Textul narativ explicativ a fost generat cu asistenta instrumentului software (optional cu asistenta AI, pe date anonimizate, fara transmiterea datelor cu caracter personal) si a fost verificat, corectat si asumat integral de evaluatorul autorizat ANEVAR, caruia ii apartine valoarea si responsabilitatea profesionala. Instrumentul asista evaluatorul; nu il inlocuieste si nu decide valoarea.</w:t>
+      </w:r>
+    </w:p>
+    <w:p>
       <w:pPr>
         <w:pStyle w:val="Heading1"/>
       </w:pPr>
@@ -371,13 +382,16 @@
     </w:p>
     <w:p>
       <w:r>
-        <w:t>Ipotezele generale care au stat la baza prezentei evaluări sunt cele uzuale pentru un demers de evaluare întocmit în scopul garantării creditului ipotecar: se presupune că dreptul de proprietate este valabil, opozabil și liber de sarcini, cu excepția eventualelor mențiuni expres evidențiate în documentația pusă la dispoziție; informațiile utilizate sunt considerate corecte și complete în limitele date; iar valoarea estimată este o valoare de piață determinată conform SEV 102, în EUR.</w:t>
+        <w:t>Se presupune că dreptul de proprietate asupra imobilului evaluat este valabil, opozabil și liber de sarcini, cu excepția eventualelor mențiuni expres consemnate în documentele puse la dispoziție de client sau în actele analizate pe parcursul misiunii de evaluare. De asemenea, se presupune că datele de identificare și caracteristicile prezentate pentru activ — amplasamentul, suprafața de teren de 700 mp, regimul de intravilan, aria utilă de 180 mp și aria construită desfășurată de 220 mp — sunt corecte și complete la data evaluării.</w:t>
         <w:br/>
         <w:br/>
-        <w:t>Se mai presupune că imobilul identificat prin Breaza de Sus, jud. Prahova, 2xxxx (demo) și CF xxxxx Breaza (demo) are o situație juridică și tehnică compatibilă cu utilizarea analizată, că structura de rezistență și elementele constructive sunt în stare corespunzătoare utilizării normale, fără a fi necesare investigații distructive sau ascunse, iar eventualele neconformități care nu au putut fi constatate la data inspecției nu au fost cuantificate distinct. Suprafața terenului de 700 mp, categoria intravilan, precum și suprafețele de 180 mp arie utilă și 220 mp arie construită desfășurată au fost preluate ca date de intrare pentru analiză, fără verificări tehnice suplimentare care să depășească cadrul misiunii.</w:t>
+        <w:t>Se mai presupune că structura de rezistență, finisajele, instalațiile și toate elementele constructive ale imobilului sunt în stare corespunzătoare de exploatare și nu prezintă vicii ascunse ori degradări care ar putea influența semnificativ valoarea, cu excepția celor care ar fi putut fi observate în limitele inspecției efectuate. Raportul se întocmește fără efectuarea de investigații tehnice de specialitate, fără expertize structurale, fără verificări geotehnice și fără cercetări distructive, astfel încât orice condiții ascunse sau neidentificabile vizual rămân în afara prezentului demers evaluativ.</w:t>
         <w:br/>
         <w:br/>
-        <w:t>Evaluarea a fost elaborată exclusiv pentru scopul declarat și pentru beneficiarul/finanțatorul Banca Comerciala Exemplu S.A.; raportul nu poate fi utilizat pentru alte destinații, în alte contexte de piață sau de garantare, fără acordul evaluatorului și fără o eventuală actualizare a ipotezelor. Concluzia de valoare de 135267.00 EUR reflectă condițiile de piață și ipotezele aplicate la data evaluării, fiind susținută preponderent de abordarea prin piață, iar alocarea valorii între teren și construcții a fost realizată numai în scopul prezentării analizei și nu constituie o expertiză tehnică a componentelor imobilului.</w:t>
+        <w:t>Evaluarea se bazează pe informațiile disponibile la data raportului și este destinată exclusiv scopului declarat, respectiv garantarea creditului ipotecar în favoarea Băncii Comerciale Exemplu S.A.. Concluzia asupra valorii, exprimată ca valoare de piață în sensul SEV 102, este valabilă numai în contextul acestei utilizări și nu poate fi extinsă către alte scopuri, utilizatori sau situații fără o analiză nouă, adaptată condițiilor specifice ale acelui demers.</w:t>
+        <w:br/>
+        <w:br/>
+        <w:t>Se presupune, totodată, că nu există alte limitări juridice, urbanistice, fiscale sau tehnice, în afara celor cunoscute și prezentate evaluatorului, care să afecteze în mod semnificativ valoarea estimată. Orice modificare a premiselor avute în vedere — inclusiv asupra stării juridice, tehnice sau economice a imobilului — poate conduce la o schimbare a valorii concluzionate în prezentul raport.</w:t>
       </w:r>
     </w:p>
     <w:p>
@@ -400,13 +414,13 @@
     </w:p>
     <w:p>
       <w:r>
-        <w:t>Piața imobiliară locală relevantă pentru proprietatea evaluată se caracterizează printr-un nivel de cerere care poate fi susținut pentru active comparabile, însă tranzacționarea rămâne dependentă de potrivirea dintre amplasament, suprafață, caracteristicile constructive și nivelul de preț solicitat. În evaluare au fost utilizate 3 comparabile de piață pentru abordarea prin comparații, ceea ce sugerează existența unor repere suficiente pentru fundamentarea analizei, fără a indica însă o piață foarte profundă sau foarte largă.</w:t>
+        <w:t>Piața imobiliară locală relevantă pentru proprietatea evaluată este una în care analiza comparabilelor utilizate sugerează existența unei cereri active pentru proprietăți similare, dar și a unei oferte suficient de diversificate încât selecția comparabilelor să permită o corecție prin comparație directă. Utilizarea a 3 comparabile pentru metoda prin piață indică o bază de analiză restrânsă, dar adecvată pentru reflectarea nivelului curent al valorilor tranzacționate sau ofertate în zona relevantă.</w:t>
         <w:br/>
         <w:br/>
-        <w:t>Din perspectiva ofertei, nivelul de preț rezultat din comparații arată că proprietățile similare pot fi prezentate pe piață la valori diferite, în funcție de particularitățile fiecărui activ. Pentru teren, analiza comparativă a indicat un nivel de 39.52 EUR/mp, aplicat la suprafața de 700 mp, rezultând o valoare de 27664.00 EUR; această relație poate indica un interes de piață pentru terenuri intravilane similare, dar și o sensibilitate semnificativă la condițiile specifice fiecărei proprietăți.</w:t>
+        <w:t>Din perspectiva lichidității, datele disponibile indică o piață cu absorbție moderată, în care proprietățile similare pot fi valorificate, însă cu necesitatea unei poziționări corecte față de caracteristicile comparabilelor. Valoarea rezultată prin abordarea prin piață, de 135267.00 EUR, confirmă că prețul de piață este determinat preponderent de relația dintre cerere și ofertă, precum și de diferențele dintre proprietatea evaluată și elementele de comparație selectate. Alegerea comparabilului de teren index 2 din 3 și a comparabilului principal pentru întreaga proprietate sugerează că diferențele de amplasament, caracteristici și condiții de piață au fost relevante în formarea valorii.</w:t>
         <w:br/>
         <w:br/>
-        <w:t>Lichiditatea poate fi apreciată ca fiind moderată, în sensul că există suficiente repere pentru estimarea valorii de piață, însă realizarea tranzacției depinde de atractivitatea individuală a activului și de condițiile curente ale pieței locale. Valoarea finală reconciliată de 135267.00 EUR, obținută prin abordarea prin piață, susține concluzia că prețul de piață este determinat preponderent de comparabilele disponibile, iar alocarea valorii către construcții, în cuantum de 107603.00 EUR, confirmă ponderea principală a componentei construite în formarea valorii totale.</w:t>
+        <w:t>Tendințele observate prin analiza comparabilelor indică o piață locală în care terenurile intravilane continuă să reprezinte un reper important în formarea valorii, iar contribuția terenului, estimată la 27664.00 EUR, are o pondere semnificativă în structura valorii totale. În același timp, alocarea de 107603.00 EUR pentru construcții arată că evaluarea a fost influențată atât de componenta funciară, cât și de cea construită, într-un context de piață în care diferențele între proprietățile comparabile pot genera variații notabile ale prețului final.</w:t>
       </w:r>
     </w:p>
     <w:p>
@@ -459,13 +473,13 @@
     </w:p>
     <w:p>
       <w:r>
-        <w:t>Imobilul evaluat este identificat din punct de vedere cadastral și funciar prin 2xxxx (demo) și CF xxxxx Breaza (demo), conform evidențelor puse la dispoziție, în beneficiul Client demonstrativ și al finanțatorului Banca Comerciala Exemplu S.A. Proprietatea este analizată ca imobil compus din teren și construcție, în vederea garantării creditului ipotecar, iar prezentul capitol descrie elementele juridice și fizice relevante pentru evaluare.</w:t>
+        <w:t>Imobilul evaluat este identificat în documentația cadastrală și în cartea funciară prin marcajele 2xxxx (demo) și CF xxxxx Breaza (demo), acestea reprezentând referințele de evidență ale proprietății. Evaluarea s-a realizat pentru Client demonstrativ, în scopul garantării creditului ipotecar acordat de Banca Comerciala Exemplu S.A.</w:t>
         <w:br/>
         <w:br/>
-        <w:t>Terenul aferent proprietății are o suprafață de 700 mp și este încadrat în categoria de folosință intravilan. Din punct de vedere fizic, terenul reprezintă suportul amplasării construcției și este luat în considerare în forma și mărimea indicate în datele furnizate, fără alte elemente de parcelare sau servitute menționate expres în documentația disponibilă.</w:t>
+        <w:t>Proprietatea cuprinde un teren intravilan în suprafață de 700 mp, pe care este edificată o construcție cu arie utilă de 180 mp și arie construită desfășurată de 220 mp. Anul de referință indicat pentru construcție este 2026, iar regimul de înălțime nu a fost furnizat în datele puse la dispoziție.</w:t>
         <w:br/>
         <w:br/>
-        <w:t>Construcția existentă pe teren are o arie utilă de 180 mp și o arie construită desfășurată de 220 mp, cu an de referință 2026. Regimul de înălțime nu a fost precizat distinct în datele furnizate, motiv pentru care descrierea fizică se limitează la suprafețele indicate și la anul de referință disponibil; în ansamblu, imobilul se prezintă ca proprietate construită, compusă din teren intravilan și construcția aferentă, astfel cum rezultă din informațiile comunicate pentru evaluare.</w:t>
+        <w:t>Din punct de vedere fizic, imobilul se descrie prin ansamblul teren–construcție, terenul având categoria de intravilan, iar construcția fiind analizată prin suprafețele sale utile și construite desfășurate. Din punct de vedere juridic, identificarea se păstrează prin elementele cadastrale și de carte funciară indicate, fără a se adăuga alte mențiuni necomunicate în datele disponibile.</w:t>
       </w:r>
     </w:p>
     <w:p>
@@ -488,13 +502,16 @@
     </w:p>
     <w:p>
       <w:r>
-        <w:t>Analiza celei mai bune utilizări a proprietății având ca scop garantarea creditului ipotecar indică, în condițiile date, menținerea utilizării rezidențiale existente ca fiind cea mai probabilă și relevantă opțiune de analiză. Pentru un teren intravilan de 700 mp, cu o construcție existentă având Au = 180 mp și Acd = 220 mp, utilizarea curentă poate fi considerată, în mod prudent, permisă legal și posibilă fizic, în absența unor informații contrare privind restricții urbanistice sau servituți care ar limita această destinație.</w:t>
+        <w:t>Analiza celei mai bune utilizări a proprietății imobiliare este realizată în raport cu criteriile de permisibilitate legală, posibilitate fizică, fezabilitate financiară și maximă productivitate, în sensul utilizării care conduce la cea mai mare valoare de piață. În cazul de față, proprietatea evaluată are ca destinație actuală o utilizare rezidențială, iar datele disponibile indică un teren intravilan de 700 mp și o construcție cu arie utilă de 180 mp și arie construită desfășurată de 220 mp.</w:t>
         <w:br/>
         <w:br/>
-        <w:t>Din punct de vedere al fezabilității financiare, datele de piață susțin utilizarea existentă. Valoarea reconciliată prin abordarea prin piață este de 135267.00 EUR, iar alocarea valorii indică 107603.00 EUR pentru construcții și 27664.00 EUR pentru teren, ceea ce arată că proprietatea generează valoare în configurația actuală. În plus, abordarea prin cost conduce la o valoare de 178735.07 EUR, superioară valorii de piață, ceea ce sugerează că piața nu capitalizează integral costul de înlocuire al îmbunătățirilor, aspect frecvent întâlnit la proprietățile rezidențiale.</w:t>
+        <w:t>Din punct de vedere fizic, configurația lotului și existența unei construcții cu funcțiune rezidențială permit continuarea exploatării în condiții uzuale de piață, fără a rezulta din datele furnizate elemente care să impună o schimbare a utilizării. Din punct de vedere legal, în lipsa unor restricții contrare menționate în datele disponibile, utilizarea rezidențială existentă poate fi considerată permisibilă și compatibilă cu caracteristicile unui teren intravilan.</w:t>
         <w:br/>
         <w:br/>
-        <w:t>Sub aspectul maximului productiv, analiza sugerează că utilizarea rezidențială existentă este cea mai potrivită, întrucât nu există date care să susțină, în mod justificat, o alternativă de utilizare care să conducă la o valoare superioară în contextul pieței analizate. Având în vedere rezultatele abordării prin piață, numărul redus de comparabile relevante și ponderea valorii construcțiilor în structura valorii totale, concluzia prudentă este că menținerea funcțiunii rezidențiale actuale reprezintă cea mai bună utilizare a proprietății în sensul criteriilor de permisibilitate legală, posibilitate fizică, fezabilitate financiară și productivitate maximă.</w:t>
+        <w:t>Din perspectivă financiară, abordarea prin piață conduce la o valoare de piață reconcilitată de 135267.00 EUR, în timp ce abordarea prin cost indică o valoare de 178735.07 EUR. Diferența dintre aceste rezultate poate sugera că valoarea de piață este influențată de comportamentul pieței pentru proprietăți comparabile, iar utilizarea rezidențială existentă rămâne fezabilă financiar în contextul de piață analizat. Valoarea terenului estimată prin comparație, de 27664.00 EUR, și valoarea alocată construcției, de 107603.00 EUR, susțin concluzia că proprietatea este valorificată în principal prin menținerea utilizării curente.</w:t>
+        <w:br/>
+        <w:br/>
+        <w:t>În consecință, cea mai bună utilizare a proprietății, în ipoteza analizată, este menținerea utilizării rezidențiale existente, aceasta fiind utilizarea care pare să îndeplinească în mod cumulativ criteriile de permisibilitate legală, posibilitate fizică, fezabilitate financiară și maximă productivitate.</w:t>
       </w:r>
     </w:p>
     <w:p>
@@ -1081,16 +1098,13 @@
     </w:p>
     <w:p>
       <w:r>
-        <w:t>Ajustările din grila de piață au fost aplicate pentru a aduce proprietățile comparabile la un nivel de comparabilitate cât mai apropiat de proprietatea evaluată, în condițiile în care comparația pornește de la prețul tranzacției/oferta comparabilei și nu de la valoarea proprietății subiect. În această logică, diferențele dintre comparabile și subiect privind caracteristicile relevante sunt reflectate prin corecții, astfel încât prețurile comparabile să poată fi utilizate ca bază de estimare a valorii de piață.</w:t>
+        <w:t>Justificarea ajustărilor aplicate în grila de comparație pornește de la principiul că diferențele dintre proprietatea evaluată și comparabile trebuie reflectate prin corecții astfel încât prețurile de tranzacție/ofertă să fie aduse la un nivel cât mai apropiat de condițiile proprietății analizate. În cadrul abordării prin piață, ajustările se aplică asupra prețurilor comparabile pentru a surprinde diferențele de etapă de tranzacție versus proprietate, precum și diferențele de caracteristici relevante ale activului, iar comparabilele care necesită corecții mai reduse au, în mod firesc, o relevanță mai mare în estimarea finală a valorii.</w:t>
         <w:br/>
         <w:br/>
-        <w:t>Separarea ajustărilor în etapă de tranzacție și etapă de proprietate urmărește să distingă corecțiile determinate de condițiile tranzacției de cele generate de particularitățile fizice și economice ale imobilului. Ajustările de tranzacție vizează elemente care țin de contextul vânzării, respectiv de modul de formare a prețului, în timp ce ajustările de proprietate urmăresc diferențele de localizare, teren, suprafețe și alte caracteristici ale activului comparat față de proprietatea evaluată. Această structură este coerentă cu grila de comparație utilizată în evaluare, în care corecțiile sunt aplicate pentru fiecare element relevant, iar rezultatul corectat exprimă mai fidel poziția comparabilei față de subiect.</w:t>
+        <w:t>În cazul de față, ajustarea din etapa de tranzacție este justificată prin necesitatea de a pune pe aceeași bază datele de piață utilizate în grilă, respectiv de a corela prețurile observate cu condițiile efective în care au fost obținute. Această corecție urmărește eliminarea distorsiunilor generate de faptul că informația de piață poate proveni din tranzacții sau oferte, iar comparabilitatea trebuie evaluată consecvent, astfel încât prețul utilizat să reflecte cât mai bine condițiile proprietății evaluate. Ajustările la nivel de proprietate vizează diferențele de amplasament, dimensiuni, configurație, stare și alți factori specifici, în măsura în care aceștia influențează direct nivelul de piață observat și permit o comparație pertinentă cu proprietatea subiect.</w:t>
         <w:br/>
         <w:br/>
-        <w:t>Comparabilul selectat are ajustarea brută minimă deoarece prezintă, în ansamblu, cel mai apropiat profil față de proprietatea evaluată, ceea ce reduce volumul corecțiilor necesare pentru alinierea la subiect. În consecință, el oferă cea mai ridicată relevanță în cadrul analizei comparative, întrucât tranzacțiile care necesită cele mai mici corecții au, în mod logic, ponderea cea mai mare în fundamentarea valorii finale. Această selecție este susținută și de faptul că reconcilierea prin piață a condus la valoarea de 135267.00 EUR, utilizând comparabilul cu poziția cea mai apropiată în grila de ajustări.</w:t>
-        <w:br/>
-        <w:br/>
-        <w:t>În cazul de față, analiza terenului și alocarea valorii pe componente au fost separate de estimarea valorii totale tocmai pentru a menține coerența logicii comparative. Valoarea terenului, estimată prin comparație la 39.52 EUR/mp, conduce la 27664.00 EUR pentru terenul de 700 mp, iar diferența până la valoarea totală reconciliată a fost alocată construcțiilor la nivelul de 107603.00 EUR. Această abordare permite ca ajustările să reflecte distinct contribuția fiecărei componente la valoarea de piață, fără a dubla efectele acelorași diferențe în cadrul analizei comparative.</w:t>
+        <w:t>Comparabilul selectat a fost cel cu ajustarea brută minimă deoarece, dintre cele trei comparabile analizate, acesta a necesitat cele mai mici corecții totale pentru a deveni comparabil cu proprietatea evaluată. Această selecție este în concordanță cu logica grilei, potrivit căreia tranzacțiile sau ofertele care necesită cele mai mici ajustări au ponderea cea mai mare în fundamentarea valorii finale, întrucât indică cel mai ridicat grad de similaritate și, implicit, un nivel mai bun de încredere în prețul corectat rezultat. În aceste condiții, valoarea de piață reconciliată de 135267.00 EUR reflectă comparabilul considerat cel mai relevant în raport cu proprietatea evaluată, iar alocarea ulterioară a valorii pe teren și construcții rămâne aliniată cu structura economică rezultată din analiza de piață.</w:t>
       </w:r>
     </w:p>
     <w:p>
@@ -1113,16 +1127,13 @@
     </w:p>
     <w:p>
       <w:r>
-        <w:t>În urma aplicării abordărilor de evaluare adecvate scopului de garantare a creditului ipotecar, analiza a condus la o valoare de piață reconciliată de 135267.00 EUR, exprimată în moneda de raportare și raportată la anul de referință 2026. Pentru acest tip de valoare, selectarea și ponderarea abordărilor se bazează pe relevanța lor pentru natura activului și pe credibilitatea informațiilor de piață disponibile, iar reconcilierea reprezintă alegerea valorii considerate celei mai potrivite situației concrete dintre rezultatele obținute prin metodele aplicate.</w:t>
+        <w:t>În cadrul prezentului raport, reconcilierea rezultatelor a avut la bază analiza comparativă a celor două abordări aplicate, respectiv abordarea prin piață și abordarea prin cost, în raport cu scopul evaluării, acela de garantare a creditului ipotecar, și cu tipul valorii estimate, respectiv valoarea de piață. În acord cu principiile de evaluare, selectarea metodei finale trebuie să țină seama de adecvarea abordării la obiectivul evaluării, de natura proprietății și de credibilitatea informațiilor utilizate, iar reconcilierea constă în selectarea valorii considerate cea mai potrivită situației concrete dintre valorile obținute.</w:t>
         <w:br/>
         <w:br/>
-        <w:t>Abordarea prin piață a furnizat rezultatul final utilizat la reconciliere, prin analiza unui număr de 3 comparabile, fiind selectat comparabilul index 0 pentru estimarea prețului total. În cadrul componentei funciare, terenul a fost evaluat prin comparație la 39.52 EUR/mp, rezultând 27664.00 EUR pentru suprafața de 700 mp, iar valoarea alocată construcției a fost de 107603.00 EUR. Această structurare sugerează o bună separare a valorii terenului de cea a construcției și susține utilizarea metodei de piață ca referință principală pentru opinia de valoare.</w:t>
+        <w:t>Abordarea prin cost a condus la o indicație de 178735.07 EUR, rezultată dintr-un CIB de 182600.00 EUR, o durată de viață probabilă de 16.00 ani, o depreciere fizică de 17.27%, un CIN de 151071.07 EUR și o valoare a terenului inclusă în estimare, determinată prin comparație, de 27664.00 EUR. Această abordare este utilă pentru verificarea logicii valorii prin raportare la costurile de înlocuire și la depreciere, însă pentru proprietățile rezidențiale comparabile active pe piață, poate avea un grad mai redus de reprezentare a comportamentului cumpărătorilor decât abordarea prin piață.</w:t>
         <w:br/>
         <w:br/>
-        <w:t>Abordarea prin cost a indicat o valoare de 178735.07 EUR, rezultată din CIB = 182600.00, Vcp = 16.00 ani, depreciere fizică de 17.27% și CIN = 151071.07. Diferența față de rezultatul prin piață poate indica faptul că metoda costului surprinde mai degrabă costul de înlocuire/reproducere depreciat, în timp ce piața reflectă mai direct comportamentul participanților la tranzacție și ajustările generate de condițiile concrete ale cererii și ofertei. În consecință, pentru prezenta evaluare, rezultatul prin piață a fost considerat mai relevant și a primit ponderea determinantă în reconciliere.</w:t>
-        <w:br/>
-        <w:br/>
-        <w:t>Ținând seama de scopul evaluării, de informațiile de piață disponibile și de adecvarea comparabilului selectat, valoarea finală a proprietății este estimată la 135267.00 EUR. Opinia evaluatorului este că această valoare reprezintă cea mai potrivită estimare a valorii de piață pentru activul evaluat, în condițiile și ipotezele avute în vedere, pentru Banca Comerciala Exemplu S.A..</w:t>
+        <w:t>Abordarea prin piață a condus la o valoare de 135267.00 EUR, pe baza unui număr de 3 comparabile, cu selectarea comparabilului de index 0 pentru valoarea totală și a comparabilului de index 2 pentru estimarea terenului, la un nivel de 39.52 EUR/mp, respectiv 27664.00 EUR pentru 700 mp. Având în vedere caracterul de piață al valorii solicitate, gradul de relevanță al comparațiilor disponibile și faptul că această abordare reflectă direct tranzacții/cereri/ofertări comparabile, aceasta a fost considerată cea mai adecvată pentru reconciliere, motiv pentru care valoarea finală reconciliată a fost stabilită la 135267.00 EUR, reprezentând valoarea de piață estimată a proprietății.</w:t>
       </w:r>
     </w:p>
     <w:p>
@@ -1280,13 +1291,13 @@
     </w:p>
     <w:p>
       <w:r>
-        <w:t xml:space="preserve">Riscul asociat garanției, analizat în contextul GEV 520 Anexa A5, este apreciat ca fiind moderat, în condițiile în care bunul evaluat are o utilizare rezidențială curentă și se înscrie într-un segment de piață în care lichiditatea este, în principiu, dependentă de nivelul cererii locale și de calitatea amplasamentului. Valoarea de piață reconciliată de 135267.00 EUR, determinată prin abordarea prin piață, și alocarea valorii între terenul de 700 mp și construcția cu Aria utilă de 180 mp și Aria construită desfășurată de 220 mp sugerează că garanția dispune de o bază de valoare relevantă pentru scopul garantării creditului ipotecar, însă performanța acesteia pe durata creditului va depinde de evoluția condițiilor locale de piață. </w:t>
+        <w:t>În analiza riscului asociat garanției, proprietatea evaluată pentru garantarea creditului ipotecar prezintă o poziționare compatibilă cu cerințele de lichiditate specifice unei garanții imobiliare, valoarea de piață reconcilată fiind de 135267.00 EUR la anul de referință 2026. Conform cerințelor GEV 520, aprecierea performanței garanției pe perioada creditului trebuie raportată la activitatea curentă și tendințele pieței relevante, precum și la cererea pentru tipul de bun și pentru localizarea analizată. În acest context, rezultatele evaluării prin piață, bazate pe 3 comparabile, susțin concluzia că bunul are o vandabilitate rezonabilă pe piața specifică, fără a indica însă o lichiditate superioară celei obișnuite pentru proprietăți similare.</w:t>
         <w:br/>
         <w:br/>
-        <w:t xml:space="preserve">Din perspectiva factorilor relevanți pentru performanța garanției pe perioada creditului, activitatea curentă și tendințele pieței indică o dependență de dinamica tranzacțiilor pentru proprietăți similare și de menținerea atractivității zonei. Cererea anterioară, curentă și viitoare pentru tipul de bun și pentru localizare poate susține vandabilitatea în măsura în care proprietățile comparabile continuă să fie absorbite de piață într-un interval rezonabil, însă datele disponibile nu permit cuantificarea acestei absorbții. Cererea pentru alte utilizări este, în mod uzual, limitată de caracteristicile fizice și de încadrarea urbanistică a terenului și construcției, astfel încât flexibilitatea de conversie a garanției trebuie apreciată prudent, fără a presupune o utilizare alternativă certă. </w:t>
+        <w:t>Din perspectiva cererii anterioare, curente și viitoare pentru tipul de proprietate și localizare, datele de piață utilizate în evaluare indică existența unei baze de comparație suficiente pentru fundamentarea valorii de piață, iar alocarea valorii evidențiază o pondere relevantă a terenului, evaluat prin comparație la 39.52 EUR/mp, respectiv 27664.00 EUR pentru 700 mp, și a construcțiilor, alocate la 107603.00 EUR. Această structură poate indica o adecvare bună ca garanție, întrucât bunul dispune de o componentă funciară clar identificabilă și de o valoare de piață susținută de abordarea prin piață, însă performanța garanției rămâne dependentă de evoluția cererii locale și de menținerea condițiilor actuale de piață.</w:t>
         <w:br/>
         <w:br/>
-        <w:t>Impactul evenimentelor previzibile asupra valorii viitoare a garanției poate include variații ale cererii locale, modificări ale condițiilor de finanțare și posibile schimbări ale preferințelor cumpărătorilor, factori care pot influența atât durata de expunere la vânzare, cât și nivelul prețului realizabil. În acest context, lichiditatea poate fi considerată medie, iar vandabilitatea bună, în măsura în care prețul de piață estimat rămâne competitiv față de comparabilele selectate. Gradul de adecvare ca garanție este apreciat ca satisfăcător pentru scopul declarat, având în vedere valoarea de piață determinată, structura valorii între teren și construcție și utilizarea rezidențială curentă, cu mențiunea că menținerea acestui nivel de adecvare este condiționată de evoluția pieței pe durata creditului.</w:t>
+        <w:t>În ceea ce privește cererea pentru alte utilizări, proprietatea poate avea un grad de adaptabilitate limitat sau moderat, în funcție de compatibilitatea utilizării alternative cu reglementările urbanistice și cu profilul zonei; pe baza datelor furnizate nu pot fi formulate concluzii mai ferme. Totodată, evenimentele previzibile pe durata creditului, precum modificări ale condițiilor economice, ale pieței imobiliare sau ale preferințelor cumpărătorilor, pot influența valoarea viitoare a garanției, de regulă prin variația cererii și a timpului de expunere la vânzare. În ansamblu, bunul evaluat poate fi considerat o garanție adecvată, cu lichiditate și vandabilitate corespunzătoare unui activ imobiliar standard, fără elemente din datele disponibile care să sugereze un risc de depreciere neobișnuit sau o dificultate semnificativă de valorificare.</w:t>
       </w:r>
     </w:p>
     <w:p>

</xml_diff>